<commit_message>
docs: update final stage deliverables
</commit_message>
<xml_diff>
--- a/docs/智能问数优化实施计划书.docx
+++ b/docs/智能问数优化实施计划书.docx
@@ -4,30 +4,29 @@
   <w:body>
     <w:p>
       <w:pPr>
-        <w:spacing w:after="80"/>
         <w:jc w:val="center"/>
       </w:pPr>
       <w:r>
         <w:rPr>
-          <w:rFonts w:ascii="Calibri" w:hAnsi="Calibri" w:eastAsia="Microsoft YaHei"/>
+          <w:rFonts w:ascii="Microsoft YaHei" w:hAnsi="Microsoft YaHei" w:eastAsia="Microsoft YaHei"/>
           <w:b/>
-          <w:color w:val="0B2545"/>
+          <w:color w:val="1F4E79"/>
           <w:sz w:val="44"/>
         </w:rPr>
-        <w:t>GeniusQ DaaS Platform 智能问数优化实施计划书</w:t>
+        <w:t>GeniusQ DaaS 智能问数 Demo 阶段交付说明</w:t>
       </w:r>
     </w:p>
     <w:p>
       <w:pPr>
-        <w:spacing w:after="240"/>
         <w:jc w:val="center"/>
       </w:pPr>
       <w:r>
         <w:rPr>
-          <w:color w:val="667085"/>
-          <w:sz w:val="18"/>
+          <w:rFonts w:ascii="Microsoft YaHei" w:hAnsi="Microsoft YaHei" w:eastAsia="Microsoft YaHei"/>
+          <w:color w:val="595959"/>
+          <w:sz w:val="20"/>
         </w:rPr>
-        <w:t>文档版本：V1.0 | 编制日期：2026-07-14 | 适用范围：实习交付评审、本地 Demo 演示、后续真实平台集成评估</w:t>
+        <w:t>版本：V1.1｜阶段状态：已完成本地演示版｜更新日期：2026-07-16</w:t>
       </w:r>
     </w:p>
     <w:p>
@@ -35,17 +34,23 @@
         <w:pStyle w:val="Heading1"/>
       </w:pPr>
       <w:r>
-        <w:t>1. 项目背景</w:t>
+        <w:rPr>
+          <w:rFonts w:ascii="Microsoft YaHei" w:hAnsi="Microsoft YaHei" w:eastAsia="Microsoft YaHei"/>
+          <w:color w:val="1F4E79"/>
+        </w:rPr>
+        <w:t>1. 项目概述</w:t>
       </w:r>
     </w:p>
     <w:p>
+      <w:pPr>
+        <w:spacing w:after="120" w:line="283" w:lineRule="auto"/>
+      </w:pPr>
       <w:r>
-        <w:t>GeniusQ DaaS Platform 是公司面向数据资产使用场景建设的平台，能够基于授权数据生成智能问数助手，并支持将用户 SQL 或 Python 脚本沉淀为可复用模型。现有“智能问数优化需求 0714”聚焦三个方向：让分析过程可理解、让追问与图表形成连续工作流、让知识与数据表之间建立可管理的关联。</w:t>
-      </w:r>
-    </w:p>
-    <w:p>
-      <w:r>
-        <w:t>本项目交付两类成果：一份可用于产品和研发评审的实施计划书；一个不修改 GeniusQ DaaS Platform 源码、可在 Windows 本地运行的全栈 Demo。Demo 使用确定性样例数据复刻平台信息架构与关键交互，用于证明需求具备工程可行性，并为后续真实平台改造提供接口和验收基线。</w:t>
+        <w:rPr>
+          <w:rFonts w:ascii="Microsoft YaHei" w:hAnsi="Microsoft YaHei" w:eastAsia="Microsoft YaHei"/>
+          <w:sz w:val="21"/>
+        </w:rPr>
+        <w:t>本项目是一个可在 Windows 本地运行的智能问数全栈演示 Demo，用于展示企业数据平台中从自然语言问题到 SQL 查询、图表分析、知识增强和仪表盘沉淀的完整链路。项目不连接生产数据，所有业务数据均来自本地 SQLite 演示库，可用于产品展示、技术可行性验证和后续平台集成前的原型说明。</w:t>
       </w:r>
     </w:p>
     <w:p>
@@ -53,55 +58,128 @@
         <w:pStyle w:val="Heading1"/>
       </w:pPr>
       <w:r>
-        <w:t>2. 现状问题</w:t>
+        <w:rPr>
+          <w:rFonts w:ascii="Microsoft YaHei" w:hAnsi="Microsoft YaHei" w:eastAsia="Microsoft YaHei"/>
+          <w:color w:val="1F4E79"/>
+        </w:rPr>
+        <w:t>2. 当前阶段完成内容</w:t>
       </w:r>
     </w:p>
     <w:p>
       <w:pPr>
-        <w:pStyle w:val="ListNumber"/>
+        <w:pStyle w:val="ListBullet"/>
+        <w:spacing w:after="60"/>
       </w:pPr>
       <w:r>
-        <w:t>过程不透明：用户只看到结果，难以确认使用了哪些表、字段、模型/Skill、时间范围和安全规则。</w:t>
+        <w:rPr>
+          <w:rFonts w:ascii="Microsoft YaHei" w:hAnsi="Microsoft YaHei" w:eastAsia="Microsoft YaHei"/>
+          <w:sz w:val="20"/>
+        </w:rPr>
+        <w:t>完成 FastAPI + React/Vite + SQLite 的本地全栈演示环境，并提供一键启动脚本。</w:t>
       </w:r>
     </w:p>
     <w:p>
       <w:pPr>
-        <w:pStyle w:val="ListNumber"/>
+        <w:pStyle w:val="ListBullet"/>
+        <w:spacing w:after="60"/>
       </w:pPr>
       <w:r>
-        <w:t>问题不完整时缺少引导：时间、区域或指标缺失会导致回答不稳定，缺少可直接点击的补全问题。</w:t>
+        <w:rPr>
+          <w:rFonts w:ascii="Microsoft YaHei" w:hAnsi="Microsoft YaHei" w:eastAsia="Microsoft YaHei"/>
+          <w:sz w:val="20"/>
+        </w:rPr>
+        <w:t>完成 DeepSeek Text-to-SQL 接入，同时保留离线规则引擎作为兜底模式。</w:t>
       </w:r>
     </w:p>
     <w:p>
       <w:pPr>
-        <w:pStyle w:val="ListNumber"/>
+        <w:pStyle w:val="ListBullet"/>
+        <w:spacing w:after="60"/>
       </w:pPr>
       <w:r>
-        <w:t>分析链路易中断：多轮上下文、推荐追问、图表切换、仪表盘保存和分享尚未形成闭环。</w:t>
+        <w:rPr>
+          <w:rFonts w:ascii="Microsoft YaHei" w:hAnsi="Microsoft YaHei" w:eastAsia="Microsoft YaHei"/>
+          <w:sz w:val="20"/>
+        </w:rPr>
+        <w:t>完成知识检索增强：生成 SQL 前会检索私有/公共知识、SQL 示例和可用数据表结构。</w:t>
       </w:r>
     </w:p>
     <w:p>
       <w:pPr>
-        <w:pStyle w:val="ListNumber"/>
+        <w:pStyle w:val="ListBullet"/>
+        <w:spacing w:after="60"/>
       </w:pPr>
       <w:r>
-        <w:t>知识治理不足：相同知识可能重复入库，公开/私有冲突缺少明确优先级，文本/SQL 与数据表关系不够直观。</w:t>
+        <w:rPr>
+          <w:rFonts w:ascii="Microsoft YaHei" w:hAnsi="Microsoft YaHei" w:eastAsia="Microsoft YaHei"/>
+          <w:sz w:val="20"/>
+        </w:rPr>
+        <w:t>完成只读 SQL 安全校验：限制单条 SELECT/WITH、授权表访问和最大返回行数。</w:t>
       </w:r>
     </w:p>
     <w:p>
       <w:pPr>
-        <w:pStyle w:val="ListNumber"/>
+        <w:pStyle w:val="ListBullet"/>
+        <w:spacing w:after="60"/>
       </w:pPr>
       <w:r>
-        <w:t>同步与删除缺少审计：手动同步、定时同步、结构变化和删除联动的影响范围需要可预览、可追溯。</w:t>
+        <w:rPr>
+          <w:rFonts w:ascii="Microsoft YaHei" w:hAnsi="Microsoft YaHei" w:eastAsia="Microsoft YaHei"/>
+          <w:sz w:val="20"/>
+        </w:rPr>
+        <w:t>完成逐步思考过程展示：分析过程中按步骤显示当前圆圈加载、完成后延伸到下一步骤。</w:t>
       </w:r>
     </w:p>
     <w:p>
       <w:pPr>
-        <w:pStyle w:val="ListNumber"/>
+        <w:pStyle w:val="ListBullet"/>
+        <w:spacing w:after="60"/>
       </w:pPr>
       <w:r>
-        <w:t>多源问题缺少统一编排：涉及房价、人口、通勤等多源数据时，需要拆分多个只读查询，再按共同维度汇总。</w:t>
+        <w:rPr>
+          <w:rFonts w:ascii="Microsoft YaHei" w:hAnsi="Microsoft YaHei" w:eastAsia="Microsoft YaHei"/>
+          <w:sz w:val="20"/>
+        </w:rPr>
+        <w:t>完成简单问题推荐和结果后续追问推荐：每次推荐 3 个，并基于对话历史去重。</w:t>
+      </w:r>
+    </w:p>
+    <w:p>
+      <w:pPr>
+        <w:pStyle w:val="ListBullet"/>
+        <w:spacing w:after="60"/>
+      </w:pPr>
+      <w:r>
+        <w:rPr>
+          <w:rFonts w:ascii="Microsoft YaHei" w:hAnsi="Microsoft YaHei" w:eastAsia="Microsoft YaHei"/>
+          <w:sz w:val="20"/>
+        </w:rPr>
+        <w:t>完成图表可靠性修复：模型返回的图表字段若与 SQL 结果不一致，后端会自动按实际字段重建图表。</w:t>
+      </w:r>
+    </w:p>
+    <w:p>
+      <w:pPr>
+        <w:pStyle w:val="ListBullet"/>
+        <w:spacing w:after="60"/>
+      </w:pPr>
+      <w:r>
+        <w:rPr>
+          <w:rFonts w:ascii="Microsoft YaHei" w:hAnsi="Microsoft YaHei" w:eastAsia="Microsoft YaHei"/>
+          <w:sz w:val="20"/>
+        </w:rPr>
+        <w:t>完成页面级 DeepSeek API Key 配置入口，Key 仅在本次本地后端运行时生效，不写入仓库。</w:t>
+      </w:r>
+    </w:p>
+    <w:p>
+      <w:pPr>
+        <w:pStyle w:val="ListBullet"/>
+        <w:spacing w:after="60"/>
+      </w:pPr>
+      <w:r>
+        <w:rPr>
+          <w:rFonts w:ascii="Microsoft YaHei" w:hAnsi="Microsoft YaHei" w:eastAsia="Microsoft YaHei"/>
+          <w:sz w:val="20"/>
+        </w:rPr>
+        <w:t>完成仪表盘两列布局、卡片拖拽排序、空白落点占位框、图表保存和本地只读分享。</w:t>
       </w:r>
     </w:p>
     <w:p>
@@ -109,848 +187,64 @@
         <w:pStyle w:val="Heading1"/>
       </w:pPr>
       <w:r>
-        <w:t>3. 建设目标</w:t>
-      </w:r>
-    </w:p>
-    <w:p>
-      <w:pPr>
-        <w:pStyle w:val="Heading2"/>
-      </w:pPr>
-      <w:r>
-        <w:t>3.1 产品目标</w:t>
-      </w:r>
-    </w:p>
-    <w:p>
-      <w:pPr>
-        <w:pStyle w:val="ListBullet"/>
-      </w:pPr>
-      <w:r>
-        <w:t>将“问问题—补全条件—执行分析—解释结果—继续追问—保存分享”串成完整旅程。</w:t>
-      </w:r>
-    </w:p>
-    <w:p>
-      <w:pPr>
-        <w:pStyle w:val="ListBullet"/>
-      </w:pPr>
-      <w:r>
-        <w:t>用可审计业务步骤替代黑盒展示，不暴露模型隐藏链路推理。</w:t>
-      </w:r>
-    </w:p>
-    <w:p>
-      <w:pPr>
-        <w:pStyle w:val="ListBullet"/>
-      </w:pPr>
-      <w:r>
-        <w:t>建立知识条目、SQL 模型、标签、数据表和同步日志之间的可视化关系。</w:t>
-      </w:r>
-    </w:p>
-    <w:p>
-      <w:pPr>
-        <w:pStyle w:val="ListBullet"/>
-      </w:pPr>
-      <w:r>
-        <w:t>用需求编号贯穿页面、API、自动化测试与演示脚本，降低评审沟通成本。</w:t>
-      </w:r>
-    </w:p>
-    <w:p>
-      <w:pPr>
-        <w:pStyle w:val="Heading2"/>
-      </w:pPr>
-      <w:r>
-        <w:t>3.2 工程目标</w:t>
-      </w:r>
-    </w:p>
-    <w:p>
-      <w:pPr>
-        <w:pStyle w:val="ListBullet"/>
-      </w:pPr>
-      <w:r>
-        <w:t>默认 LLM_MODE=offline，在无网络、无密钥条件下稳定重复演示。</w:t>
-      </w:r>
-    </w:p>
-    <w:p>
-      <w:pPr>
-        <w:pStyle w:val="ListBullet"/>
-      </w:pPr>
-      <w:r>
-        <w:t>只允许单条 SELECT/WITH，限制授权表与 500 行返回上限。</w:t>
-      </w:r>
-    </w:p>
-    <w:p>
-      <w:pPr>
-        <w:pStyle w:val="ListBullet"/>
-      </w:pPr>
-      <w:r>
-        <w:t>所有会话、分析、知识、同步和仪表盘状态落本地 SQLite。</w:t>
-      </w:r>
-    </w:p>
-    <w:p>
-      <w:pPr>
-        <w:pStyle w:val="ListBullet"/>
-      </w:pPr>
-      <w:r>
-        <w:t>保留 OpenAI 兼容模型接入边界，浏览器永不接触模型密钥。</w:t>
-      </w:r>
-    </w:p>
-    <w:p>
-      <w:pPr>
-        <w:pStyle w:val="Heading2"/>
-      </w:pPr>
-      <w:r>
-        <w:t>3.3 成功指标</w:t>
-      </w:r>
-    </w:p>
-    <w:p>
-      <w:pPr>
-        <w:pStyle w:val="ListBullet"/>
-      </w:pPr>
-      <w:r>
-        <w:t>15 个原始需求均能在“需求映射”页定位到页面与验收动作。</w:t>
-      </w:r>
-    </w:p>
-    <w:p>
-      <w:pPr>
-        <w:pStyle w:val="ListBullet"/>
-      </w:pPr>
-      <w:r>
-        <w:t>五条端到端旅程可自动运行，后端、前端单元测试全部通过。</w:t>
-      </w:r>
-    </w:p>
-    <w:p>
-      <w:pPr>
-        <w:pStyle w:val="ListBullet"/>
-      </w:pPr>
-      <w:r>
-        <w:t>本地首次启动只需一个 PowerShell 命令，健康检查在 30 秒内完成（依赖下载时间除外）。</w:t>
-      </w:r>
-    </w:p>
-    <w:p>
-      <w:pPr>
-        <w:pStyle w:val="ListBullet"/>
-      </w:pPr>
-      <w:r>
-        <w:t>非法 SQL、重复知识和未确认的数据表删除均被明确拒绝，并返回可执行建议。</w:t>
-      </w:r>
-    </w:p>
-    <w:p>
-      <w:pPr>
-        <w:pStyle w:val="Heading1"/>
-      </w:pPr>
-      <w:r>
-        <w:t>4. 需求范围</w:t>
-      </w:r>
-    </w:p>
-    <w:p>
-      <w:pPr>
-        <w:pStyle w:val="Heading2"/>
-      </w:pPr>
-      <w:r>
-        <w:t>4.1 本期范围</w:t>
-      </w:r>
-    </w:p>
-    <w:p>
-      <w:pPr>
-        <w:pStyle w:val="ListBullet"/>
-      </w:pPr>
-      <w:r>
-        <w:t>智能问数：2.1-a、2.1-b、2.1-c、2.2、2.3、2.4-a、2.4-b、2.5。</w:t>
-      </w:r>
-    </w:p>
-    <w:p>
-      <w:pPr>
-        <w:pStyle w:val="ListBullet"/>
-      </w:pPr>
-      <w:r>
-        <w:t>仪表盘：2.6。</w:t>
-      </w:r>
-    </w:p>
-    <w:p>
-      <w:pPr>
-        <w:pStyle w:val="ListBullet"/>
-      </w:pPr>
-      <w:r>
-        <w:t>知识库管理：3.2、3.3、3.4-a、3.4-b、3.4-c。</w:t>
-      </w:r>
-    </w:p>
-    <w:p>
-      <w:pPr>
-        <w:pStyle w:val="ListBullet"/>
-      </w:pPr>
-      <w:r>
-        <w:t>多源知识学习与多 SQL 汇总：5。</w:t>
-      </w:r>
-    </w:p>
-    <w:p>
-      <w:pPr>
-        <w:pStyle w:val="ListBullet"/>
-      </w:pPr>
-      <w:r>
-        <w:t>完整平台外壳、需求追踪页、本地样例数据、自动化测试和一键启动。</w:t>
-      </w:r>
-    </w:p>
-    <w:p>
-      <w:pPr>
-        <w:pStyle w:val="Heading2"/>
-      </w:pPr>
-      <w:r>
-        <w:t>4.2 非目标</w:t>
-      </w:r>
-    </w:p>
-    <w:p>
-      <w:pPr>
-        <w:pStyle w:val="ListBullet"/>
-      </w:pPr>
-      <w:r>
-        <w:t>不修改、合并或发布公司 GeniusQ DaaS Platform 生产源码。</w:t>
-      </w:r>
-    </w:p>
-    <w:p>
-      <w:pPr>
-        <w:pStyle w:val="ListBullet"/>
-      </w:pPr>
-      <w:r>
-        <w:t>不接入生产数据库、真实账号、统一认证或多人实时协作。</w:t>
-      </w:r>
-    </w:p>
-    <w:p>
-      <w:pPr>
-        <w:pStyle w:val="ListBullet"/>
-      </w:pPr>
-      <w:r>
-        <w:t>不执行写入型 SQL，不运行用户 Python 脚本，不实现真实定时调度器。</w:t>
-      </w:r>
-    </w:p>
-    <w:p>
-      <w:pPr>
-        <w:pStyle w:val="ListBullet"/>
-      </w:pPr>
-      <w:r>
-        <w:t>“模拟定时同步”仅复用真实同步服务入口并写入审计日志，不声明已部署生产调度。</w:t>
-      </w:r>
-    </w:p>
-    <w:p>
-      <w:pPr>
-        <w:pStyle w:val="Heading1"/>
-      </w:pPr>
-      <w:r>
-        <w:t>5. 总体方案</w:t>
-      </w:r>
-    </w:p>
-    <w:p>
-      <w:r>
-        <w:t>采用“独立全栈 Demo + 需求追踪矩阵”的方案：React/TypeScript 负责平台壳与交互，FastAPI 负责会话编排和领域规则，SQLite 同时保存样例业务数据与应用状态。</w:t>
-      </w:r>
-    </w:p>
-    <w:p>
-      <w:r>
-        <w:t>与 Streamlit 单体方案相比，该方案能更准确复刻 DAAS 导航、工作台和卡片交互；与纯前端静态稿相比，它能真实验证 SQL 安全、会话持久化、知识查重、同步审计、删除联动和仪表盘布局保存。</w:t>
-      </w:r>
-    </w:p>
-    <w:p>
-      <w:r>
-        <w:t>本地 Demo 已完成：独立分支中已经实现并自动验证核心页面与 API。真实平台集成建议：以本计划的四周排期为参考，在公司代码库中逐模块接入，而不是直接复制 Demo 的样例数据和本地身份假设。</w:t>
-      </w:r>
-    </w:p>
-    <w:p>
-      <w:pPr>
-        <w:pStyle w:val="Heading1"/>
-      </w:pPr>
-      <w:r>
-        <w:t>6. 功能方案</w:t>
-      </w:r>
-    </w:p>
-    <w:p>
-      <w:pPr>
-        <w:pStyle w:val="Heading2"/>
-      </w:pPr>
-      <w:r>
-        <w:t>6.1 智能问数工作台</w:t>
-      </w:r>
-    </w:p>
-    <w:p>
-      <w:pPr>
-        <w:pStyle w:val="ListNumber"/>
-      </w:pPr>
-      <w:r>
-        <w:t>创建会话并保存时间、区域、指标上下文。</w:t>
-      </w:r>
-    </w:p>
-    <w:p>
-      <w:pPr>
-        <w:pStyle w:val="ListNumber"/>
-      </w:pPr>
-      <w:r>
-        <w:t>对“分析房价”等不完整问题返回三条补全建议，不生成 SQL（2.2）。</w:t>
-      </w:r>
-    </w:p>
-    <w:p>
-      <w:pPr>
-        <w:pStyle w:val="ListNumber"/>
-      </w:pPr>
-      <w:r>
-        <w:t>完整问题展示意图确认、数据表/字段选择、Skill 调用、SQL 校验执行和结果生成（2.1-a、2.1-b、2.1-c）。</w:t>
-      </w:r>
-    </w:p>
-    <w:p>
-      <w:pPr>
-        <w:pStyle w:val="ListNumber"/>
-      </w:pPr>
-      <w:r>
-        <w:t>输出来源、更新时间、置信度、字段、只读 SQL、表格/图表、最大值、趋势和异常提示（2.4-a、2.4-b）。</w:t>
-      </w:r>
-    </w:p>
-    <w:p>
-      <w:pPr>
-        <w:pStyle w:val="ListNumber"/>
-      </w:pPr>
-      <w:r>
-        <w:t>支持连续追问与显式覆盖上下文（2.3），并给出下一步推荐问题（2.5）。</w:t>
-      </w:r>
-    </w:p>
-    <w:p>
-      <w:pPr>
-        <w:pStyle w:val="ListNumber"/>
-      </w:pPr>
-      <w:r>
-        <w:t>将当前图表保存到仪表盘（2.6）。</w:t>
-      </w:r>
-    </w:p>
-    <w:p>
-      <w:pPr>
-        <w:pStyle w:val="Heading2"/>
-      </w:pPr>
-      <w:r>
-        <w:t>6.2 多源分析</w:t>
-      </w:r>
-    </w:p>
-    <w:p>
-      <w:r>
-        <w:t>对于“房价上涨是否与人口和通勤相关”等问题，规划器生成房产子查询与人口通勤子查询，分别通过相同 SQL 安全防线，按行政区对齐后给出综合解释，同时提示“相关不等于因果”（5）。</w:t>
-      </w:r>
-    </w:p>
-    <w:p>
-      <w:pPr>
-        <w:pStyle w:val="Heading2"/>
-      </w:pPr>
-      <w:r>
-        <w:t>6.3 知识库管理</w:t>
-      </w:r>
-    </w:p>
-    <w:p>
-      <w:pPr>
-        <w:pStyle w:val="ListBullet"/>
-      </w:pPr>
-      <w:r>
-        <w:t>以规范化内容、SQL 和关联表生成 SHA-256 指纹；同库重复返回冲突，跨库允许共存（3.2）。</w:t>
-      </w:r>
-    </w:p>
-    <w:p>
-      <w:pPr>
-        <w:pStyle w:val="ListBullet"/>
-      </w:pPr>
-      <w:r>
-        <w:t>私有知识覆盖匹配的公开知识，同时保留两条记录和覆盖关系（3.2）。</w:t>
-      </w:r>
-    </w:p>
-    <w:p>
-      <w:pPr>
-        <w:pStyle w:val="ListBullet"/>
-      </w:pPr>
-      <w:r>
-        <w:t>支持关键词、类型、范围和标签组合筛选（3.4-a）。</w:t>
-      </w:r>
-    </w:p>
-    <w:p>
-      <w:pPr>
-        <w:pStyle w:val="ListBullet"/>
-      </w:pPr>
-      <w:r>
-        <w:t>文本/SQL 条目展示关联数据表；SQL 自动抽取 FROM/JOIN 表名，并保存结构状态（3.4-b、3.4-c）。</w:t>
-      </w:r>
-    </w:p>
-    <w:p>
-      <w:pPr>
-        <w:pStyle w:val="ListBullet"/>
-      </w:pPr>
-      <w:r>
-        <w:t>手动同步和模拟定时同步共用服务，写入统一审计日志（3.3）。</w:t>
-      </w:r>
-    </w:p>
-    <w:p>
-      <w:pPr>
-        <w:pStyle w:val="ListBullet"/>
-      </w:pPr>
-      <w:r>
-        <w:t>删除数据表前返回受影响知识；确认后在一个事务中标记表不可用并移除关联知识（3.3）。</w:t>
-      </w:r>
-    </w:p>
-    <w:p>
-      <w:pPr>
-        <w:pStyle w:val="Heading2"/>
-      </w:pPr>
-      <w:r>
-        <w:t>6.4 仪表盘与需求追踪</w:t>
-      </w:r>
-    </w:p>
-    <w:p>
-      <w:pPr>
-        <w:pStyle w:val="ListBullet"/>
-      </w:pPr>
-      <w:r>
-        <w:t>卡片和布局持久化到 SQLite，使用 12 列坐标呈现放大、恢复、移动、刷新和移除，并提供可打开的本地只读分享页（2.6）。</w:t>
-      </w:r>
-    </w:p>
-    <w:p>
-      <w:pPr>
-        <w:pStyle w:val="ListBullet"/>
-      </w:pPr>
-      <w:r>
-        <w:t>/api/requirements 保存全部 15 个需求条目，前端支持模块/优先级筛选和验收动作展开。</w:t>
-      </w:r>
-    </w:p>
-    <w:p>
-      <w:pPr>
-        <w:pStyle w:val="Heading1"/>
-      </w:pPr>
-      <w:r>
-        <w:t>7. 技术架构</w:t>
-      </w:r>
-    </w:p>
-    <w:p>
-      <w:pPr>
-        <w:spacing w:after="0"/>
-        <w:ind w:left="288"/>
-      </w:pPr>
-      <w:r>
         <w:rPr>
-          <w:rFonts w:ascii="Consolas" w:hAnsi="Consolas"/>
-          <w:color w:val="344054"/>
-          <w:sz w:val="17"/>
+          <w:rFonts w:ascii="Microsoft YaHei" w:hAnsi="Microsoft YaHei" w:eastAsia="Microsoft YaHei"/>
+          <w:color w:val="1F4E79"/>
         </w:rPr>
-        <w:t>flowchart LR</w:t>
-      </w:r>
-    </w:p>
-    <w:p>
-      <w:pPr>
-        <w:spacing w:after="0"/>
-        <w:ind w:left="288"/>
-      </w:pPr>
-      <w:r>
-        <w:rPr>
-          <w:rFonts w:ascii="Consolas" w:hAnsi="Consolas"/>
-          <w:color w:val="344054"/>
-          <w:sz w:val="17"/>
-        </w:rPr>
-        <w:t xml:space="preserve">  UI[React + TypeScript\n平台壳与四个工作区]</w:t>
-      </w:r>
-    </w:p>
-    <w:p>
-      <w:pPr>
-        <w:spacing w:after="0"/>
-        <w:ind w:left="288"/>
-      </w:pPr>
-      <w:r>
-        <w:rPr>
-          <w:rFonts w:ascii="Consolas" w:hAnsi="Consolas"/>
-          <w:color w:val="344054"/>
-          <w:sz w:val="17"/>
-        </w:rPr>
-        <w:t xml:space="preserve">  API[FastAPI\nREST API 与统一错误]</w:t>
-      </w:r>
-    </w:p>
-    <w:p>
-      <w:pPr>
-        <w:spacing w:after="0"/>
-        <w:ind w:left="288"/>
-      </w:pPr>
-      <w:r>
-        <w:rPr>
-          <w:rFonts w:ascii="Consolas" w:hAnsi="Consolas"/>
-          <w:color w:val="344054"/>
-          <w:sz w:val="17"/>
-        </w:rPr>
-        <w:t xml:space="preserve">  ENGINE[分析引擎\n离线规则 / 模型适配边界]</w:t>
-      </w:r>
-    </w:p>
-    <w:p>
-      <w:pPr>
-        <w:spacing w:after="0"/>
-        <w:ind w:left="288"/>
-      </w:pPr>
-      <w:r>
-        <w:rPr>
-          <w:rFonts w:ascii="Consolas" w:hAnsi="Consolas"/>
-          <w:color w:val="344054"/>
-          <w:sz w:val="17"/>
-        </w:rPr>
-        <w:t xml:space="preserve">  GUARD[只读 SQL Guard\n授权表 + 单语句 + 500 行]</w:t>
-      </w:r>
-    </w:p>
-    <w:p>
-      <w:pPr>
-        <w:spacing w:after="0"/>
-        <w:ind w:left="288"/>
-      </w:pPr>
-      <w:r>
-        <w:rPr>
-          <w:rFonts w:ascii="Consolas" w:hAnsi="Consolas"/>
-          <w:color w:val="344054"/>
-          <w:sz w:val="17"/>
-        </w:rPr>
-        <w:t xml:space="preserve">  DB[(SQLite\n业务样例 + 应用状态)]</w:t>
-      </w:r>
-    </w:p>
-    <w:p>
-      <w:pPr>
-        <w:spacing w:after="0"/>
-        <w:ind w:left="288"/>
-      </w:pPr>
-      <w:r>
-        <w:rPr>
-          <w:rFonts w:ascii="Consolas" w:hAnsi="Consolas"/>
-          <w:color w:val="344054"/>
-          <w:sz w:val="17"/>
-        </w:rPr>
-        <w:t xml:space="preserve">  UI --&gt;|JSON / Vite Proxy| API</w:t>
-      </w:r>
-    </w:p>
-    <w:p>
-      <w:pPr>
-        <w:spacing w:after="0"/>
-        <w:ind w:left="288"/>
-      </w:pPr>
-      <w:r>
-        <w:rPr>
-          <w:rFonts w:ascii="Consolas" w:hAnsi="Consolas"/>
-          <w:color w:val="344054"/>
-          <w:sz w:val="17"/>
-        </w:rPr>
-        <w:t xml:space="preserve">  API --&gt; ENGINE</w:t>
-      </w:r>
-    </w:p>
-    <w:p>
-      <w:pPr>
-        <w:spacing w:after="0"/>
-        <w:ind w:left="288"/>
-      </w:pPr>
-      <w:r>
-        <w:rPr>
-          <w:rFonts w:ascii="Consolas" w:hAnsi="Consolas"/>
-          <w:color w:val="344054"/>
-          <w:sz w:val="17"/>
-        </w:rPr>
-        <w:t xml:space="preserve">  ENGINE --&gt; GUARD</w:t>
-      </w:r>
-    </w:p>
-    <w:p>
-      <w:pPr>
-        <w:spacing w:after="0"/>
-        <w:ind w:left="288"/>
-      </w:pPr>
-      <w:r>
-        <w:rPr>
-          <w:rFonts w:ascii="Consolas" w:hAnsi="Consolas"/>
-          <w:color w:val="344054"/>
-          <w:sz w:val="17"/>
-        </w:rPr>
-        <w:t xml:space="preserve">  GUARD --&gt; DB</w:t>
-      </w:r>
-    </w:p>
-    <w:p>
-      <w:pPr>
-        <w:spacing w:after="0"/>
-        <w:ind w:left="288"/>
-      </w:pPr>
-      <w:r>
-        <w:rPr>
-          <w:rFonts w:ascii="Consolas" w:hAnsi="Consolas"/>
-          <w:color w:val="344054"/>
-          <w:sz w:val="17"/>
-        </w:rPr>
-        <w:t xml:space="preserve">  API --&gt; DB</w:t>
-      </w:r>
-    </w:p>
-    <w:p/>
-    <w:p>
-      <w:pPr>
-        <w:pStyle w:val="Heading2"/>
-      </w:pPr>
-      <w:r>
-        <w:t>7.1 前端职责</w:t>
-      </w:r>
-    </w:p>
-    <w:p>
-      <w:pPr>
-        <w:pStyle w:val="ListBullet"/>
-      </w:pPr>
-      <w:r>
-        <w:t>复刻深色顶栏、蓝色激活态、左侧导航、中央工作区和浅灰背景。</w:t>
-      </w:r>
-    </w:p>
-    <w:p>
-      <w:pPr>
-        <w:pStyle w:val="ListBullet"/>
-      </w:pPr>
-      <w:r>
-        <w:t>管理输入、加载、澄清、完成、错误和确认等页面状态。</w:t>
-      </w:r>
-    </w:p>
-    <w:p>
-      <w:pPr>
-        <w:pStyle w:val="ListBullet"/>
-      </w:pPr>
-      <w:r>
-        <w:t>渲染业务步骤、来源、SQL、图表、洞察、知识关系、同步日志和看板布局。</w:t>
-      </w:r>
-    </w:p>
-    <w:p>
-      <w:pPr>
-        <w:pStyle w:val="ListBullet"/>
-      </w:pPr>
-      <w:r>
-        <w:t>不生成 SQL，不保存模型密钥，不绕过后端规则。</w:t>
-      </w:r>
-    </w:p>
-    <w:p>
-      <w:pPr>
-        <w:pStyle w:val="Heading2"/>
-      </w:pPr>
-      <w:r>
-        <w:t>7.2 后端职责</w:t>
-      </w:r>
-    </w:p>
-    <w:p>
-      <w:pPr>
-        <w:pStyle w:val="ListBullet"/>
-      </w:pPr>
-      <w:r>
-        <w:t>合并会话上下文并选择分析意图。</w:t>
-      </w:r>
-    </w:p>
-    <w:p>
-      <w:pPr>
-        <w:pStyle w:val="ListBullet"/>
-      </w:pPr>
-      <w:r>
-        <w:t>校验/执行只读 SQL，组装数据集、洞察和图表规范。</w:t>
-      </w:r>
-    </w:p>
-    <w:p>
-      <w:pPr>
-        <w:pStyle w:val="ListBullet"/>
-      </w:pPr>
-      <w:r>
-        <w:t>实现知识指纹、优先级、关联、同步与删除联动。</w:t>
-      </w:r>
-    </w:p>
-    <w:p>
-      <w:pPr>
-        <w:pStyle w:val="ListBullet"/>
-      </w:pPr>
-      <w:r>
-        <w:t>持久化仪表盘与需求映射；统一错误包含 code、message、action、request_id。</w:t>
-      </w:r>
-    </w:p>
-    <w:p>
-      <w:pPr>
-        <w:pStyle w:val="Heading2"/>
-      </w:pPr>
-      <w:r>
-        <w:t>7.3 核心数据表</w:t>
-      </w:r>
-    </w:p>
-    <w:p>
-      <w:pPr>
-        <w:pStyle w:val="ListBullet"/>
-      </w:pPr>
-      <w:r>
-        <w:t>业务样例：house_price_monthly、housing_transactions、district_population、commuting_metrics。</w:t>
-      </w:r>
-    </w:p>
-    <w:p>
-      <w:pPr>
-        <w:pStyle w:val="ListBullet"/>
-      </w:pPr>
-      <w:r>
-        <w:t>问数状态：conversations、messages、analysis_runs。</w:t>
-      </w:r>
-    </w:p>
-    <w:p>
-      <w:pPr>
-        <w:pStyle w:val="ListBullet"/>
-      </w:pPr>
-      <w:r>
-        <w:t>知识治理：knowledge_items、data_tables、sync_logs。</w:t>
-      </w:r>
-    </w:p>
-    <w:p>
-      <w:pPr>
-        <w:pStyle w:val="ListBullet"/>
-      </w:pPr>
-      <w:r>
-        <w:t>仪表盘：dashboards、dashboard_cards。</w:t>
-      </w:r>
-    </w:p>
-    <w:p>
-      <w:pPr>
-        <w:pStyle w:val="ListBullet"/>
-      </w:pPr>
-      <w:r>
-        <w:t>需求追踪：requirement_mappings。</w:t>
-      </w:r>
-    </w:p>
-    <w:p>
-      <w:pPr>
-        <w:pStyle w:val="Heading1"/>
-      </w:pPr>
-      <w:r>
-        <w:t>8. 数据与安全</w:t>
-      </w:r>
-    </w:p>
-    <w:p>
-      <w:pPr>
-        <w:pStyle w:val="ListNumber"/>
-      </w:pPr>
-      <w:r>
-        <w:t>Demo 仅使用北京六个行政区的确定性虚构数据，不连接生产库。</w:t>
-      </w:r>
-    </w:p>
-    <w:p>
-      <w:pPr>
-        <w:pStyle w:val="ListNumber"/>
-      </w:pPr>
-      <w:r>
-        <w:t>SQL 必须以 SELECT 或 WITH 开始；拒绝 DDL、DML、PRAGMA、ATTACH 和多语句。</w:t>
-      </w:r>
-    </w:p>
-    <w:p>
-      <w:pPr>
-        <w:pStyle w:val="ListNumber"/>
-      </w:pPr>
-      <w:r>
-        <w:t>SQL 只能访问四张白名单表，结果最多 500 行；用户区域输入来自固定行政区词表。</w:t>
-      </w:r>
-    </w:p>
-    <w:p>
-      <w:pPr>
-        <w:pStyle w:val="ListNumber"/>
-      </w:pPr>
-      <w:r>
-        <w:t>模型凭证仅由后端环境变量读取；日志、API 错误和浏览器响应不包含密钥、数据库连接串或内部路径。</w:t>
-      </w:r>
-    </w:p>
-    <w:p>
-      <w:pPr>
-        <w:pStyle w:val="ListNumber"/>
-      </w:pPr>
-      <w:r>
-        <w:t>删除操作先预览影响范围，用户确认后才执行关联状态修改。</w:t>
-      </w:r>
-    </w:p>
-    <w:p>
-      <w:pPr>
-        <w:pStyle w:val="ListNumber"/>
-      </w:pPr>
-      <w:r>
-        <w:t>“思考过程”是业务执行审计，不记录或输出模型隐式推理。</w:t>
-      </w:r>
-    </w:p>
-    <w:p>
-      <w:pPr>
-        <w:pStyle w:val="Heading1"/>
-      </w:pPr>
-      <w:r>
-        <w:t>9. 实施阶段与排期</w:t>
-      </w:r>
-    </w:p>
-    <w:p>
-      <w:r>
-        <w:t>下表是真实平台集成建议的四周参考排期；本地 Demo 已完成，不将此排期误表述为已经发生的生产改造。</w:t>
+        <w:t>3. 运行逻辑</w:t>
       </w:r>
     </w:p>
     <w:tbl>
       <w:tblPr>
         <w:tblStyle w:val="TableGrid"/>
-        <w:tblW w:type="dxa" w:w="9360"/>
+        <w:tblW w:type="auto" w:w="0"/>
         <w:jc w:val="center"/>
         <w:tblLook w:firstColumn="1" w:firstRow="1" w:lastColumn="0" w:lastRow="0" w:noHBand="0" w:noVBand="1" w:val="04A0"/>
-        <w:tblBorders>
-          <w:top w:val="single" w:sz="4" w:space="0" w:color="D9E2EC"/>
-          <w:left w:val="single" w:sz="4" w:space="0" w:color="D9E2EC"/>
-          <w:bottom w:val="single" w:sz="4" w:space="0" w:color="D9E2EC"/>
-          <w:right w:val="single" w:sz="4" w:space="0" w:color="D9E2EC"/>
-          <w:insideH w:val="single" w:sz="4" w:space="0" w:color="D9E2EC"/>
-          <w:insideV w:val="single" w:sz="4" w:space="0" w:color="D9E2EC"/>
-        </w:tblBorders>
       </w:tblPr>
       <w:tblGrid>
-        <w:gridCol w:w="1200"/>
-        <w:gridCol w:w="2300"/>
-        <w:gridCol w:w="3300"/>
-        <w:gridCol w:w="2560"/>
+        <w:gridCol w:w="4873"/>
+        <w:gridCol w:w="4873"/>
       </w:tblGrid>
       <w:tr>
         <w:tc>
           <w:tcPr>
-            <w:tcW w:type="dxa" w:w="1200"/>
-            <w:shd w:fill="F2F4F7"/>
+            <w:tcW w:type="dxa" w:w="4873"/>
+            <w:shd w:fill="D9EAF7"/>
             <w:vAlign w:val="center"/>
           </w:tcPr>
           <w:p>
+            <w:pPr>
+              <w:jc w:val="center"/>
+            </w:pPr>
+            <w:r/>
             <w:r>
               <w:rPr>
+                <w:rFonts w:ascii="Microsoft YaHei" w:hAnsi="Microsoft YaHei" w:eastAsia="Microsoft YaHei"/>
                 <w:b/>
                 <w:sz w:val="18"/>
               </w:rPr>
-              <w:t>周次</w:t>
+              <w:t>阶段</w:t>
             </w:r>
           </w:p>
         </w:tc>
         <w:tc>
           <w:tcPr>
-            <w:tcW w:type="dxa" w:w="2300"/>
-            <w:shd w:fill="F2F4F7"/>
+            <w:tcW w:type="dxa" w:w="4873"/>
+            <w:shd w:fill="D9EAF7"/>
             <w:vAlign w:val="center"/>
           </w:tcPr>
           <w:p>
+            <w:pPr>
+              <w:jc w:val="center"/>
+            </w:pPr>
+            <w:r/>
             <w:r>
               <w:rPr>
+                <w:rFonts w:ascii="Microsoft YaHei" w:hAnsi="Microsoft YaHei" w:eastAsia="Microsoft YaHei"/>
                 <w:b/>
                 <w:sz w:val="18"/>
               </w:rPr>
-              <w:t>目标</w:t>
-            </w:r>
-          </w:p>
-        </w:tc>
-        <w:tc>
-          <w:tcPr>
-            <w:tcW w:type="dxa" w:w="3300"/>
-            <w:shd w:fill="F2F4F7"/>
-            <w:vAlign w:val="center"/>
-          </w:tcPr>
-          <w:p>
-            <w:r>
-              <w:rPr>
-                <w:b/>
-                <w:sz w:val="18"/>
-              </w:rPr>
-              <w:t>主要工作</w:t>
-            </w:r>
-          </w:p>
-        </w:tc>
-        <w:tc>
-          <w:tcPr>
-            <w:tcW w:type="dxa" w:w="2560"/>
-            <w:shd w:fill="F2F4F7"/>
-            <w:vAlign w:val="center"/>
-          </w:tcPr>
-          <w:p>
-            <w:r>
-              <w:rPr>
-                <w:b/>
-                <w:sz w:val="18"/>
-              </w:rPr>
-              <w:t>周交付与退出条件</w:t>
+              <w:t>说明</w:t>
             </w:r>
           </w:p>
         </w:tc>
@@ -958,57 +252,41 @@
       <w:tr>
         <w:tc>
           <w:tcPr>
-            <w:tcW w:type="dxa" w:w="1200"/>
+            <w:tcW w:type="dxa" w:w="4873"/>
             <w:vAlign w:val="center"/>
           </w:tcPr>
           <w:p>
+            <w:pPr>
+              <w:jc w:val="center"/>
+            </w:pPr>
+            <w:r/>
             <w:r>
               <w:rPr>
-                <w:sz w:val="17"/>
+                <w:rFonts w:ascii="Microsoft YaHei" w:hAnsi="Microsoft YaHei" w:eastAsia="Microsoft YaHei"/>
+                <w:b w:val="0"/>
+                <w:sz w:val="18"/>
               </w:rPr>
-              <w:t>第 1 周</w:t>
+              <w:t>用户提问</w:t>
             </w:r>
           </w:p>
         </w:tc>
         <w:tc>
           <w:tcPr>
-            <w:tcW w:type="dxa" w:w="2300"/>
+            <w:tcW w:type="dxa" w:w="4873"/>
             <w:vAlign w:val="center"/>
           </w:tcPr>
           <w:p>
+            <w:pPr>
+              <w:jc w:val="left"/>
+            </w:pPr>
+            <w:r/>
             <w:r>
               <w:rPr>
-                <w:sz w:val="17"/>
+                <w:rFonts w:ascii="Microsoft YaHei" w:hAnsi="Microsoft YaHei" w:eastAsia="Microsoft YaHei"/>
+                <w:b w:val="0"/>
+                <w:sz w:val="18"/>
               </w:rPr>
-              <w:t>需求基线与数据契约</w:t>
-            </w:r>
-          </w:p>
-        </w:tc>
-        <w:tc>
-          <w:tcPr>
-            <w:tcW w:type="dxa" w:w="3300"/>
-            <w:vAlign w:val="center"/>
-          </w:tcPr>
-          <w:p>
-            <w:r>
-              <w:rPr>
-                <w:sz w:val="17"/>
-              </w:rPr>
-              <w:t>核对 15 项需求；确认数据表、权限、会话和错误协议；接入只读查询沙箱</w:t>
-            </w:r>
-          </w:p>
-        </w:tc>
-        <w:tc>
-          <w:tcPr>
-            <w:tcW w:type="dxa" w:w="2560"/>
-            <w:vAlign w:val="center"/>
-          </w:tcPr>
-          <w:p>
-            <w:r>
-              <w:rPr>
-                <w:sz w:val="17"/>
-              </w:rPr>
-              <w:t>接口契约、威胁清单、样例数据与后端基础测试通过</w:t>
+              <w:t>前端提交自然语言问题，并记录当前会话 ID。</w:t>
             </w:r>
           </w:p>
         </w:tc>
@@ -1016,57 +294,41 @@
       <w:tr>
         <w:tc>
           <w:tcPr>
-            <w:tcW w:type="dxa" w:w="1200"/>
+            <w:tcW w:type="dxa" w:w="4873"/>
             <w:vAlign w:val="center"/>
           </w:tcPr>
           <w:p>
+            <w:pPr>
+              <w:jc w:val="center"/>
+            </w:pPr>
+            <w:r/>
             <w:r>
               <w:rPr>
-                <w:sz w:val="17"/>
+                <w:rFonts w:ascii="Microsoft YaHei" w:hAnsi="Microsoft YaHei" w:eastAsia="Microsoft YaHei"/>
+                <w:b w:val="0"/>
+                <w:sz w:val="18"/>
               </w:rPr>
-              <w:t>第 2 周</w:t>
+              <w:t>上下文合并</w:t>
             </w:r>
           </w:p>
         </w:tc>
         <w:tc>
           <w:tcPr>
-            <w:tcW w:type="dxa" w:w="2300"/>
+            <w:tcW w:type="dxa" w:w="4873"/>
             <w:vAlign w:val="center"/>
           </w:tcPr>
           <w:p>
+            <w:pPr>
+              <w:jc w:val="left"/>
+            </w:pPr>
+            <w:r/>
             <w:r>
               <w:rPr>
-                <w:sz w:val="17"/>
+                <w:rFonts w:ascii="Microsoft YaHei" w:hAnsi="Microsoft YaHei" w:eastAsia="Microsoft YaHei"/>
+                <w:b w:val="0"/>
+                <w:sz w:val="18"/>
               </w:rPr>
-              <w:t>智能问数闭环</w:t>
-            </w:r>
-          </w:p>
-        </w:tc>
-        <w:tc>
-          <w:tcPr>
-            <w:tcW w:type="dxa" w:w="3300"/>
-            <w:vAlign w:val="center"/>
-          </w:tcPr>
-          <w:p>
-            <w:r>
-              <w:rPr>
-                <w:sz w:val="17"/>
-              </w:rPr>
-              <w:t>上下文、澄清、步骤、数据血缘、Skill、图表规范、洞察和推荐追问</w:t>
-            </w:r>
-          </w:p>
-        </w:tc>
-        <w:tc>
-          <w:tcPr>
-            <w:tcW w:type="dxa" w:w="2560"/>
-            <w:vAlign w:val="center"/>
-          </w:tcPr>
-          <w:p>
-            <w:r>
-              <w:rPr>
-                <w:sz w:val="17"/>
-              </w:rPr>
-              <w:t>2.1–2.5 与 5 的 API/页面联调通过</w:t>
+              <w:t>后端读取历史会话，合并年份、区域、指标等上下文；本轮显式输入优先。</w:t>
             </w:r>
           </w:p>
         </w:tc>
@@ -1074,57 +336,41 @@
       <w:tr>
         <w:tc>
           <w:tcPr>
-            <w:tcW w:type="dxa" w:w="1200"/>
+            <w:tcW w:type="dxa" w:w="4873"/>
             <w:vAlign w:val="center"/>
           </w:tcPr>
           <w:p>
+            <w:pPr>
+              <w:jc w:val="center"/>
+            </w:pPr>
+            <w:r/>
             <w:r>
               <w:rPr>
-                <w:sz w:val="17"/>
+                <w:rFonts w:ascii="Microsoft YaHei" w:hAnsi="Microsoft YaHei" w:eastAsia="Microsoft YaHei"/>
+                <w:b w:val="0"/>
+                <w:sz w:val="18"/>
               </w:rPr>
-              <w:t>第 3 周</w:t>
+              <w:t>知识检索</w:t>
             </w:r>
           </w:p>
         </w:tc>
         <w:tc>
           <w:tcPr>
-            <w:tcW w:type="dxa" w:w="2300"/>
+            <w:tcW w:type="dxa" w:w="4873"/>
             <w:vAlign w:val="center"/>
           </w:tcPr>
           <w:p>
+            <w:pPr>
+              <w:jc w:val="left"/>
+            </w:pPr>
+            <w:r/>
             <w:r>
               <w:rPr>
-                <w:sz w:val="17"/>
+                <w:rFonts w:ascii="Microsoft YaHei" w:hAnsi="Microsoft YaHei" w:eastAsia="Microsoft YaHei"/>
+                <w:b w:val="0"/>
+                <w:sz w:val="18"/>
               </w:rPr>
-              <w:t>知识与仪表盘</w:t>
-            </w:r>
-          </w:p>
-        </w:tc>
-        <w:tc>
-          <w:tcPr>
-            <w:tcW w:type="dxa" w:w="3300"/>
-            <w:vAlign w:val="center"/>
-          </w:tcPr>
-          <w:p>
-            <w:r>
-              <w:rPr>
-                <w:sz w:val="17"/>
-              </w:rPr>
-              <w:t>指纹查重、私有优先、关联、同步、删除联动、看板布局与分享</w:t>
-            </w:r>
-          </w:p>
-        </w:tc>
-        <w:tc>
-          <w:tcPr>
-            <w:tcW w:type="dxa" w:w="2560"/>
-            <w:vAlign w:val="center"/>
-          </w:tcPr>
-          <w:p>
-            <w:r>
-              <w:rPr>
-                <w:sz w:val="17"/>
-              </w:rPr>
-              <w:t>2.6、3.2–3.4 的自动化用例通过</w:t>
+              <w:t>从知识库中检索相关口径、SQL 示例和数据表说明，优先使用私有知识。</w:t>
             </w:r>
           </w:p>
         </w:tc>
@@ -1132,142 +378,41 @@
       <w:tr>
         <w:tc>
           <w:tcPr>
-            <w:tcW w:type="dxa" w:w="1200"/>
+            <w:tcW w:type="dxa" w:w="4873"/>
             <w:vAlign w:val="center"/>
           </w:tcPr>
           <w:p>
+            <w:pPr>
+              <w:jc w:val="center"/>
+            </w:pPr>
+            <w:r/>
             <w:r>
               <w:rPr>
-                <w:sz w:val="17"/>
+                <w:rFonts w:ascii="Microsoft YaHei" w:hAnsi="Microsoft YaHei" w:eastAsia="Microsoft YaHei"/>
+                <w:b w:val="0"/>
+                <w:sz w:val="18"/>
               </w:rPr>
-              <w:t>第 4 周</w:t>
+              <w:t>Text-to-SQL</w:t>
             </w:r>
           </w:p>
         </w:tc>
         <w:tc>
           <w:tcPr>
-            <w:tcW w:type="dxa" w:w="2300"/>
+            <w:tcW w:type="dxa" w:w="4873"/>
             <w:vAlign w:val="center"/>
           </w:tcPr>
           <w:p>
+            <w:pPr>
+              <w:jc w:val="left"/>
+            </w:pPr>
+            <w:r/>
             <w:r>
               <w:rPr>
-                <w:sz w:val="17"/>
-              </w:rPr>
-              <w:t>验收与灰度</w:t>
-            </w:r>
-          </w:p>
-        </w:tc>
-        <w:tc>
-          <w:tcPr>
-            <w:tcW w:type="dxa" w:w="3300"/>
-            <w:vAlign w:val="center"/>
-          </w:tcPr>
-          <w:p>
-            <w:r>
-              <w:rPr>
-                <w:sz w:val="17"/>
-              </w:rPr>
-              <w:t>性能/安全回归、真实模型适配、埋点、用户演示、缺陷收敛</w:t>
-            </w:r>
-          </w:p>
-        </w:tc>
-        <w:tc>
-          <w:tcPr>
-            <w:tcW w:type="dxa" w:w="2560"/>
-            <w:vAlign w:val="center"/>
-          </w:tcPr>
-          <w:p>
-            <w:r>
-              <w:rPr>
-                <w:sz w:val="17"/>
-              </w:rPr>
-              <w:t>五条端到端旅程通过，需求矩阵签字，具备灰度条件</w:t>
-            </w:r>
-          </w:p>
-        </w:tc>
-      </w:tr>
-    </w:tbl>
-    <w:p/>
-    <w:p>
-      <w:r>
-        <w:t>建议每周设置一次产品/数据/研发联合评审；任一 P0 验收失败均不得进入下一阶段的生产发布。</w:t>
-      </w:r>
-    </w:p>
-    <w:p>
-      <w:pPr>
-        <w:pStyle w:val="Heading1"/>
-      </w:pPr>
-      <w:r>
-        <w:t>10. 人员分工建议</w:t>
-      </w:r>
-    </w:p>
-    <w:tbl>
-      <w:tblPr>
-        <w:tblStyle w:val="TableGrid"/>
-        <w:tblW w:type="dxa" w:w="9360"/>
-        <w:jc w:val="center"/>
-        <w:tblLook w:firstColumn="1" w:firstRow="1" w:lastColumn="0" w:lastRow="0" w:noHBand="0" w:noVBand="1" w:val="04A0"/>
-        <w:tblBorders>
-          <w:top w:val="single" w:sz="4" w:space="0" w:color="D9E2EC"/>
-          <w:left w:val="single" w:sz="4" w:space="0" w:color="D9E2EC"/>
-          <w:bottom w:val="single" w:sz="4" w:space="0" w:color="D9E2EC"/>
-          <w:right w:val="single" w:sz="4" w:space="0" w:color="D9E2EC"/>
-          <w:insideH w:val="single" w:sz="4" w:space="0" w:color="D9E2EC"/>
-          <w:insideV w:val="single" w:sz="4" w:space="0" w:color="D9E2EC"/>
-        </w:tblBorders>
-      </w:tblPr>
-      <w:tblGrid>
-        <w:gridCol w:w="1900"/>
-        <w:gridCol w:w="3400"/>
-        <w:gridCol w:w="4060"/>
-      </w:tblGrid>
-      <w:tr>
-        <w:tc>
-          <w:tcPr>
-            <w:tcW w:type="dxa" w:w="1900"/>
-            <w:shd w:fill="F2F4F7"/>
-            <w:vAlign w:val="center"/>
-          </w:tcPr>
-          <w:p>
-            <w:r>
-              <w:rPr>
-                <w:b/>
+                <w:rFonts w:ascii="Microsoft YaHei" w:hAnsi="Microsoft YaHei" w:eastAsia="Microsoft YaHei"/>
+                <w:b w:val="0"/>
                 <w:sz w:val="18"/>
               </w:rPr>
-              <w:t>角色</w:t>
-            </w:r>
-          </w:p>
-        </w:tc>
-        <w:tc>
-          <w:tcPr>
-            <w:tcW w:type="dxa" w:w="3400"/>
-            <w:shd w:fill="F2F4F7"/>
-            <w:vAlign w:val="center"/>
-          </w:tcPr>
-          <w:p>
-            <w:r>
-              <w:rPr>
-                <w:b/>
-                <w:sz w:val="18"/>
-              </w:rPr>
-              <w:t>建议投入</w:t>
-            </w:r>
-          </w:p>
-        </w:tc>
-        <w:tc>
-          <w:tcPr>
-            <w:tcW w:type="dxa" w:w="4060"/>
-            <w:shd w:fill="F2F4F7"/>
-            <w:vAlign w:val="center"/>
-          </w:tcPr>
-          <w:p>
-            <w:r>
-              <w:rPr>
-                <w:b/>
-                <w:sz w:val="18"/>
-              </w:rPr>
-              <w:t>主要职责</w:t>
+              <w:t>DeepSeek 根据问题、上下文和检索结果生成候选 SQL 与图表建议；离线模式使用规则引擎。</w:t>
             </w:r>
           </w:p>
         </w:tc>
@@ -1275,43 +420,41 @@
       <w:tr>
         <w:tc>
           <w:tcPr>
-            <w:tcW w:type="dxa" w:w="1900"/>
+            <w:tcW w:type="dxa" w:w="4873"/>
             <w:vAlign w:val="center"/>
           </w:tcPr>
           <w:p>
+            <w:pPr>
+              <w:jc w:val="center"/>
+            </w:pPr>
+            <w:r/>
             <w:r>
               <w:rPr>
-                <w:sz w:val="17"/>
+                <w:rFonts w:ascii="Microsoft YaHei" w:hAnsi="Microsoft YaHei" w:eastAsia="Microsoft YaHei"/>
+                <w:b w:val="0"/>
+                <w:sz w:val="18"/>
               </w:rPr>
-              <w:t>产品/业务负责人</w:t>
+              <w:t>SQL 安全校验</w:t>
             </w:r>
           </w:p>
         </w:tc>
         <w:tc>
           <w:tcPr>
-            <w:tcW w:type="dxa" w:w="3400"/>
+            <w:tcW w:type="dxa" w:w="4873"/>
             <w:vAlign w:val="center"/>
           </w:tcPr>
           <w:p>
+            <w:pPr>
+              <w:jc w:val="left"/>
+            </w:pPr>
+            <w:r/>
             <w:r>
               <w:rPr>
-                <w:sz w:val="17"/>
+                <w:rFonts w:ascii="Microsoft YaHei" w:hAnsi="Microsoft YaHei" w:eastAsia="Microsoft YaHei"/>
+                <w:b w:val="0"/>
+                <w:sz w:val="18"/>
               </w:rPr>
-              <w:t>0.5 人</w:t>
-            </w:r>
-          </w:p>
-        </w:tc>
-        <w:tc>
-          <w:tcPr>
-            <w:tcW w:type="dxa" w:w="4060"/>
-            <w:vAlign w:val="center"/>
-          </w:tcPr>
-          <w:p>
-            <w:r>
-              <w:rPr>
-                <w:sz w:val="17"/>
-              </w:rPr>
-              <w:t>口径、优先级、演示脚本、验收签字</w:t>
+              <w:t>后端校验只读、单语句、授权表和行数限制，通过后才查询 SQLite。</w:t>
             </w:r>
           </w:p>
         </w:tc>
@@ -1319,43 +462,41 @@
       <w:tr>
         <w:tc>
           <w:tcPr>
-            <w:tcW w:type="dxa" w:w="1900"/>
+            <w:tcW w:type="dxa" w:w="4873"/>
             <w:vAlign w:val="center"/>
           </w:tcPr>
           <w:p>
+            <w:pPr>
+              <w:jc w:val="center"/>
+            </w:pPr>
+            <w:r/>
             <w:r>
               <w:rPr>
-                <w:sz w:val="17"/>
+                <w:rFonts w:ascii="Microsoft YaHei" w:hAnsi="Microsoft YaHei" w:eastAsia="Microsoft YaHei"/>
+                <w:b w:val="0"/>
+                <w:sz w:val="18"/>
               </w:rPr>
-              <w:t>后端工程师</w:t>
+              <w:t>图表修复</w:t>
             </w:r>
           </w:p>
         </w:tc>
         <w:tc>
           <w:tcPr>
-            <w:tcW w:type="dxa" w:w="3400"/>
+            <w:tcW w:type="dxa" w:w="4873"/>
             <w:vAlign w:val="center"/>
           </w:tcPr>
           <w:p>
+            <w:pPr>
+              <w:jc w:val="left"/>
+            </w:pPr>
+            <w:r/>
             <w:r>
               <w:rPr>
-                <w:sz w:val="17"/>
+                <w:rFonts w:ascii="Microsoft YaHei" w:hAnsi="Microsoft YaHei" w:eastAsia="Microsoft YaHei"/>
+                <w:b w:val="0"/>
+                <w:sz w:val="18"/>
               </w:rPr>
-              <w:t>1–2 人</w:t>
-            </w:r>
-          </w:p>
-        </w:tc>
-        <w:tc>
-          <w:tcPr>
-            <w:tcW w:type="dxa" w:w="4060"/>
-            <w:vAlign w:val="center"/>
-          </w:tcPr>
-          <w:p>
-            <w:r>
-              <w:rPr>
-                <w:sz w:val="17"/>
-              </w:rPr>
-              <w:t>会话编排、模型适配、SQL Guard、知识与看板 API</w:t>
+              <w:t>后端校验图表字段是否存在于 SQL 结果；不一致时按实际字段和问题关键词重建图表。</w:t>
             </w:r>
           </w:p>
         </w:tc>
@@ -1363,43 +504,41 @@
       <w:tr>
         <w:tc>
           <w:tcPr>
-            <w:tcW w:type="dxa" w:w="1900"/>
+            <w:tcW w:type="dxa" w:w="4873"/>
             <w:vAlign w:val="center"/>
           </w:tcPr>
           <w:p>
+            <w:pPr>
+              <w:jc w:val="center"/>
+            </w:pPr>
+            <w:r/>
             <w:r>
               <w:rPr>
-                <w:sz w:val="17"/>
+                <w:rFonts w:ascii="Microsoft YaHei" w:hAnsi="Microsoft YaHei" w:eastAsia="Microsoft YaHei"/>
+                <w:b w:val="0"/>
+                <w:sz w:val="18"/>
               </w:rPr>
-              <w:t>前端工程师</w:t>
+              <w:t>结果返回</w:t>
             </w:r>
           </w:p>
         </w:tc>
         <w:tc>
           <w:tcPr>
-            <w:tcW w:type="dxa" w:w="3400"/>
+            <w:tcW w:type="dxa" w:w="4873"/>
             <w:vAlign w:val="center"/>
           </w:tcPr>
           <w:p>
+            <w:pPr>
+              <w:jc w:val="left"/>
+            </w:pPr>
+            <w:r/>
             <w:r>
               <w:rPr>
-                <w:sz w:val="17"/>
+                <w:rFonts w:ascii="Microsoft YaHei" w:hAnsi="Microsoft YaHei" w:eastAsia="Microsoft YaHei"/>
+                <w:b w:val="0"/>
+                <w:sz w:val="18"/>
               </w:rPr>
-              <w:t>1 人</w:t>
-            </w:r>
-          </w:p>
-        </w:tc>
-        <w:tc>
-          <w:tcPr>
-            <w:tcW w:type="dxa" w:w="4060"/>
-            <w:vAlign w:val="center"/>
-          </w:tcPr>
-          <w:p>
-            <w:r>
-              <w:rPr>
-                <w:sz w:val="17"/>
-              </w:rPr>
-              <w:t>平台壳、问数/知识/看板/追踪页面和可访问交互</w:t>
+              <w:t>返回 SQL、数据来源、图表、洞察结论和后续推荐问题。</w:t>
             </w:r>
           </w:p>
         </w:tc>
@@ -1407,87 +546,41 @@
       <w:tr>
         <w:tc>
           <w:tcPr>
-            <w:tcW w:type="dxa" w:w="1900"/>
+            <w:tcW w:type="dxa" w:w="4873"/>
             <w:vAlign w:val="center"/>
           </w:tcPr>
           <w:p>
+            <w:pPr>
+              <w:jc w:val="center"/>
+            </w:pPr>
+            <w:r/>
             <w:r>
               <w:rPr>
-                <w:sz w:val="17"/>
+                <w:rFonts w:ascii="Microsoft YaHei" w:hAnsi="Microsoft YaHei" w:eastAsia="Microsoft YaHei"/>
+                <w:b w:val="0"/>
+                <w:sz w:val="18"/>
               </w:rPr>
-              <w:t>数据工程师</w:t>
+              <w:t>仪表盘沉淀</w:t>
             </w:r>
           </w:p>
         </w:tc>
         <w:tc>
           <w:tcPr>
-            <w:tcW w:type="dxa" w:w="3400"/>
+            <w:tcW w:type="dxa" w:w="4873"/>
             <w:vAlign w:val="center"/>
           </w:tcPr>
           <w:p>
+            <w:pPr>
+              <w:jc w:val="left"/>
+            </w:pPr>
+            <w:r/>
             <w:r>
               <w:rPr>
-                <w:sz w:val="17"/>
+                <w:rFonts w:ascii="Microsoft YaHei" w:hAnsi="Microsoft YaHei" w:eastAsia="Microsoft YaHei"/>
+                <w:b w:val="0"/>
+                <w:sz w:val="18"/>
               </w:rPr>
-              <w:t>0.5–1 人</w:t>
-            </w:r>
-          </w:p>
-        </w:tc>
-        <w:tc>
-          <w:tcPr>
-            <w:tcW w:type="dxa" w:w="4060"/>
-            <w:vAlign w:val="center"/>
-          </w:tcPr>
-          <w:p>
-            <w:r>
-              <w:rPr>
-                <w:sz w:val="17"/>
-              </w:rPr>
-              <w:t>数据表权限、元数据、口径与同步策略</w:t>
-            </w:r>
-          </w:p>
-        </w:tc>
-      </w:tr>
-      <w:tr>
-        <w:tc>
-          <w:tcPr>
-            <w:tcW w:type="dxa" w:w="1900"/>
-            <w:vAlign w:val="center"/>
-          </w:tcPr>
-          <w:p>
-            <w:r>
-              <w:rPr>
-                <w:sz w:val="17"/>
-              </w:rPr>
-              <w:t>测试/安全</w:t>
-            </w:r>
-          </w:p>
-        </w:tc>
-        <w:tc>
-          <w:tcPr>
-            <w:tcW w:type="dxa" w:w="3400"/>
-            <w:vAlign w:val="center"/>
-          </w:tcPr>
-          <w:p>
-            <w:r>
-              <w:rPr>
-                <w:sz w:val="17"/>
-              </w:rPr>
-              <w:t>0.5–1 人</w:t>
-            </w:r>
-          </w:p>
-        </w:tc>
-        <w:tc>
-          <w:tcPr>
-            <w:tcW w:type="dxa" w:w="4060"/>
-            <w:vAlign w:val="center"/>
-          </w:tcPr>
-          <w:p>
-            <w:r>
-              <w:rPr>
-                <w:sz w:val="17"/>
-              </w:rPr>
-              <w:t>自动化、越权/注入/删除联动、回归与验收证据</w:t>
+              <w:t>用户可将当前图表保存到仪表盘，并通过本地只读链接查看。</w:t>
             </w:r>
           </w:p>
         </w:tc>
@@ -1499,75 +592,122 @@
         <w:pStyle w:val="Heading1"/>
       </w:pPr>
       <w:r>
-        <w:t>11. 风险与应对</w:t>
+        <w:rPr>
+          <w:rFonts w:ascii="Microsoft YaHei" w:hAnsi="Microsoft YaHei" w:eastAsia="Microsoft YaHei"/>
+          <w:color w:val="1F4E79"/>
+        </w:rPr>
+        <w:t>4. 数据与知识库说明</w:t>
+      </w:r>
+    </w:p>
+    <w:p>
+      <w:pPr>
+        <w:spacing w:after="120" w:line="283" w:lineRule="auto"/>
+      </w:pPr>
+      <w:r>
+        <w:rPr>
+          <w:rFonts w:ascii="Microsoft YaHei" w:hAnsi="Microsoft YaHei" w:eastAsia="Microsoft YaHei"/>
+          <w:sz w:val="21"/>
+        </w:rPr>
+        <w:t>演示数据库为本地自动生成的 SQLite 数据库，不包含真实生产数据。当前数据维度覆盖房价、租金、挂牌量、空置率、成交量、新房/二手房成交、成交均价、人口、收入、家庭数、通勤时间、跨区通勤比例、地铁覆盖率和就业密度等字段。</w:t>
+      </w:r>
+    </w:p>
+    <w:p>
+      <w:pPr>
+        <w:spacing w:after="120" w:line="283" w:lineRule="auto"/>
+      </w:pPr>
+      <w:r>
+        <w:rPr>
+          <w:rFonts w:ascii="Microsoft YaHei" w:hAnsi="Microsoft YaHei" w:eastAsia="Microsoft YaHei"/>
+          <w:sz w:val="21"/>
+        </w:rPr>
+        <w:t>知识库用于向模型补充业务口径、SQL 示例和数据表关联信息。系统支持公共知识与私有知识并存，私有知识在检索和生成时具有更高优先级。</w:t>
+      </w:r>
+    </w:p>
+    <w:p>
+      <w:pPr>
+        <w:pStyle w:val="Heading1"/>
+      </w:pPr>
+      <w:r>
+        <w:rPr>
+          <w:rFonts w:ascii="Microsoft YaHei" w:hAnsi="Microsoft YaHei" w:eastAsia="Microsoft YaHei"/>
+          <w:color w:val="1F4E79"/>
+        </w:rPr>
+        <w:t>5. 核心功能实现方式</w:t>
       </w:r>
     </w:p>
     <w:tbl>
       <w:tblPr>
         <w:tblStyle w:val="TableGrid"/>
-        <w:tblW w:type="dxa" w:w="9360"/>
+        <w:tblW w:type="auto" w:w="0"/>
         <w:jc w:val="center"/>
         <w:tblLook w:firstColumn="1" w:firstRow="1" w:lastColumn="0" w:lastRow="0" w:noHBand="0" w:noVBand="1" w:val="04A0"/>
-        <w:tblBorders>
-          <w:top w:val="single" w:sz="4" w:space="0" w:color="D9E2EC"/>
-          <w:left w:val="single" w:sz="4" w:space="0" w:color="D9E2EC"/>
-          <w:bottom w:val="single" w:sz="4" w:space="0" w:color="D9E2EC"/>
-          <w:right w:val="single" w:sz="4" w:space="0" w:color="D9E2EC"/>
-          <w:insideH w:val="single" w:sz="4" w:space="0" w:color="D9E2EC"/>
-          <w:insideV w:val="single" w:sz="4" w:space="0" w:color="D9E2EC"/>
-        </w:tblBorders>
       </w:tblPr>
       <w:tblGrid>
-        <w:gridCol w:w="1900"/>
-        <w:gridCol w:w="3400"/>
-        <w:gridCol w:w="4060"/>
+        <w:gridCol w:w="3249"/>
+        <w:gridCol w:w="3249"/>
+        <w:gridCol w:w="3249"/>
       </w:tblGrid>
       <w:tr>
         <w:tc>
           <w:tcPr>
-            <w:tcW w:type="dxa" w:w="1900"/>
-            <w:shd w:fill="F2F4F7"/>
+            <w:tcW w:type="dxa" w:w="3249"/>
+            <w:shd w:fill="D9EAF7"/>
             <w:vAlign w:val="center"/>
           </w:tcPr>
           <w:p>
+            <w:pPr>
+              <w:jc w:val="center"/>
+            </w:pPr>
+            <w:r/>
             <w:r>
               <w:rPr>
+                <w:rFonts w:ascii="Microsoft YaHei" w:hAnsi="Microsoft YaHei" w:eastAsia="Microsoft YaHei"/>
                 <w:b/>
                 <w:sz w:val="18"/>
               </w:rPr>
-              <w:t>风险</w:t>
+              <w:t>功能</w:t>
             </w:r>
           </w:p>
         </w:tc>
         <w:tc>
           <w:tcPr>
-            <w:tcW w:type="dxa" w:w="3400"/>
-            <w:shd w:fill="F2F4F7"/>
+            <w:tcW w:type="dxa" w:w="3249"/>
+            <w:shd w:fill="D9EAF7"/>
             <w:vAlign w:val="center"/>
           </w:tcPr>
           <w:p>
+            <w:pPr>
+              <w:jc w:val="center"/>
+            </w:pPr>
+            <w:r/>
             <w:r>
               <w:rPr>
+                <w:rFonts w:ascii="Microsoft YaHei" w:hAnsi="Microsoft YaHei" w:eastAsia="Microsoft YaHei"/>
                 <w:b/>
                 <w:sz w:val="18"/>
               </w:rPr>
-              <w:t>影响</w:t>
+              <w:t>实现方式</w:t>
             </w:r>
           </w:p>
         </w:tc>
         <w:tc>
           <w:tcPr>
-            <w:tcW w:type="dxa" w:w="4060"/>
-            <w:shd w:fill="F2F4F7"/>
+            <w:tcW w:type="dxa" w:w="3249"/>
+            <w:shd w:fill="D9EAF7"/>
             <w:vAlign w:val="center"/>
           </w:tcPr>
           <w:p>
+            <w:pPr>
+              <w:jc w:val="center"/>
+            </w:pPr>
+            <w:r/>
             <w:r>
               <w:rPr>
+                <w:rFonts w:ascii="Microsoft YaHei" w:hAnsi="Microsoft YaHei" w:eastAsia="Microsoft YaHei"/>
                 <w:b/>
                 <w:sz w:val="18"/>
               </w:rPr>
-              <w:t>应对措施</w:t>
+              <w:t>当前状态</w:t>
             </w:r>
           </w:p>
         </w:tc>
@@ -1575,43 +715,61 @@
       <w:tr>
         <w:tc>
           <w:tcPr>
-            <w:tcW w:type="dxa" w:w="1900"/>
+            <w:tcW w:type="dxa" w:w="3249"/>
             <w:vAlign w:val="center"/>
           </w:tcPr>
           <w:p>
+            <w:pPr>
+              <w:jc w:val="center"/>
+            </w:pPr>
+            <w:r/>
             <w:r>
               <w:rPr>
-                <w:sz w:val="17"/>
+                <w:rFonts w:ascii="Microsoft YaHei" w:hAnsi="Microsoft YaHei" w:eastAsia="Microsoft YaHei"/>
+                <w:b w:val="0"/>
+                <w:sz w:val="18"/>
               </w:rPr>
-              <w:t>真实模型输出不稳定</w:t>
+              <w:t>智能问数</w:t>
             </w:r>
           </w:p>
         </w:tc>
         <w:tc>
           <w:tcPr>
-            <w:tcW w:type="dxa" w:w="3400"/>
+            <w:tcW w:type="dxa" w:w="3249"/>
             <w:vAlign w:val="center"/>
           </w:tcPr>
           <w:p>
+            <w:pPr>
+              <w:jc w:val="left"/>
+            </w:pPr>
+            <w:r/>
             <w:r>
               <w:rPr>
-                <w:sz w:val="17"/>
+                <w:rFonts w:ascii="Microsoft YaHei" w:hAnsi="Microsoft YaHei" w:eastAsia="Microsoft YaHei"/>
+                <w:b w:val="0"/>
+                <w:sz w:val="18"/>
               </w:rPr>
-              <w:t>生成不可执行 SQL 或字段不一致</w:t>
+              <w:t>自然语言问题经后端工作流转换为 SQL 查询和图表结果。</w:t>
             </w:r>
           </w:p>
         </w:tc>
         <w:tc>
           <w:tcPr>
-            <w:tcW w:type="dxa" w:w="4060"/>
+            <w:tcW w:type="dxa" w:w="3249"/>
             <w:vAlign w:val="center"/>
           </w:tcPr>
           <w:p>
+            <w:pPr>
+              <w:jc w:val="center"/>
+            </w:pPr>
+            <w:r/>
             <w:r>
               <w:rPr>
-                <w:sz w:val="17"/>
+                <w:rFonts w:ascii="Microsoft YaHei" w:hAnsi="Microsoft YaHei" w:eastAsia="Microsoft YaHei"/>
+                <w:b w:val="0"/>
+                <w:sz w:val="18"/>
               </w:rPr>
-              <w:t>强制结构化输出；后端二次校验；失败不执行；离线模式作为确定性验收基线</w:t>
+              <w:t>已完成</w:t>
             </w:r>
           </w:p>
         </w:tc>
@@ -1619,43 +777,61 @@
       <w:tr>
         <w:tc>
           <w:tcPr>
-            <w:tcW w:type="dxa" w:w="1900"/>
+            <w:tcW w:type="dxa" w:w="3249"/>
             <w:vAlign w:val="center"/>
           </w:tcPr>
           <w:p>
+            <w:pPr>
+              <w:jc w:val="center"/>
+            </w:pPr>
+            <w:r/>
             <w:r>
               <w:rPr>
-                <w:sz w:val="17"/>
+                <w:rFonts w:ascii="Microsoft YaHei" w:hAnsi="Microsoft YaHei" w:eastAsia="Microsoft YaHei"/>
+                <w:b w:val="0"/>
+                <w:sz w:val="18"/>
               </w:rPr>
-              <w:t>数据口径不一致</w:t>
+              <w:t>DeepSeek 接入</w:t>
             </w:r>
           </w:p>
         </w:tc>
         <w:tc>
           <w:tcPr>
-            <w:tcW w:type="dxa" w:w="3400"/>
+            <w:tcW w:type="dxa" w:w="3249"/>
             <w:vAlign w:val="center"/>
           </w:tcPr>
           <w:p>
+            <w:pPr>
+              <w:jc w:val="left"/>
+            </w:pPr>
+            <w:r/>
             <w:r>
               <w:rPr>
-                <w:sz w:val="17"/>
+                <w:rFonts w:ascii="Microsoft YaHei" w:hAnsi="Microsoft YaHei" w:eastAsia="Microsoft YaHei"/>
+                <w:b w:val="0"/>
+                <w:sz w:val="18"/>
               </w:rPr>
-              <w:t>结果正确但业务解释错误</w:t>
+              <w:t>使用 DeepSeek Chat Completions 生成结构化 JSON，包含 SQL、推理说明和图表建议。</w:t>
             </w:r>
           </w:p>
         </w:tc>
         <w:tc>
           <w:tcPr>
-            <w:tcW w:type="dxa" w:w="4060"/>
+            <w:tcW w:type="dxa" w:w="3249"/>
             <w:vAlign w:val="center"/>
           </w:tcPr>
           <w:p>
+            <w:pPr>
+              <w:jc w:val="center"/>
+            </w:pPr>
+            <w:r/>
             <w:r>
               <w:rPr>
-                <w:sz w:val="17"/>
+                <w:rFonts w:ascii="Microsoft YaHei" w:hAnsi="Microsoft YaHei" w:eastAsia="Microsoft YaHei"/>
+                <w:b w:val="0"/>
+                <w:sz w:val="18"/>
               </w:rPr>
-              <w:t>口径知识版本化；数据表/字段/更新时间/置信度随结果展示</w:t>
+              <w:t>已完成</w:t>
             </w:r>
           </w:p>
         </w:tc>
@@ -1663,43 +839,61 @@
       <w:tr>
         <w:tc>
           <w:tcPr>
-            <w:tcW w:type="dxa" w:w="1900"/>
+            <w:tcW w:type="dxa" w:w="3249"/>
             <w:vAlign w:val="center"/>
           </w:tcPr>
           <w:p>
+            <w:pPr>
+              <w:jc w:val="center"/>
+            </w:pPr>
+            <w:r/>
             <w:r>
               <w:rPr>
-                <w:sz w:val="17"/>
+                <w:rFonts w:ascii="Microsoft YaHei" w:hAnsi="Microsoft YaHei" w:eastAsia="Microsoft YaHei"/>
+                <w:b w:val="0"/>
+                <w:sz w:val="18"/>
               </w:rPr>
-              <w:t>SQL 注入或越权</w:t>
+              <w:t>知识增强</w:t>
             </w:r>
           </w:p>
         </w:tc>
         <w:tc>
           <w:tcPr>
-            <w:tcW w:type="dxa" w:w="3400"/>
+            <w:tcW w:type="dxa" w:w="3249"/>
             <w:vAlign w:val="center"/>
           </w:tcPr>
           <w:p>
+            <w:pPr>
+              <w:jc w:val="left"/>
+            </w:pPr>
+            <w:r/>
             <w:r>
               <w:rPr>
-                <w:sz w:val="17"/>
+                <w:rFonts w:ascii="Microsoft YaHei" w:hAnsi="Microsoft YaHei" w:eastAsia="Microsoft YaHei"/>
+                <w:b w:val="0"/>
+                <w:sz w:val="18"/>
               </w:rPr>
-              <w:t>数据泄漏或破坏</w:t>
+              <w:t>基于问题关键词和表关联检索知识项，作为模型上下文。</w:t>
             </w:r>
           </w:p>
         </w:tc>
         <w:tc>
           <w:tcPr>
-            <w:tcW w:type="dxa" w:w="4060"/>
+            <w:tcW w:type="dxa" w:w="3249"/>
             <w:vAlign w:val="center"/>
           </w:tcPr>
           <w:p>
+            <w:pPr>
+              <w:jc w:val="center"/>
+            </w:pPr>
+            <w:r/>
             <w:r>
               <w:rPr>
-                <w:sz w:val="17"/>
+                <w:rFonts w:ascii="Microsoft YaHei" w:hAnsi="Microsoft YaHei" w:eastAsia="Microsoft YaHei"/>
+                <w:b w:val="0"/>
+                <w:sz w:val="18"/>
               </w:rPr>
-              <w:t>单语句只读、关键词拦截、表白名单、行数/超时限制、服务账号最小权限</w:t>
+              <w:t>已完成</w:t>
             </w:r>
           </w:p>
         </w:tc>
@@ -1707,43 +901,61 @@
       <w:tr>
         <w:tc>
           <w:tcPr>
-            <w:tcW w:type="dxa" w:w="1900"/>
+            <w:tcW w:type="dxa" w:w="3249"/>
             <w:vAlign w:val="center"/>
           </w:tcPr>
           <w:p>
+            <w:pPr>
+              <w:jc w:val="center"/>
+            </w:pPr>
+            <w:r/>
             <w:r>
               <w:rPr>
-                <w:sz w:val="17"/>
+                <w:rFonts w:ascii="Microsoft YaHei" w:hAnsi="Microsoft YaHei" w:eastAsia="Microsoft YaHei"/>
+                <w:b w:val="0"/>
+                <w:sz w:val="18"/>
               </w:rPr>
-              <w:t>私有/公开知识冲突</w:t>
+              <w:t>SQL 防线</w:t>
             </w:r>
           </w:p>
         </w:tc>
         <w:tc>
           <w:tcPr>
-            <w:tcW w:type="dxa" w:w="3400"/>
+            <w:tcW w:type="dxa" w:w="3249"/>
             <w:vAlign w:val="center"/>
           </w:tcPr>
           <w:p>
+            <w:pPr>
+              <w:jc w:val="left"/>
+            </w:pPr>
+            <w:r/>
             <w:r>
               <w:rPr>
-                <w:sz w:val="17"/>
+                <w:rFonts w:ascii="Microsoft YaHei" w:hAnsi="Microsoft YaHei" w:eastAsia="Microsoft YaHei"/>
+                <w:b w:val="0"/>
+                <w:sz w:val="18"/>
               </w:rPr>
-              <w:t>使用错误口径</w:t>
+              <w:t>校验危险操作、非授权表、多语句和非只读查询。</w:t>
             </w:r>
           </w:p>
         </w:tc>
         <w:tc>
           <w:tcPr>
-            <w:tcW w:type="dxa" w:w="4060"/>
+            <w:tcW w:type="dxa" w:w="3249"/>
             <w:vAlign w:val="center"/>
           </w:tcPr>
           <w:p>
+            <w:pPr>
+              <w:jc w:val="center"/>
+            </w:pPr>
+            <w:r/>
             <w:r>
               <w:rPr>
-                <w:sz w:val="17"/>
+                <w:rFonts w:ascii="Microsoft YaHei" w:hAnsi="Microsoft YaHei" w:eastAsia="Microsoft YaHei"/>
+                <w:b w:val="0"/>
+                <w:sz w:val="18"/>
               </w:rPr>
-              <w:t>指纹查重；私有优先；页面明确显示覆盖关系并保留公开记录</w:t>
+              <w:t>已完成</w:t>
             </w:r>
           </w:p>
         </w:tc>
@@ -1751,43 +963,61 @@
       <w:tr>
         <w:tc>
           <w:tcPr>
-            <w:tcW w:type="dxa" w:w="1900"/>
+            <w:tcW w:type="dxa" w:w="3249"/>
             <w:vAlign w:val="center"/>
           </w:tcPr>
           <w:p>
+            <w:pPr>
+              <w:jc w:val="center"/>
+            </w:pPr>
+            <w:r/>
             <w:r>
               <w:rPr>
-                <w:sz w:val="17"/>
+                <w:rFonts w:ascii="Microsoft YaHei" w:hAnsi="Microsoft YaHei" w:eastAsia="Microsoft YaHei"/>
+                <w:b w:val="0"/>
+                <w:sz w:val="18"/>
               </w:rPr>
-              <w:t>删除或表结构变化</w:t>
+              <w:t>图表修复</w:t>
             </w:r>
           </w:p>
         </w:tc>
         <w:tc>
           <w:tcPr>
-            <w:tcW w:type="dxa" w:w="3400"/>
+            <w:tcW w:type="dxa" w:w="3249"/>
             <w:vAlign w:val="center"/>
           </w:tcPr>
           <w:p>
+            <w:pPr>
+              <w:jc w:val="left"/>
+            </w:pPr>
+            <w:r/>
             <w:r>
               <w:rPr>
-                <w:sz w:val="17"/>
+                <w:rFonts w:ascii="Microsoft YaHei" w:hAnsi="Microsoft YaHei" w:eastAsia="Microsoft YaHei"/>
+                <w:b w:val="0"/>
+                <w:sz w:val="18"/>
               </w:rPr>
-              <w:t>SQL 模型失效</w:t>
+              <w:t>校验 x/y 字段与结果字段一致性，必要时自动重建图表。</w:t>
             </w:r>
           </w:p>
         </w:tc>
         <w:tc>
           <w:tcPr>
-            <w:tcW w:type="dxa" w:w="4060"/>
+            <w:tcW w:type="dxa" w:w="3249"/>
             <w:vAlign w:val="center"/>
           </w:tcPr>
           <w:p>
+            <w:pPr>
+              <w:jc w:val="center"/>
+            </w:pPr>
+            <w:r/>
             <w:r>
               <w:rPr>
-                <w:sz w:val="17"/>
+                <w:rFonts w:ascii="Microsoft YaHei" w:hAnsi="Microsoft YaHei" w:eastAsia="Microsoft YaHei"/>
+                <w:b w:val="0"/>
+                <w:sz w:val="18"/>
               </w:rPr>
-              <w:t>删除预览、确认联动、同步标记 needs_review、审计日志</w:t>
+              <w:t>已完成</w:t>
             </w:r>
           </w:p>
         </w:tc>
@@ -1795,43 +1025,61 @@
       <w:tr>
         <w:tc>
           <w:tcPr>
-            <w:tcW w:type="dxa" w:w="1900"/>
+            <w:tcW w:type="dxa" w:w="3249"/>
             <w:vAlign w:val="center"/>
           </w:tcPr>
           <w:p>
+            <w:pPr>
+              <w:jc w:val="center"/>
+            </w:pPr>
+            <w:r/>
             <w:r>
               <w:rPr>
-                <w:sz w:val="17"/>
+                <w:rFonts w:ascii="Microsoft YaHei" w:hAnsi="Microsoft YaHei" w:eastAsia="Microsoft YaHei"/>
+                <w:b w:val="0"/>
+                <w:sz w:val="18"/>
               </w:rPr>
-              <w:t>Demo 与生产架构差异</w:t>
+              <w:t>推荐问题</w:t>
             </w:r>
           </w:p>
         </w:tc>
         <w:tc>
           <w:tcPr>
-            <w:tcW w:type="dxa" w:w="3400"/>
+            <w:tcW w:type="dxa" w:w="3249"/>
             <w:vAlign w:val="center"/>
           </w:tcPr>
           <w:p>
+            <w:pPr>
+              <w:jc w:val="left"/>
+            </w:pPr>
+            <w:r/>
             <w:r>
               <w:rPr>
-                <w:sz w:val="17"/>
+                <w:rFonts w:ascii="Microsoft YaHei" w:hAnsi="Microsoft YaHei" w:eastAsia="Microsoft YaHei"/>
+                <w:b w:val="0"/>
+                <w:sz w:val="18"/>
               </w:rPr>
-              <w:t>低估集成成本</w:t>
+              <w:t>简单问题和完成结果后分别生成 3 个去重推荐问题。</w:t>
             </w:r>
           </w:p>
         </w:tc>
         <w:tc>
           <w:tcPr>
-            <w:tcW w:type="dxa" w:w="4060"/>
+            <w:tcW w:type="dxa" w:w="3249"/>
             <w:vAlign w:val="center"/>
           </w:tcPr>
           <w:p>
+            <w:pPr>
+              <w:jc w:val="center"/>
+            </w:pPr>
+            <w:r/>
             <w:r>
               <w:rPr>
-                <w:sz w:val="17"/>
+                <w:rFonts w:ascii="Microsoft YaHei" w:hAnsi="Microsoft YaHei" w:eastAsia="Microsoft YaHei"/>
+                <w:b w:val="0"/>
+                <w:sz w:val="18"/>
               </w:rPr>
-              <w:t>将 Demo 定位为接口与验收基线；生产集成另行评估认证、权限、队列和监控</w:t>
+              <w:t>已完成</w:t>
             </w:r>
           </w:p>
         </w:tc>
@@ -1839,43 +1087,123 @@
       <w:tr>
         <w:tc>
           <w:tcPr>
-            <w:tcW w:type="dxa" w:w="1900"/>
+            <w:tcW w:type="dxa" w:w="3249"/>
             <w:vAlign w:val="center"/>
           </w:tcPr>
           <w:p>
+            <w:pPr>
+              <w:jc w:val="center"/>
+            </w:pPr>
+            <w:r/>
             <w:r>
               <w:rPr>
-                <w:sz w:val="17"/>
+                <w:rFonts w:ascii="Microsoft YaHei" w:hAnsi="Microsoft YaHei" w:eastAsia="Microsoft YaHei"/>
+                <w:b w:val="0"/>
+                <w:sz w:val="18"/>
               </w:rPr>
-              <w:t>演示环境依赖失败</w:t>
+              <w:t>仪表盘</w:t>
             </w:r>
           </w:p>
         </w:tc>
         <w:tc>
           <w:tcPr>
-            <w:tcW w:type="dxa" w:w="3400"/>
+            <w:tcW w:type="dxa" w:w="3249"/>
             <w:vAlign w:val="center"/>
           </w:tcPr>
           <w:p>
+            <w:pPr>
+              <w:jc w:val="left"/>
+            </w:pPr>
+            <w:r/>
             <w:r>
               <w:rPr>
-                <w:sz w:val="17"/>
+                <w:rFonts w:ascii="Microsoft YaHei" w:hAnsi="Microsoft YaHei" w:eastAsia="Microsoft YaHei"/>
+                <w:b w:val="0"/>
+                <w:sz w:val="18"/>
               </w:rPr>
-              <w:t>无法现场启动</w:t>
+              <w:t>卡片布局持久化到 SQLite，前端支持拖拽排序和分享查看。</w:t>
             </w:r>
           </w:p>
         </w:tc>
         <w:tc>
           <w:tcPr>
-            <w:tcW w:type="dxa" w:w="4060"/>
+            <w:tcW w:type="dxa" w:w="3249"/>
             <w:vAlign w:val="center"/>
           </w:tcPr>
           <w:p>
+            <w:pPr>
+              <w:jc w:val="center"/>
+            </w:pPr>
+            <w:r/>
             <w:r>
               <w:rPr>
-                <w:sz w:val="17"/>
+                <w:rFonts w:ascii="Microsoft YaHei" w:hAnsi="Microsoft YaHei" w:eastAsia="Microsoft YaHei"/>
+                <w:b w:val="0"/>
+                <w:sz w:val="18"/>
               </w:rPr>
-              <w:t>一键脚本检查运行时、安装依赖、轮询健康；提供手动启动与重置说明</w:t>
+              <w:t>已完成</w:t>
+            </w:r>
+          </w:p>
+        </w:tc>
+      </w:tr>
+      <w:tr>
+        <w:tc>
+          <w:tcPr>
+            <w:tcW w:type="dxa" w:w="3249"/>
+            <w:vAlign w:val="center"/>
+          </w:tcPr>
+          <w:p>
+            <w:pPr>
+              <w:jc w:val="center"/>
+            </w:pPr>
+            <w:r/>
+            <w:r>
+              <w:rPr>
+                <w:rFonts w:ascii="Microsoft YaHei" w:hAnsi="Microsoft YaHei" w:eastAsia="Microsoft YaHei"/>
+                <w:b w:val="0"/>
+                <w:sz w:val="18"/>
+              </w:rPr>
+              <w:t>API Key 配置</w:t>
+            </w:r>
+          </w:p>
+        </w:tc>
+        <w:tc>
+          <w:tcPr>
+            <w:tcW w:type="dxa" w:w="3249"/>
+            <w:vAlign w:val="center"/>
+          </w:tcPr>
+          <w:p>
+            <w:pPr>
+              <w:jc w:val="left"/>
+            </w:pPr>
+            <w:r/>
+            <w:r>
+              <w:rPr>
+                <w:rFonts w:ascii="Microsoft YaHei" w:hAnsi="Microsoft YaHei" w:eastAsia="Microsoft YaHei"/>
+                <w:b w:val="0"/>
+                <w:sz w:val="18"/>
+              </w:rPr>
+              <w:t>前端填写 Key，后端运行时更新配置，不回显密钥。</w:t>
+            </w:r>
+          </w:p>
+        </w:tc>
+        <w:tc>
+          <w:tcPr>
+            <w:tcW w:type="dxa" w:w="3249"/>
+            <w:vAlign w:val="center"/>
+          </w:tcPr>
+          <w:p>
+            <w:pPr>
+              <w:jc w:val="center"/>
+            </w:pPr>
+            <w:r/>
+            <w:r>
+              <w:rPr>
+                <w:rFonts w:ascii="Microsoft YaHei" w:hAnsi="Microsoft YaHei" w:eastAsia="Microsoft YaHei"/>
+                <w:b w:val="0"/>
+                <w:sz w:val="18"/>
+              </w:rPr>
+              <w:t>已完成</w:t>
             </w:r>
           </w:p>
         </w:tc>
@@ -1887,95 +1215,47 @@
         <w:pStyle w:val="Heading1"/>
       </w:pPr>
       <w:r>
-        <w:t>12. 验收方案</w:t>
+        <w:rPr>
+          <w:rFonts w:ascii="Microsoft YaHei" w:hAnsi="Microsoft YaHei" w:eastAsia="Microsoft YaHei"/>
+          <w:color w:val="1F4E79"/>
+        </w:rPr>
+        <w:t>6. 本地运行方式</w:t>
       </w:r>
     </w:p>
     <w:p>
       <w:pPr>
-        <w:pStyle w:val="Heading2"/>
+        <w:spacing w:after="120" w:line="283" w:lineRule="auto"/>
       </w:pPr>
       <w:r>
-        <w:t>12.1 自动化验收</w:t>
+        <w:rPr>
+          <w:rFonts w:ascii="Microsoft YaHei" w:hAnsi="Microsoft YaHei" w:eastAsia="Microsoft YaHei"/>
+          <w:sz w:val="21"/>
+        </w:rPr>
+        <w:t>在项目根目录执行以下命令可一键启动：</w:t>
       </w:r>
     </w:p>
     <w:p>
       <w:pPr>
-        <w:pStyle w:val="ListBullet"/>
+        <w:spacing w:after="120" w:line="283" w:lineRule="auto"/>
       </w:pPr>
       <w:r>
-        <w:t>后端：数据库幂等种子、SQL Guard、离线分析、上下文、知识、同步、删除联动、仪表盘、需求与文档覆盖。</w:t>
+        <w:rPr>
+          <w:rFonts w:ascii="Microsoft YaHei" w:hAnsi="Microsoft YaHei" w:eastAsia="Microsoft YaHei"/>
+          <w:sz w:val="21"/>
+        </w:rPr>
+        <w:t>powershell -ExecutionPolicy Bypass -File .\start-demo.ps1</w:t>
       </w:r>
     </w:p>
     <w:p>
       <w:pPr>
-        <w:pStyle w:val="ListBullet"/>
+        <w:spacing w:after="120" w:line="283" w:lineRule="auto"/>
       </w:pPr>
       <w:r>
-        <w:t>前端：需求徽标、澄清建议、思考步骤、保存图表、私有优先、同步、布局、需求筛选。</w:t>
-      </w:r>
-    </w:p>
-    <w:p>
-      <w:pPr>
-        <w:pStyle w:val="ListBullet"/>
-      </w:pPr>
-      <w:r>
-        <w:t>端到端：问题到图表到看板、多轮追问、多源拆分、知识冲突、同步与删除联动。</w:t>
-      </w:r>
-    </w:p>
-    <w:p>
-      <w:pPr>
-        <w:pStyle w:val="Heading2"/>
-      </w:pPr>
-      <w:r>
-        <w:t>12.2 演示验收</w:t>
-      </w:r>
-    </w:p>
-    <w:p>
-      <w:pPr>
-        <w:pStyle w:val="ListNumber"/>
-      </w:pPr>
-      <w:r>
-        <w:t>输入“分析房价”，必须返回三条建议且无 SQL（2.2）。</w:t>
-      </w:r>
-    </w:p>
-    <w:p>
-      <w:pPr>
-        <w:pStyle w:val="ListNumber"/>
-      </w:pPr>
-      <w:r>
-        <w:t>完成房价分析，必须看到步骤、来源、Skill、SQL、图表、最大值/异常和追问（2.1、2.4、2.5）。</w:t>
-      </w:r>
-    </w:p>
-    <w:p>
-      <w:pPr>
-        <w:pStyle w:val="ListNumber"/>
-      </w:pPr>
-      <w:r>
-        <w:t>追问“只看海淀区”，必须继承 2025 年和平均房价指标（2.3）。</w:t>
-      </w:r>
-    </w:p>
-    <w:p>
-      <w:pPr>
-        <w:pStyle w:val="ListNumber"/>
-      </w:pPr>
-      <w:r>
-        <w:t>多源问题必须至少生成两条白名单 SQL 并汇总（5）。</w:t>
-      </w:r>
-    </w:p>
-    <w:p>
-      <w:pPr>
-        <w:pStyle w:val="ListNumber"/>
-      </w:pPr>
-      <w:r>
-        <w:t>私有知识必须覆盖公开匹配项；同步和删除必须留痕并先确认（3.2–3.4）。</w:t>
-      </w:r>
-    </w:p>
-    <w:p>
-      <w:pPr>
-        <w:pStyle w:val="ListNumber"/>
-      </w:pPr>
-      <w:r>
-        <w:t>图表加入看板后，刷新仍存在且布局变化可保存；复制的分享链接必须能打开只读看板且不出现编辑按钮（2.6）。</w:t>
+        <w:rPr>
+          <w:rFonts w:ascii="Microsoft YaHei" w:hAnsi="Microsoft YaHei" w:eastAsia="Microsoft YaHei"/>
+          <w:sz w:val="21"/>
+        </w:rPr>
+        <w:t>默认前端地址：http://127.0.0.1:5173；后端健康检查地址：http://127.0.0.1:8000/api/health。</w:t>
       </w:r>
     </w:p>
     <w:p>
@@ -1983,92 +1263,110 @@
         <w:pStyle w:val="Heading1"/>
       </w:pPr>
       <w:r>
-        <w:t>13. 需求追踪矩阵</w:t>
+        <w:rPr>
+          <w:rFonts w:ascii="Microsoft YaHei" w:hAnsi="Microsoft YaHei" w:eastAsia="Microsoft YaHei"/>
+          <w:color w:val="1F4E79"/>
+        </w:rPr>
+        <w:t>7. DeepSeek 配置方式</w:t>
+      </w:r>
+    </w:p>
+    <w:p>
+      <w:pPr>
+        <w:spacing w:after="120" w:line="283" w:lineRule="auto"/>
+      </w:pPr>
+      <w:r>
+        <w:rPr>
+          <w:rFonts w:ascii="Microsoft YaHei" w:hAnsi="Microsoft YaHei" w:eastAsia="Microsoft YaHei"/>
+          <w:sz w:val="21"/>
+        </w:rPr>
+        <w:t>默认可使用离线演示模式。如需启用真实 DeepSeek Text-to-SQL，可在页面点击“配置 DeepSeek API”填写 Key，也可在本地 .env 文件中配置 LLM_MODE=deepseek、DEEPSEEK_API_KEY、DEEPSEEK_BASE_URL 和 DEEPSEEK_MODEL。真实 Key 不应提交到 GitHub。</w:t>
+      </w:r>
+    </w:p>
+    <w:p>
+      <w:pPr>
+        <w:pStyle w:val="Heading1"/>
+      </w:pPr>
+      <w:r>
+        <w:rPr>
+          <w:rFonts w:ascii="Microsoft YaHei" w:hAnsi="Microsoft YaHei" w:eastAsia="Microsoft YaHei"/>
+          <w:color w:val="1F4E79"/>
+        </w:rPr>
+        <w:t>8. 验证结果</w:t>
       </w:r>
     </w:p>
     <w:tbl>
       <w:tblPr>
         <w:tblStyle w:val="TableGrid"/>
-        <w:tblW w:type="dxa" w:w="9360"/>
+        <w:tblW w:type="auto" w:w="0"/>
         <w:jc w:val="center"/>
         <w:tblLook w:firstColumn="1" w:firstRow="1" w:lastColumn="0" w:lastRow="0" w:noHBand="0" w:noVBand="1" w:val="04A0"/>
-        <w:tblBorders>
-          <w:top w:val="single" w:sz="4" w:space="0" w:color="D9E2EC"/>
-          <w:left w:val="single" w:sz="4" w:space="0" w:color="D9E2EC"/>
-          <w:bottom w:val="single" w:sz="4" w:space="0" w:color="D9E2EC"/>
-          <w:right w:val="single" w:sz="4" w:space="0" w:color="D9E2EC"/>
-          <w:insideH w:val="single" w:sz="4" w:space="0" w:color="D9E2EC"/>
-          <w:insideV w:val="single" w:sz="4" w:space="0" w:color="D9E2EC"/>
-        </w:tblBorders>
       </w:tblPr>
       <w:tblGrid>
-        <w:gridCol w:w="1200"/>
-        <w:gridCol w:w="2300"/>
-        <w:gridCol w:w="3300"/>
-        <w:gridCol w:w="2560"/>
+        <w:gridCol w:w="3249"/>
+        <w:gridCol w:w="3249"/>
+        <w:gridCol w:w="3249"/>
       </w:tblGrid>
       <w:tr>
         <w:tc>
           <w:tcPr>
-            <w:tcW w:type="dxa" w:w="1200"/>
-            <w:shd w:fill="F2F4F7"/>
+            <w:tcW w:type="dxa" w:w="3249"/>
+            <w:shd w:fill="D9EAF7"/>
             <w:vAlign w:val="center"/>
           </w:tcPr>
           <w:p>
+            <w:pPr>
+              <w:jc w:val="center"/>
+            </w:pPr>
+            <w:r/>
             <w:r>
               <w:rPr>
+                <w:rFonts w:ascii="Microsoft YaHei" w:hAnsi="Microsoft YaHei" w:eastAsia="Microsoft YaHei"/>
                 <w:b/>
                 <w:sz w:val="18"/>
               </w:rPr>
-              <w:t>编号</w:t>
+              <w:t>验证项</w:t>
             </w:r>
           </w:p>
         </w:tc>
         <w:tc>
           <w:tcPr>
-            <w:tcW w:type="dxa" w:w="2300"/>
-            <w:shd w:fill="F2F4F7"/>
+            <w:tcW w:type="dxa" w:w="3249"/>
+            <w:shd w:fill="D9EAF7"/>
             <w:vAlign w:val="center"/>
           </w:tcPr>
           <w:p>
+            <w:pPr>
+              <w:jc w:val="center"/>
+            </w:pPr>
+            <w:r/>
             <w:r>
               <w:rPr>
+                <w:rFonts w:ascii="Microsoft YaHei" w:hAnsi="Microsoft YaHei" w:eastAsia="Microsoft YaHei"/>
                 <w:b/>
                 <w:sz w:val="18"/>
               </w:rPr>
-              <w:t>解决方案摘要</w:t>
+              <w:t>命令</w:t>
             </w:r>
           </w:p>
         </w:tc>
         <w:tc>
           <w:tcPr>
-            <w:tcW w:type="dxa" w:w="3300"/>
-            <w:shd w:fill="F2F4F7"/>
+            <w:tcW w:type="dxa" w:w="3249"/>
+            <w:shd w:fill="D9EAF7"/>
             <w:vAlign w:val="center"/>
           </w:tcPr>
           <w:p>
+            <w:pPr>
+              <w:jc w:val="center"/>
+            </w:pPr>
+            <w:r/>
             <w:r>
               <w:rPr>
+                <w:rFonts w:ascii="Microsoft YaHei" w:hAnsi="Microsoft YaHei" w:eastAsia="Microsoft YaHei"/>
                 <w:b/>
                 <w:sz w:val="18"/>
               </w:rPr>
-              <w:t>Demo 页面</w:t>
-            </w:r>
-          </w:p>
-        </w:tc>
-        <w:tc>
-          <w:tcPr>
-            <w:tcW w:type="dxa" w:w="2560"/>
-            <w:shd w:fill="F2F4F7"/>
-            <w:vAlign w:val="center"/>
-          </w:tcPr>
-          <w:p>
-            <w:r>
-              <w:rPr>
-                <w:b/>
-                <w:sz w:val="18"/>
-              </w:rPr>
-              <w:t>主要 API</w:t>
+              <w:t>结果</w:t>
             </w:r>
           </w:p>
         </w:tc>
@@ -2076,57 +1374,61 @@
       <w:tr>
         <w:tc>
           <w:tcPr>
-            <w:tcW w:type="dxa" w:w="1200"/>
+            <w:tcW w:type="dxa" w:w="3249"/>
             <w:vAlign w:val="center"/>
           </w:tcPr>
           <w:p>
+            <w:pPr>
+              <w:jc w:val="center"/>
+            </w:pPr>
+            <w:r/>
             <w:r>
               <w:rPr>
-                <w:sz w:val="17"/>
+                <w:rFonts w:ascii="Microsoft YaHei" w:hAnsi="Microsoft YaHei" w:eastAsia="Microsoft YaHei"/>
+                <w:b w:val="0"/>
+                <w:sz w:val="18"/>
               </w:rPr>
-              <w:t>2.1-a</w:t>
+              <w:t>后端测试</w:t>
             </w:r>
           </w:p>
         </w:tc>
         <w:tc>
           <w:tcPr>
-            <w:tcW w:type="dxa" w:w="2300"/>
+            <w:tcW w:type="dxa" w:w="3249"/>
             <w:vAlign w:val="center"/>
           </w:tcPr>
           <w:p>
+            <w:pPr>
+              <w:jc w:val="left"/>
+            </w:pPr>
+            <w:r/>
             <w:r>
               <w:rPr>
-                <w:sz w:val="17"/>
+                <w:rFonts w:ascii="Microsoft YaHei" w:hAnsi="Microsoft YaHei" w:eastAsia="Microsoft YaHei"/>
+                <w:b w:val="0"/>
+                <w:sz w:val="18"/>
               </w:rPr>
-              <w:t>可折叠业务步骤时间线</w:t>
+              <w:t>python -m pytest backend/tests -q</w:t>
             </w:r>
           </w:p>
         </w:tc>
         <w:tc>
           <w:tcPr>
-            <w:tcW w:type="dxa" w:w="3300"/>
+            <w:tcW w:type="dxa" w:w="3249"/>
             <w:vAlign w:val="center"/>
           </w:tcPr>
           <w:p>
+            <w:pPr>
+              <w:jc w:val="center"/>
+            </w:pPr>
+            <w:r/>
             <w:r>
               <w:rPr>
-                <w:sz w:val="17"/>
+                <w:rFonts w:ascii="Microsoft YaHei" w:hAnsi="Microsoft YaHei" w:eastAsia="Microsoft YaHei"/>
+                <w:b w:val="0"/>
+                <w:sz w:val="18"/>
               </w:rPr>
-              <w:t>智能问数</w:t>
-            </w:r>
-          </w:p>
-        </w:tc>
-        <w:tc>
-          <w:tcPr>
-            <w:tcW w:type="dxa" w:w="2560"/>
-            <w:vAlign w:val="center"/>
-          </w:tcPr>
-          <w:p>
-            <w:r>
-              <w:rPr>
-                <w:sz w:val="17"/>
-              </w:rPr>
-              <w:t>POST /api/chat</w:t>
+              <w:t>48 passed</w:t>
             </w:r>
           </w:p>
         </w:tc>
@@ -2134,57 +1436,61 @@
       <w:tr>
         <w:tc>
           <w:tcPr>
-            <w:tcW w:type="dxa" w:w="1200"/>
+            <w:tcW w:type="dxa" w:w="3249"/>
             <w:vAlign w:val="center"/>
           </w:tcPr>
           <w:p>
+            <w:pPr>
+              <w:jc w:val="center"/>
+            </w:pPr>
+            <w:r/>
             <w:r>
               <w:rPr>
-                <w:sz w:val="17"/>
+                <w:rFonts w:ascii="Microsoft YaHei" w:hAnsi="Microsoft YaHei" w:eastAsia="Microsoft YaHei"/>
+                <w:b w:val="0"/>
+                <w:sz w:val="18"/>
               </w:rPr>
-              <w:t>2.1-b</w:t>
+              <w:t>前端测试</w:t>
             </w:r>
           </w:p>
         </w:tc>
         <w:tc>
           <w:tcPr>
-            <w:tcW w:type="dxa" w:w="2300"/>
+            <w:tcW w:type="dxa" w:w="3249"/>
             <w:vAlign w:val="center"/>
           </w:tcPr>
           <w:p>
+            <w:pPr>
+              <w:jc w:val="left"/>
+            </w:pPr>
+            <w:r/>
             <w:r>
               <w:rPr>
-                <w:sz w:val="17"/>
+                <w:rFonts w:ascii="Microsoft YaHei" w:hAnsi="Microsoft YaHei" w:eastAsia="Microsoft YaHei"/>
+                <w:b w:val="0"/>
+                <w:sz w:val="18"/>
               </w:rPr>
-              <w:t>来源、表、字段、更新时间、置信度</w:t>
+              <w:t>npm.cmd run test:run</w:t>
             </w:r>
           </w:p>
         </w:tc>
         <w:tc>
           <w:tcPr>
-            <w:tcW w:type="dxa" w:w="3300"/>
+            <w:tcW w:type="dxa" w:w="3249"/>
             <w:vAlign w:val="center"/>
           </w:tcPr>
           <w:p>
+            <w:pPr>
+              <w:jc w:val="center"/>
+            </w:pPr>
+            <w:r/>
             <w:r>
               <w:rPr>
-                <w:sz w:val="17"/>
+                <w:rFonts w:ascii="Microsoft YaHei" w:hAnsi="Microsoft YaHei" w:eastAsia="Microsoft YaHei"/>
+                <w:b w:val="0"/>
+                <w:sz w:val="18"/>
               </w:rPr>
-              <w:t>智能问数</w:t>
-            </w:r>
-          </w:p>
-        </w:tc>
-        <w:tc>
-          <w:tcPr>
-            <w:tcW w:type="dxa" w:w="2560"/>
-            <w:vAlign w:val="center"/>
-          </w:tcPr>
-          <w:p>
-            <w:r>
-              <w:rPr>
-                <w:sz w:val="17"/>
-              </w:rPr>
-              <w:t>POST /api/chat</w:t>
+              <w:t>22 passed</w:t>
             </w:r>
           </w:p>
         </w:tc>
@@ -2192,753 +1498,61 @@
       <w:tr>
         <w:tc>
           <w:tcPr>
-            <w:tcW w:type="dxa" w:w="1200"/>
+            <w:tcW w:type="dxa" w:w="3249"/>
             <w:vAlign w:val="center"/>
           </w:tcPr>
           <w:p>
+            <w:pPr>
+              <w:jc w:val="center"/>
+            </w:pPr>
+            <w:r/>
             <w:r>
               <w:rPr>
-                <w:sz w:val="17"/>
+                <w:rFonts w:ascii="Microsoft YaHei" w:hAnsi="Microsoft YaHei" w:eastAsia="Microsoft YaHei"/>
+                <w:b w:val="0"/>
+                <w:sz w:val="18"/>
               </w:rPr>
-              <w:t>2.1-c</w:t>
+              <w:t>前端构建</w:t>
             </w:r>
           </w:p>
         </w:tc>
         <w:tc>
           <w:tcPr>
-            <w:tcW w:type="dxa" w:w="2300"/>
+            <w:tcW w:type="dxa" w:w="3249"/>
             <w:vAlign w:val="center"/>
           </w:tcPr>
           <w:p>
+            <w:pPr>
+              <w:jc w:val="left"/>
+            </w:pPr>
+            <w:r/>
             <w:r>
               <w:rPr>
-                <w:sz w:val="17"/>
+                <w:rFonts w:ascii="Microsoft YaHei" w:hAnsi="Microsoft YaHei" w:eastAsia="Microsoft YaHei"/>
+                <w:b w:val="0"/>
+                <w:sz w:val="18"/>
               </w:rPr>
-              <w:t>Skill 调用记录</w:t>
+              <w:t>npm.cmd run build</w:t>
             </w:r>
           </w:p>
         </w:tc>
         <w:tc>
           <w:tcPr>
-            <w:tcW w:type="dxa" w:w="3300"/>
+            <w:tcW w:type="dxa" w:w="3249"/>
             <w:vAlign w:val="center"/>
           </w:tcPr>
           <w:p>
+            <w:pPr>
+              <w:jc w:val="center"/>
+            </w:pPr>
+            <w:r/>
             <w:r>
               <w:rPr>
-                <w:sz w:val="17"/>
+                <w:rFonts w:ascii="Microsoft YaHei" w:hAnsi="Microsoft YaHei" w:eastAsia="Microsoft YaHei"/>
+                <w:b w:val="0"/>
+                <w:sz w:val="18"/>
               </w:rPr>
-              <w:t>智能问数</w:t>
-            </w:r>
-          </w:p>
-        </w:tc>
-        <w:tc>
-          <w:tcPr>
-            <w:tcW w:type="dxa" w:w="2560"/>
-            <w:vAlign w:val="center"/>
-          </w:tcPr>
-          <w:p>
-            <w:r>
-              <w:rPr>
-                <w:sz w:val="17"/>
-              </w:rPr>
-              <w:t>POST /api/chat</w:t>
-            </w:r>
-          </w:p>
-        </w:tc>
-      </w:tr>
-      <w:tr>
-        <w:tc>
-          <w:tcPr>
-            <w:tcW w:type="dxa" w:w="1200"/>
-            <w:vAlign w:val="center"/>
-          </w:tcPr>
-          <w:p>
-            <w:r>
-              <w:rPr>
-                <w:sz w:val="17"/>
-              </w:rPr>
-              <w:t>2.2</w:t>
-            </w:r>
-          </w:p>
-        </w:tc>
-        <w:tc>
-          <w:tcPr>
-            <w:tcW w:type="dxa" w:w="2300"/>
-            <w:vAlign w:val="center"/>
-          </w:tcPr>
-          <w:p>
-            <w:r>
-              <w:rPr>
-                <w:sz w:val="17"/>
-              </w:rPr>
-              <w:t>完整性判断和三条建议</w:t>
-            </w:r>
-          </w:p>
-        </w:tc>
-        <w:tc>
-          <w:tcPr>
-            <w:tcW w:type="dxa" w:w="3300"/>
-            <w:vAlign w:val="center"/>
-          </w:tcPr>
-          <w:p>
-            <w:r>
-              <w:rPr>
-                <w:sz w:val="17"/>
-              </w:rPr>
-              <w:t>智能问数</w:t>
-            </w:r>
-          </w:p>
-        </w:tc>
-        <w:tc>
-          <w:tcPr>
-            <w:tcW w:type="dxa" w:w="2560"/>
-            <w:vAlign w:val="center"/>
-          </w:tcPr>
-          <w:p>
-            <w:r>
-              <w:rPr>
-                <w:sz w:val="17"/>
-              </w:rPr>
-              <w:t>POST /api/chat</w:t>
-            </w:r>
-          </w:p>
-        </w:tc>
-      </w:tr>
-      <w:tr>
-        <w:tc>
-          <w:tcPr>
-            <w:tcW w:type="dxa" w:w="1200"/>
-            <w:vAlign w:val="center"/>
-          </w:tcPr>
-          <w:p>
-            <w:r>
-              <w:rPr>
-                <w:sz w:val="17"/>
-              </w:rPr>
-              <w:t>2.3</w:t>
-            </w:r>
-          </w:p>
-        </w:tc>
-        <w:tc>
-          <w:tcPr>
-            <w:tcW w:type="dxa" w:w="2300"/>
-            <w:vAlign w:val="center"/>
-          </w:tcPr>
-          <w:p>
-            <w:r>
-              <w:rPr>
-                <w:sz w:val="17"/>
-              </w:rPr>
-              <w:t>SQLite 会话上下文</w:t>
-            </w:r>
-          </w:p>
-        </w:tc>
-        <w:tc>
-          <w:tcPr>
-            <w:tcW w:type="dxa" w:w="3300"/>
-            <w:vAlign w:val="center"/>
-          </w:tcPr>
-          <w:p>
-            <w:r>
-              <w:rPr>
-                <w:sz w:val="17"/>
-              </w:rPr>
-              <w:t>智能问数</w:t>
-            </w:r>
-          </w:p>
-        </w:tc>
-        <w:tc>
-          <w:tcPr>
-            <w:tcW w:type="dxa" w:w="2560"/>
-            <w:vAlign w:val="center"/>
-          </w:tcPr>
-          <w:p>
-            <w:r>
-              <w:rPr>
-                <w:sz w:val="17"/>
-              </w:rPr>
-              <w:t>POST /api/conversations、POST /api/chat</w:t>
-            </w:r>
-          </w:p>
-        </w:tc>
-      </w:tr>
-      <w:tr>
-        <w:tc>
-          <w:tcPr>
-            <w:tcW w:type="dxa" w:w="1200"/>
-            <w:vAlign w:val="center"/>
-          </w:tcPr>
-          <w:p>
-            <w:r>
-              <w:rPr>
-                <w:sz w:val="17"/>
-              </w:rPr>
-              <w:t>2.4-a</w:t>
-            </w:r>
-          </w:p>
-        </w:tc>
-        <w:tc>
-          <w:tcPr>
-            <w:tcW w:type="dxa" w:w="2300"/>
-            <w:vAlign w:val="center"/>
-          </w:tcPr>
-          <w:p>
-            <w:r>
-              <w:rPr>
-                <w:sz w:val="17"/>
-              </w:rPr>
-              <w:t>图表规范、类型切换、加入看板</w:t>
-            </w:r>
-          </w:p>
-        </w:tc>
-        <w:tc>
-          <w:tcPr>
-            <w:tcW w:type="dxa" w:w="3300"/>
-            <w:vAlign w:val="center"/>
-          </w:tcPr>
-          <w:p>
-            <w:r>
-              <w:rPr>
-                <w:sz w:val="17"/>
-              </w:rPr>
-              <w:t>智能问数/仪表盘</w:t>
-            </w:r>
-          </w:p>
-        </w:tc>
-        <w:tc>
-          <w:tcPr>
-            <w:tcW w:type="dxa" w:w="2560"/>
-            <w:vAlign w:val="center"/>
-          </w:tcPr>
-          <w:p>
-            <w:r>
-              <w:rPr>
-                <w:sz w:val="17"/>
-              </w:rPr>
-              <w:t>POST /api/dashboards/{id}/cards</w:t>
-            </w:r>
-          </w:p>
-        </w:tc>
-      </w:tr>
-      <w:tr>
-        <w:tc>
-          <w:tcPr>
-            <w:tcW w:type="dxa" w:w="1200"/>
-            <w:vAlign w:val="center"/>
-          </w:tcPr>
-          <w:p>
-            <w:r>
-              <w:rPr>
-                <w:sz w:val="17"/>
-              </w:rPr>
-              <w:t>2.4-b</w:t>
-            </w:r>
-          </w:p>
-        </w:tc>
-        <w:tc>
-          <w:tcPr>
-            <w:tcW w:type="dxa" w:w="2300"/>
-            <w:vAlign w:val="center"/>
-          </w:tcPr>
-          <w:p>
-            <w:r>
-              <w:rPr>
-                <w:sz w:val="17"/>
-              </w:rPr>
-              <w:t>最大值、趋势、异常洞察</w:t>
-            </w:r>
-          </w:p>
-        </w:tc>
-        <w:tc>
-          <w:tcPr>
-            <w:tcW w:type="dxa" w:w="3300"/>
-            <w:vAlign w:val="center"/>
-          </w:tcPr>
-          <w:p>
-            <w:r>
-              <w:rPr>
-                <w:sz w:val="17"/>
-              </w:rPr>
-              <w:t>智能问数</w:t>
-            </w:r>
-          </w:p>
-        </w:tc>
-        <w:tc>
-          <w:tcPr>
-            <w:tcW w:type="dxa" w:w="2560"/>
-            <w:vAlign w:val="center"/>
-          </w:tcPr>
-          <w:p>
-            <w:r>
-              <w:rPr>
-                <w:sz w:val="17"/>
-              </w:rPr>
-              <w:t>GET /api/analysis/{id}</w:t>
-            </w:r>
-          </w:p>
-        </w:tc>
-      </w:tr>
-      <w:tr>
-        <w:tc>
-          <w:tcPr>
-            <w:tcW w:type="dxa" w:w="1200"/>
-            <w:vAlign w:val="center"/>
-          </w:tcPr>
-          <w:p>
-            <w:r>
-              <w:rPr>
-                <w:sz w:val="17"/>
-              </w:rPr>
-              <w:t>2.5</w:t>
-            </w:r>
-          </w:p>
-        </w:tc>
-        <w:tc>
-          <w:tcPr>
-            <w:tcW w:type="dxa" w:w="2300"/>
-            <w:vAlign w:val="center"/>
-          </w:tcPr>
-          <w:p>
-            <w:r>
-              <w:rPr>
-                <w:sz w:val="17"/>
-              </w:rPr>
-              <w:t>推荐追问</w:t>
-            </w:r>
-          </w:p>
-        </w:tc>
-        <w:tc>
-          <w:tcPr>
-            <w:tcW w:type="dxa" w:w="3300"/>
-            <w:vAlign w:val="center"/>
-          </w:tcPr>
-          <w:p>
-            <w:r>
-              <w:rPr>
-                <w:sz w:val="17"/>
-              </w:rPr>
-              <w:t>智能问数</w:t>
-            </w:r>
-          </w:p>
-        </w:tc>
-        <w:tc>
-          <w:tcPr>
-            <w:tcW w:type="dxa" w:w="2560"/>
-            <w:vAlign w:val="center"/>
-          </w:tcPr>
-          <w:p>
-            <w:r>
-              <w:rPr>
-                <w:sz w:val="17"/>
-              </w:rPr>
-              <w:t>POST /api/chat</w:t>
-            </w:r>
-          </w:p>
-        </w:tc>
-      </w:tr>
-      <w:tr>
-        <w:tc>
-          <w:tcPr>
-            <w:tcW w:type="dxa" w:w="1200"/>
-            <w:vAlign w:val="center"/>
-          </w:tcPr>
-          <w:p>
-            <w:r>
-              <w:rPr>
-                <w:sz w:val="17"/>
-              </w:rPr>
-              <w:t>2.6</w:t>
-            </w:r>
-          </w:p>
-        </w:tc>
-        <w:tc>
-          <w:tcPr>
-            <w:tcW w:type="dxa" w:w="2300"/>
-            <w:vAlign w:val="center"/>
-          </w:tcPr>
-          <w:p>
-            <w:r>
-              <w:rPr>
-                <w:sz w:val="17"/>
-              </w:rPr>
-              <w:t>卡片布局、刷新、移除、分享</w:t>
-            </w:r>
-          </w:p>
-        </w:tc>
-        <w:tc>
-          <w:tcPr>
-            <w:tcW w:type="dxa" w:w="3300"/>
-            <w:vAlign w:val="center"/>
-          </w:tcPr>
-          <w:p>
-            <w:r>
-              <w:rPr>
-                <w:sz w:val="17"/>
-              </w:rPr>
-              <w:t>我的仪表盘</w:t>
-            </w:r>
-          </w:p>
-        </w:tc>
-        <w:tc>
-          <w:tcPr>
-            <w:tcW w:type="dxa" w:w="2560"/>
-            <w:vAlign w:val="center"/>
-          </w:tcPr>
-          <w:p>
-            <w:r>
-              <w:rPr>
-                <w:sz w:val="17"/>
-              </w:rPr>
-              <w:t>/api/dashboards/*</w:t>
-            </w:r>
-          </w:p>
-        </w:tc>
-      </w:tr>
-      <w:tr>
-        <w:tc>
-          <w:tcPr>
-            <w:tcW w:type="dxa" w:w="1200"/>
-            <w:vAlign w:val="center"/>
-          </w:tcPr>
-          <w:p>
-            <w:r>
-              <w:rPr>
-                <w:sz w:val="17"/>
-              </w:rPr>
-              <w:t>3.2</w:t>
-            </w:r>
-          </w:p>
-        </w:tc>
-        <w:tc>
-          <w:tcPr>
-            <w:tcW w:type="dxa" w:w="2300"/>
-            <w:vAlign w:val="center"/>
-          </w:tcPr>
-          <w:p>
-            <w:r>
-              <w:rPr>
-                <w:sz w:val="17"/>
-              </w:rPr>
-              <w:t>指纹查重、私有优先</w:t>
-            </w:r>
-          </w:p>
-        </w:tc>
-        <w:tc>
-          <w:tcPr>
-            <w:tcW w:type="dxa" w:w="3300"/>
-            <w:vAlign w:val="center"/>
-          </w:tcPr>
-          <w:p>
-            <w:r>
-              <w:rPr>
-                <w:sz w:val="17"/>
-              </w:rPr>
-              <w:t>知识库管理</w:t>
-            </w:r>
-          </w:p>
-        </w:tc>
-        <w:tc>
-          <w:tcPr>
-            <w:tcW w:type="dxa" w:w="2560"/>
-            <w:vAlign w:val="center"/>
-          </w:tcPr>
-          <w:p>
-            <w:r>
-              <w:rPr>
-                <w:sz w:val="17"/>
-              </w:rPr>
-              <w:t>POST /api/knowledge/deduplicate</w:t>
-            </w:r>
-          </w:p>
-        </w:tc>
-      </w:tr>
-      <w:tr>
-        <w:tc>
-          <w:tcPr>
-            <w:tcW w:type="dxa" w:w="1200"/>
-            <w:vAlign w:val="center"/>
-          </w:tcPr>
-          <w:p>
-            <w:r>
-              <w:rPr>
-                <w:sz w:val="17"/>
-              </w:rPr>
-              <w:t>3.3</w:t>
-            </w:r>
-          </w:p>
-        </w:tc>
-        <w:tc>
-          <w:tcPr>
-            <w:tcW w:type="dxa" w:w="2300"/>
-            <w:vAlign w:val="center"/>
-          </w:tcPr>
-          <w:p>
-            <w:r>
-              <w:rPr>
-                <w:sz w:val="17"/>
-              </w:rPr>
-              <w:t>同步审计、删除预览与确认</w:t>
-            </w:r>
-          </w:p>
-        </w:tc>
-        <w:tc>
-          <w:tcPr>
-            <w:tcW w:type="dxa" w:w="3300"/>
-            <w:vAlign w:val="center"/>
-          </w:tcPr>
-          <w:p>
-            <w:r>
-              <w:rPr>
-                <w:sz w:val="17"/>
-              </w:rPr>
-              <w:t>知识库管理</w:t>
-            </w:r>
-          </w:p>
-        </w:tc>
-        <w:tc>
-          <w:tcPr>
-            <w:tcW w:type="dxa" w:w="2560"/>
-            <w:vAlign w:val="center"/>
-          </w:tcPr>
-          <w:p>
-            <w:r>
-              <w:rPr>
-                <w:sz w:val="17"/>
-              </w:rPr>
-              <w:t>POST /api/sync、DELETE /api/data-tables/{name}</w:t>
-            </w:r>
-          </w:p>
-        </w:tc>
-      </w:tr>
-      <w:tr>
-        <w:tc>
-          <w:tcPr>
-            <w:tcW w:type="dxa" w:w="1200"/>
-            <w:vAlign w:val="center"/>
-          </w:tcPr>
-          <w:p>
-            <w:r>
-              <w:rPr>
-                <w:sz w:val="17"/>
-              </w:rPr>
-              <w:t>3.4-a</w:t>
-            </w:r>
-          </w:p>
-        </w:tc>
-        <w:tc>
-          <w:tcPr>
-            <w:tcW w:type="dxa" w:w="2300"/>
-            <w:vAlign w:val="center"/>
-          </w:tcPr>
-          <w:p>
-            <w:r>
-              <w:rPr>
-                <w:sz w:val="17"/>
-              </w:rPr>
-              <w:t>标签与组合筛选</w:t>
-            </w:r>
-          </w:p>
-        </w:tc>
-        <w:tc>
-          <w:tcPr>
-            <w:tcW w:type="dxa" w:w="3300"/>
-            <w:vAlign w:val="center"/>
-          </w:tcPr>
-          <w:p>
-            <w:r>
-              <w:rPr>
-                <w:sz w:val="17"/>
-              </w:rPr>
-              <w:t>知识库管理</w:t>
-            </w:r>
-          </w:p>
-        </w:tc>
-        <w:tc>
-          <w:tcPr>
-            <w:tcW w:type="dxa" w:w="2560"/>
-            <w:vAlign w:val="center"/>
-          </w:tcPr>
-          <w:p>
-            <w:r>
-              <w:rPr>
-                <w:sz w:val="17"/>
-              </w:rPr>
-              <w:t>GET /api/knowledge</w:t>
-            </w:r>
-          </w:p>
-        </w:tc>
-      </w:tr>
-      <w:tr>
-        <w:tc>
-          <w:tcPr>
-            <w:tcW w:type="dxa" w:w="1200"/>
-            <w:vAlign w:val="center"/>
-          </w:tcPr>
-          <w:p>
-            <w:r>
-              <w:rPr>
-                <w:sz w:val="17"/>
-              </w:rPr>
-              <w:t>3.4-b</w:t>
-            </w:r>
-          </w:p>
-        </w:tc>
-        <w:tc>
-          <w:tcPr>
-            <w:tcW w:type="dxa" w:w="2300"/>
-            <w:vAlign w:val="center"/>
-          </w:tcPr>
-          <w:p>
-            <w:r>
-              <w:rPr>
-                <w:sz w:val="17"/>
-              </w:rPr>
-              <w:t>文本—数据表双向关系</w:t>
-            </w:r>
-          </w:p>
-        </w:tc>
-        <w:tc>
-          <w:tcPr>
-            <w:tcW w:type="dxa" w:w="3300"/>
-            <w:vAlign w:val="center"/>
-          </w:tcPr>
-          <w:p>
-            <w:r>
-              <w:rPr>
-                <w:sz w:val="17"/>
-              </w:rPr>
-              <w:t>知识库管理</w:t>
-            </w:r>
-          </w:p>
-        </w:tc>
-        <w:tc>
-          <w:tcPr>
-            <w:tcW w:type="dxa" w:w="2560"/>
-            <w:vAlign w:val="center"/>
-          </w:tcPr>
-          <w:p>
-            <w:r>
-              <w:rPr>
-                <w:sz w:val="17"/>
-              </w:rPr>
-              <w:t>GET /api/knowledge/{id}</w:t>
-            </w:r>
-          </w:p>
-        </w:tc>
-      </w:tr>
-      <w:tr>
-        <w:tc>
-          <w:tcPr>
-            <w:tcW w:type="dxa" w:w="1200"/>
-            <w:vAlign w:val="center"/>
-          </w:tcPr>
-          <w:p>
-            <w:r>
-              <w:rPr>
-                <w:sz w:val="17"/>
-              </w:rPr>
-              <w:t>3.4-c</w:t>
-            </w:r>
-          </w:p>
-        </w:tc>
-        <w:tc>
-          <w:tcPr>
-            <w:tcW w:type="dxa" w:w="2300"/>
-            <w:vAlign w:val="center"/>
-          </w:tcPr>
-          <w:p>
-            <w:r>
-              <w:rPr>
-                <w:sz w:val="17"/>
-              </w:rPr>
-              <w:t>SQL 表名抽取与结构状态</w:t>
-            </w:r>
-          </w:p>
-        </w:tc>
-        <w:tc>
-          <w:tcPr>
-            <w:tcW w:type="dxa" w:w="3300"/>
-            <w:vAlign w:val="center"/>
-          </w:tcPr>
-          <w:p>
-            <w:r>
-              <w:rPr>
-                <w:sz w:val="17"/>
-              </w:rPr>
-              <w:t>知识库管理</w:t>
-            </w:r>
-          </w:p>
-        </w:tc>
-        <w:tc>
-          <w:tcPr>
-            <w:tcW w:type="dxa" w:w="2560"/>
-            <w:vAlign w:val="center"/>
-          </w:tcPr>
-          <w:p>
-            <w:r>
-              <w:rPr>
-                <w:sz w:val="17"/>
-              </w:rPr>
-              <w:t>POST /api/knowledge</w:t>
-            </w:r>
-          </w:p>
-        </w:tc>
-      </w:tr>
-      <w:tr>
-        <w:tc>
-          <w:tcPr>
-            <w:tcW w:type="dxa" w:w="1200"/>
-            <w:vAlign w:val="center"/>
-          </w:tcPr>
-          <w:p>
-            <w:r>
-              <w:rPr>
-                <w:sz w:val="17"/>
-              </w:rPr>
-              <w:t>5</w:t>
-            </w:r>
-          </w:p>
-        </w:tc>
-        <w:tc>
-          <w:tcPr>
-            <w:tcW w:type="dxa" w:w="2300"/>
-            <w:vAlign w:val="center"/>
-          </w:tcPr>
-          <w:p>
-            <w:r>
-              <w:rPr>
-                <w:sz w:val="17"/>
-              </w:rPr>
-              <w:t>多源拆分、多 SQL、按区域汇总</w:t>
-            </w:r>
-          </w:p>
-        </w:tc>
-        <w:tc>
-          <w:tcPr>
-            <w:tcW w:type="dxa" w:w="3300"/>
-            <w:vAlign w:val="center"/>
-          </w:tcPr>
-          <w:p>
-            <w:r>
-              <w:rPr>
-                <w:sz w:val="17"/>
-              </w:rPr>
-              <w:t>智能问数</w:t>
-            </w:r>
-          </w:p>
-        </w:tc>
-        <w:tc>
-          <w:tcPr>
-            <w:tcW w:type="dxa" w:w="2560"/>
-            <w:vAlign w:val="center"/>
-          </w:tcPr>
-          <w:p>
-            <w:r>
-              <w:rPr>
-                <w:sz w:val="17"/>
-              </w:rPr>
-              <w:t>POST /api/chat</w:t>
+              <w:t>passed</w:t>
             </w:r>
           </w:p>
         </w:tc>
@@ -2946,37 +1560,154 @@
     </w:tbl>
     <w:p/>
     <w:p>
+      <w:pPr>
+        <w:pStyle w:val="Heading1"/>
+      </w:pPr>
       <w:r>
-        <w:t>逐项测试文件和具体验收动作见《需求追踪矩阵》。</w:t>
+        <w:rPr>
+          <w:rFonts w:ascii="Microsoft YaHei" w:hAnsi="Microsoft YaHei" w:eastAsia="Microsoft YaHei"/>
+          <w:color w:val="1F4E79"/>
+        </w:rPr>
+        <w:t>9. 建议演示问题</w:t>
+      </w:r>
+    </w:p>
+    <w:p>
+      <w:pPr>
+        <w:pStyle w:val="ListBullet"/>
+        <w:spacing w:after="60"/>
+      </w:pPr>
+      <w:r>
+        <w:rPr>
+          <w:rFonts w:ascii="Microsoft YaHei" w:hAnsi="Microsoft YaHei" w:eastAsia="Microsoft YaHei"/>
+          <w:sz w:val="20"/>
+        </w:rPr>
+        <w:t>分析2025年各区平均房价趋势</w:t>
+      </w:r>
+    </w:p>
+    <w:p>
+      <w:pPr>
+        <w:pStyle w:val="ListBullet"/>
+        <w:spacing w:after="60"/>
+      </w:pPr>
+      <w:r>
+        <w:rPr>
+          <w:rFonts w:ascii="Microsoft YaHei" w:hAnsi="Microsoft YaHei" w:eastAsia="Microsoft YaHei"/>
+          <w:sz w:val="20"/>
+        </w:rPr>
+        <w:t>分析2025年海淀区和朝阳区租金趋势</w:t>
+      </w:r>
+    </w:p>
+    <w:p>
+      <w:pPr>
+        <w:pStyle w:val="ListBullet"/>
+        <w:spacing w:after="60"/>
+      </w:pPr>
+      <w:r>
+        <w:rPr>
+          <w:rFonts w:ascii="Microsoft YaHei" w:hAnsi="Microsoft YaHei" w:eastAsia="Microsoft YaHei"/>
+          <w:sz w:val="20"/>
+        </w:rPr>
+        <w:t>哪个区挂牌量最高，空置率如何</w:t>
+      </w:r>
+    </w:p>
+    <w:p>
+      <w:pPr>
+        <w:pStyle w:val="ListBullet"/>
+        <w:spacing w:after="60"/>
+      </w:pPr>
+      <w:r>
+        <w:rPr>
+          <w:rFonts w:ascii="Microsoft YaHei" w:hAnsi="Microsoft YaHei" w:eastAsia="Microsoft YaHei"/>
+          <w:sz w:val="20"/>
+        </w:rPr>
+        <w:t>房价是否和地铁覆盖率、就业密度相关</w:t>
+      </w:r>
+    </w:p>
+    <w:p>
+      <w:pPr>
+        <w:pStyle w:val="ListBullet"/>
+        <w:spacing w:after="60"/>
+      </w:pPr>
+      <w:r>
+        <w:rPr>
+          <w:rFonts w:ascii="Microsoft YaHei" w:hAnsi="Microsoft YaHei" w:eastAsia="Microsoft YaHei"/>
+          <w:sz w:val="20"/>
+        </w:rPr>
+        <w:t>对比2024年和2025年各区房价变化</w:t>
+      </w:r>
+    </w:p>
+    <w:p>
+      <w:pPr>
+        <w:pStyle w:val="Heading1"/>
+      </w:pPr>
+      <w:r>
+        <w:rPr>
+          <w:rFonts w:ascii="Microsoft YaHei" w:hAnsi="Microsoft YaHei" w:eastAsia="Microsoft YaHei"/>
+          <w:color w:val="1F4E79"/>
+        </w:rPr>
+        <w:t>10. 后续可扩展方向</w:t>
+      </w:r>
+    </w:p>
+    <w:p>
+      <w:pPr>
+        <w:pStyle w:val="ListBullet"/>
+        <w:spacing w:after="60"/>
+      </w:pPr>
+      <w:r>
+        <w:rPr>
+          <w:rFonts w:ascii="Microsoft YaHei" w:hAnsi="Microsoft YaHei" w:eastAsia="Microsoft YaHei"/>
+          <w:sz w:val="20"/>
+        </w:rPr>
+        <w:t>接入真实数据源和生产级权限体系。</w:t>
+      </w:r>
+    </w:p>
+    <w:p>
+      <w:pPr>
+        <w:pStyle w:val="ListBullet"/>
+        <w:spacing w:after="60"/>
+      </w:pPr>
+      <w:r>
+        <w:rPr>
+          <w:rFonts w:ascii="Microsoft YaHei" w:hAnsi="Microsoft YaHei" w:eastAsia="Microsoft YaHei"/>
+          <w:sz w:val="20"/>
+        </w:rPr>
+        <w:t>将当前本地知识库替换为平台知识资产服务。</w:t>
+      </w:r>
+    </w:p>
+    <w:p>
+      <w:pPr>
+        <w:pStyle w:val="ListBullet"/>
+        <w:spacing w:after="60"/>
+      </w:pPr>
+      <w:r>
+        <w:rPr>
+          <w:rFonts w:ascii="Microsoft YaHei" w:hAnsi="Microsoft YaHei" w:eastAsia="Microsoft YaHei"/>
+          <w:sz w:val="20"/>
+        </w:rPr>
+        <w:t>扩展多表 Join 规划、指标口径管理和更精细的模型输出评估。</w:t>
+      </w:r>
+    </w:p>
+    <w:p>
+      <w:pPr>
+        <w:pStyle w:val="ListBullet"/>
+        <w:spacing w:after="60"/>
+      </w:pPr>
+      <w:r>
+        <w:rPr>
+          <w:rFonts w:ascii="Microsoft YaHei" w:hAnsi="Microsoft YaHei" w:eastAsia="Microsoft YaHei"/>
+          <w:sz w:val="20"/>
+        </w:rPr>
+        <w:t>增强仪表盘发布、权限控制和团队协作能力。</w:t>
       </w:r>
     </w:p>
     <w:sectPr>
-      <w:footerReference w:type="default" r:id="rId9"/>
       <w:pgSz w:w="12240" w:h="15840"/>
-      <w:pgMar w:top="1224" w:right="1296" w:bottom="1080" w:left="1296" w:header="720" w:footer="720" w:gutter="0"/>
+      <w:pgMar w:top="1134" w:right="1247" w:bottom="1134" w:left="1247" w:header="720" w:footer="720" w:gutter="0"/>
       <w:cols w:space="720"/>
       <w:docGrid w:linePitch="360"/>
     </w:sectPr>
   </w:body>
 </w:document>
-</file>
-
-<file path=word/footer1.xml><?xml version="1.0" encoding="utf-8"?>
-<w:ftr xmlns:m="http://schemas.openxmlformats.org/officeDocument/2006/math" xmlns:mc="http://schemas.openxmlformats.org/markup-compatibility/2006" xmlns:mo="http://schemas.microsoft.com/office/mac/office/2008/main" xmlns:mv="urn:schemas-microsoft-com:mac:vml" xmlns:o="urn:schemas-microsoft-com:office:office" xmlns:r="http://schemas.openxmlformats.org/officeDocument/2006/relationships" xmlns:v="urn:schemas-microsoft-com:vml" xmlns:w10="urn:schemas-microsoft-com:office:word" xmlns:w14="http://schemas.microsoft.com/office/word/2010/wordml" xmlns:w="http://schemas.openxmlformats.org/wordprocessingml/2006/main" xmlns:wne="http://schemas.microsoft.com/office/word/2006/wordml" xmlns:wp14="http://schemas.microsoft.com/office/word/2010/wordprocessingDrawing" xmlns:wp="http://schemas.openxmlformats.org/drawingml/2006/wordprocessingDrawing" xmlns:wpc="http://schemas.microsoft.com/office/word/2010/wordprocessingCanvas" xmlns:wpg="http://schemas.microsoft.com/office/word/2010/wordprocessingGroup" xmlns:wpi="http://schemas.microsoft.com/office/word/2010/wordprocessingInk" xmlns:wps="http://schemas.microsoft.com/office/word/2010/wordprocessingShape" mc:Ignorable="w14 wp14">
-  <w:p>
-    <w:pPr>
-      <w:pStyle w:val="Footer"/>
-      <w:jc w:val="center"/>
-    </w:pPr>
-    <w:r>
-      <w:rPr>
-        <w:color w:val="667085"/>
-        <w:sz w:val="16"/>
-      </w:rPr>
-      <w:t>GeniusQ DaaS Platform Intelligent Query Demo</w:t>
-    </w:r>
-  </w:p>
-</w:ftr>
 </file>
 
 <file path=word/numbering.xml><?xml version="1.0" encoding="utf-8"?>
@@ -3342,11 +2073,8 @@
     <w:name w:val="Normal"/>
     <w:qFormat/>
     <w:rsid w:val="00FC693F"/>
-    <w:pPr>
-      <w:spacing w:after="120" w:line="269" w:lineRule="auto"/>
-    </w:pPr>
     <w:rPr>
-      <w:rFonts w:ascii="Calibri" w:hAnsi="Calibri" w:eastAsia="Microsoft YaHei"/>
+      <w:rFonts w:ascii="Microsoft YaHei" w:hAnsi="Microsoft YaHei" w:eastAsia="Microsoft YaHei"/>
       <w:sz w:val="21"/>
     </w:rPr>
   </w:style>
@@ -3405,15 +2133,15 @@
     <w:pPr>
       <w:keepNext/>
       <w:keepLines/>
-      <w:spacing w:before="280" w:after="140"/>
+      <w:spacing w:before="480" w:after="0"/>
       <w:outlineLvl w:val="0"/>
     </w:pPr>
     <w:rPr>
-      <w:rFonts w:asciiTheme="majorHAnsi" w:eastAsiaTheme="majorEastAsia" w:hAnsiTheme="majorHAnsi" w:cstheme="majorBidi" w:ascii="Calibri" w:hAnsi="Calibri" w:eastAsia="Microsoft YaHei"/>
+      <w:rFonts w:asciiTheme="majorHAnsi" w:eastAsiaTheme="majorEastAsia" w:hAnsiTheme="majorHAnsi" w:cstheme="majorBidi"/>
       <w:b/>
       <w:bCs/>
-      <w:color w:val="2E74B5"/>
-      <w:sz w:val="32"/>
+      <w:color w:val="365F91" w:themeColor="accent1" w:themeShade="BF"/>
+      <w:sz w:val="28"/>
       <w:szCs w:val="28"/>
     </w:rPr>
   </w:style>
@@ -3429,14 +2157,14 @@
     <w:pPr>
       <w:keepNext/>
       <w:keepLines/>
-      <w:spacing w:before="200" w:after="100"/>
+      <w:spacing w:before="200" w:after="0"/>
       <w:outlineLvl w:val="1"/>
     </w:pPr>
     <w:rPr>
-      <w:rFonts w:asciiTheme="majorHAnsi" w:eastAsiaTheme="majorEastAsia" w:hAnsiTheme="majorHAnsi" w:cstheme="majorBidi" w:ascii="Calibri" w:hAnsi="Calibri" w:eastAsia="Microsoft YaHei"/>
+      <w:rFonts w:asciiTheme="majorHAnsi" w:eastAsiaTheme="majorEastAsia" w:hAnsiTheme="majorHAnsi" w:cstheme="majorBidi"/>
       <w:b/>
       <w:bCs/>
-      <w:color w:val="2E74B5"/>
+      <w:color w:val="4F81BD" w:themeColor="accent1"/>
       <w:sz w:val="26"/>
       <w:szCs w:val="26"/>
     </w:rPr>
@@ -3453,15 +2181,14 @@
     <w:pPr>
       <w:keepNext/>
       <w:keepLines/>
-      <w:spacing w:before="160" w:after="80"/>
+      <w:spacing w:before="200" w:after="0"/>
       <w:outlineLvl w:val="2"/>
     </w:pPr>
     <w:rPr>
-      <w:rFonts w:asciiTheme="majorHAnsi" w:eastAsiaTheme="majorEastAsia" w:hAnsiTheme="majorHAnsi" w:cstheme="majorBidi" w:ascii="Calibri" w:hAnsi="Calibri" w:eastAsia="Microsoft YaHei"/>
+      <w:rFonts w:asciiTheme="majorHAnsi" w:eastAsiaTheme="majorEastAsia" w:hAnsiTheme="majorHAnsi" w:cstheme="majorBidi"/>
       <w:b/>
       <w:bCs/>
-      <w:color w:val="1F4D78"/>
-      <w:sz w:val="23"/>
+      <w:color w:val="4F81BD" w:themeColor="accent1"/>
     </w:rPr>
   </w:style>
   <w:style w:type="paragraph" w:styleId="Heading4">

</xml_diff>

<commit_message>
docs: refresh delivery docs and add static site demo
</commit_message>
<xml_diff>
--- a/docs/智能问数优化实施计划书.docx
+++ b/docs/智能问数优化实施计划书.docx
@@ -4,247 +4,95 @@
   <w:body>
     <w:p>
       <w:pPr>
+        <w:spacing w:before="1200" w:after="160" w:line="264" w:lineRule="auto"/>
         <w:jc w:val="center"/>
       </w:pPr>
       <w:r>
         <w:rPr>
-          <w:rFonts w:ascii="Microsoft YaHei" w:hAnsi="Microsoft YaHei" w:eastAsia="Microsoft YaHei"/>
+          <w:rFonts w:ascii="Calibri" w:hAnsi="Calibri" w:eastAsia="Microsoft YaHei"/>
           <w:b/>
-          <w:color w:val="1F4E79"/>
-          <w:sz w:val="44"/>
+          <w:color w:val="0B2545"/>
+          <w:sz w:val="48"/>
         </w:rPr>
-        <w:t>GeniusQ DaaS 智能问数 Demo 阶段交付说明</w:t>
+        <w:t>GeniusQ DaaS 智能问数 Demo</w:t>
       </w:r>
     </w:p>
     <w:p>
       <w:pPr>
+        <w:spacing w:before="0" w:after="440" w:line="264" w:lineRule="auto"/>
         <w:jc w:val="center"/>
       </w:pPr>
       <w:r>
         <w:rPr>
-          <w:rFonts w:ascii="Microsoft YaHei" w:hAnsi="Microsoft YaHei" w:eastAsia="Microsoft YaHei"/>
-          <w:color w:val="595959"/>
-          <w:sz w:val="20"/>
+          <w:rFonts w:ascii="Calibri" w:hAnsi="Calibri" w:eastAsia="Microsoft YaHei"/>
+          <w:b/>
+          <w:color w:val="2563A6"/>
+          <w:sz w:val="40"/>
         </w:rPr>
-        <w:t>版本：V1.1｜阶段状态：已完成本地演示版｜更新日期：2026-07-16</w:t>
-      </w:r>
-    </w:p>
-    <w:p>
-      <w:pPr>
-        <w:pStyle w:val="Heading1"/>
-      </w:pPr>
-      <w:r>
-        <w:rPr>
-          <w:rFonts w:ascii="Microsoft YaHei" w:hAnsi="Microsoft YaHei" w:eastAsia="Microsoft YaHei"/>
-          <w:color w:val="1F4E79"/>
-        </w:rPr>
-        <w:t>1. 项目概述</w:t>
-      </w:r>
-    </w:p>
-    <w:p>
-      <w:pPr>
-        <w:spacing w:after="120" w:line="283" w:lineRule="auto"/>
-      </w:pPr>
-      <w:r>
-        <w:rPr>
-          <w:rFonts w:ascii="Microsoft YaHei" w:hAnsi="Microsoft YaHei" w:eastAsia="Microsoft YaHei"/>
-          <w:sz w:val="21"/>
-        </w:rPr>
-        <w:t>本项目是一个可在 Windows 本地运行的智能问数全栈演示 Demo，用于展示企业数据平台中从自然语言问题到 SQL 查询、图表分析、知识增强和仪表盘沉淀的完整链路。项目不连接生产数据，所有业务数据均来自本地 SQLite 演示库，可用于产品展示、技术可行性验证和后续平台集成前的原型说明。</w:t>
-      </w:r>
-    </w:p>
-    <w:p>
-      <w:pPr>
-        <w:pStyle w:val="Heading1"/>
-      </w:pPr>
-      <w:r>
-        <w:rPr>
-          <w:rFonts w:ascii="Microsoft YaHei" w:hAnsi="Microsoft YaHei" w:eastAsia="Microsoft YaHei"/>
-          <w:color w:val="1F4E79"/>
-        </w:rPr>
-        <w:t>2. 当前阶段完成内容</w:t>
-      </w:r>
-    </w:p>
-    <w:p>
-      <w:pPr>
-        <w:pStyle w:val="ListBullet"/>
-        <w:spacing w:after="60"/>
-      </w:pPr>
-      <w:r>
-        <w:rPr>
-          <w:rFonts w:ascii="Microsoft YaHei" w:hAnsi="Microsoft YaHei" w:eastAsia="Microsoft YaHei"/>
-          <w:sz w:val="20"/>
-        </w:rPr>
-        <w:t>完成 FastAPI + React/Vite + SQLite 的本地全栈演示环境，并提供一键启动脚本。</w:t>
-      </w:r>
-    </w:p>
-    <w:p>
-      <w:pPr>
-        <w:pStyle w:val="ListBullet"/>
-        <w:spacing w:after="60"/>
-      </w:pPr>
-      <w:r>
-        <w:rPr>
-          <w:rFonts w:ascii="Microsoft YaHei" w:hAnsi="Microsoft YaHei" w:eastAsia="Microsoft YaHei"/>
-          <w:sz w:val="20"/>
-        </w:rPr>
-        <w:t>完成 DeepSeek Text-to-SQL 接入，同时保留离线规则引擎作为兜底模式。</w:t>
-      </w:r>
-    </w:p>
-    <w:p>
-      <w:pPr>
-        <w:pStyle w:val="ListBullet"/>
-        <w:spacing w:after="60"/>
-      </w:pPr>
-      <w:r>
-        <w:rPr>
-          <w:rFonts w:ascii="Microsoft YaHei" w:hAnsi="Microsoft YaHei" w:eastAsia="Microsoft YaHei"/>
-          <w:sz w:val="20"/>
-        </w:rPr>
-        <w:t>完成知识检索增强：生成 SQL 前会检索私有/公共知识、SQL 示例和可用数据表结构。</w:t>
-      </w:r>
-    </w:p>
-    <w:p>
-      <w:pPr>
-        <w:pStyle w:val="ListBullet"/>
-        <w:spacing w:after="60"/>
-      </w:pPr>
-      <w:r>
-        <w:rPr>
-          <w:rFonts w:ascii="Microsoft YaHei" w:hAnsi="Microsoft YaHei" w:eastAsia="Microsoft YaHei"/>
-          <w:sz w:val="20"/>
-        </w:rPr>
-        <w:t>完成只读 SQL 安全校验：限制单条 SELECT/WITH、授权表访问和最大返回行数。</w:t>
-      </w:r>
-    </w:p>
-    <w:p>
-      <w:pPr>
-        <w:pStyle w:val="ListBullet"/>
-        <w:spacing w:after="60"/>
-      </w:pPr>
-      <w:r>
-        <w:rPr>
-          <w:rFonts w:ascii="Microsoft YaHei" w:hAnsi="Microsoft YaHei" w:eastAsia="Microsoft YaHei"/>
-          <w:sz w:val="20"/>
-        </w:rPr>
-        <w:t>完成逐步思考过程展示：分析过程中按步骤显示当前圆圈加载、完成后延伸到下一步骤。</w:t>
-      </w:r>
-    </w:p>
-    <w:p>
-      <w:pPr>
-        <w:pStyle w:val="ListBullet"/>
-        <w:spacing w:after="60"/>
-      </w:pPr>
-      <w:r>
-        <w:rPr>
-          <w:rFonts w:ascii="Microsoft YaHei" w:hAnsi="Microsoft YaHei" w:eastAsia="Microsoft YaHei"/>
-          <w:sz w:val="20"/>
-        </w:rPr>
-        <w:t>完成简单问题推荐和结果后续追问推荐：每次推荐 3 个，并基于对话历史去重。</w:t>
-      </w:r>
-    </w:p>
-    <w:p>
-      <w:pPr>
-        <w:pStyle w:val="ListBullet"/>
-        <w:spacing w:after="60"/>
-      </w:pPr>
-      <w:r>
-        <w:rPr>
-          <w:rFonts w:ascii="Microsoft YaHei" w:hAnsi="Microsoft YaHei" w:eastAsia="Microsoft YaHei"/>
-          <w:sz w:val="20"/>
-        </w:rPr>
-        <w:t>完成图表可靠性修复：模型返回的图表字段若与 SQL 结果不一致，后端会自动按实际字段重建图表。</w:t>
-      </w:r>
-    </w:p>
-    <w:p>
-      <w:pPr>
-        <w:pStyle w:val="ListBullet"/>
-        <w:spacing w:after="60"/>
-      </w:pPr>
-      <w:r>
-        <w:rPr>
-          <w:rFonts w:ascii="Microsoft YaHei" w:hAnsi="Microsoft YaHei" w:eastAsia="Microsoft YaHei"/>
-          <w:sz w:val="20"/>
-        </w:rPr>
-        <w:t>完成页面级 DeepSeek API Key 配置入口，Key 仅在本次本地后端运行时生效，不写入仓库。</w:t>
-      </w:r>
-    </w:p>
-    <w:p>
-      <w:pPr>
-        <w:pStyle w:val="ListBullet"/>
-        <w:spacing w:after="60"/>
-      </w:pPr>
-      <w:r>
-        <w:rPr>
-          <w:rFonts w:ascii="Microsoft YaHei" w:hAnsi="Microsoft YaHei" w:eastAsia="Microsoft YaHei"/>
-          <w:sz w:val="20"/>
-        </w:rPr>
-        <w:t>完成仪表盘两列布局、卡片拖拽排序、空白落点占位框、图表保存和本地只读分享。</w:t>
-      </w:r>
-    </w:p>
-    <w:p>
-      <w:pPr>
-        <w:pStyle w:val="Heading1"/>
-      </w:pPr>
-      <w:r>
-        <w:rPr>
-          <w:rFonts w:ascii="Microsoft YaHei" w:hAnsi="Microsoft YaHei" w:eastAsia="Microsoft YaHei"/>
-          <w:color w:val="1F4E79"/>
-        </w:rPr>
-        <w:t>3. 运行逻辑</w:t>
+        <w:t>实施计划书</w:t>
       </w:r>
     </w:p>
     <w:tbl>
       <w:tblPr>
-        <w:tblStyle w:val="TableGrid"/>
         <w:tblW w:type="auto" w:w="0"/>
-        <w:jc w:val="center"/>
+        <w:tblLayout w:type="fixed"/>
         <w:tblLook w:firstColumn="1" w:firstRow="1" w:lastColumn="0" w:lastRow="0" w:noHBand="0" w:noVBand="1" w:val="04A0"/>
       </w:tblPr>
       <w:tblGrid>
-        <w:gridCol w:w="4873"/>
-        <w:gridCol w:w="4873"/>
+        <w:gridCol w:w="4824"/>
+        <w:gridCol w:w="4824"/>
       </w:tblGrid>
       <w:tr>
         <w:tc>
           <w:tcPr>
-            <w:tcW w:type="dxa" w:w="4873"/>
-            <w:shd w:fill="D9EAF7"/>
-            <w:vAlign w:val="center"/>
+            <w:tcW w:type="dxa" w:w="2304"/>
+            <w:tcBorders>
+              <w:top w:val="single" w:sz="4" w:space="0" w:color="D9E2EC"/>
+              <w:left w:val="single" w:sz="4" w:space="0" w:color="D9E2EC"/>
+              <w:bottom w:val="single" w:sz="4" w:space="0" w:color="D9E2EC"/>
+              <w:right w:val="single" w:sz="4" w:space="0" w:color="D9E2EC"/>
+            </w:tcBorders>
+            <w:shd w:fill="F2F4F7"/>
           </w:tcPr>
           <w:p>
             <w:pPr>
-              <w:jc w:val="center"/>
+              <w:spacing w:before="0" w:after="0" w:line="264" w:lineRule="auto"/>
+              <w:jc w:val="left"/>
             </w:pPr>
-            <w:r/>
             <w:r>
               <w:rPr>
-                <w:rFonts w:ascii="Microsoft YaHei" w:hAnsi="Microsoft YaHei" w:eastAsia="Microsoft YaHei"/>
+                <w:rFonts w:ascii="Calibri" w:hAnsi="Calibri" w:eastAsia="Microsoft YaHei"/>
                 <w:b/>
-                <w:sz w:val="18"/>
+                <w:color w:val="1F2937"/>
+                <w:sz w:val="21"/>
               </w:rPr>
-              <w:t>阶段</w:t>
+              <w:t>文档版本</w:t>
             </w:r>
           </w:p>
         </w:tc>
         <w:tc>
           <w:tcPr>
-            <w:tcW w:type="dxa" w:w="4873"/>
-            <w:shd w:fill="D9EAF7"/>
-            <w:vAlign w:val="center"/>
+            <w:tcW w:type="dxa" w:w="6336"/>
+            <w:tcBorders>
+              <w:top w:val="single" w:sz="4" w:space="0" w:color="D9E2EC"/>
+              <w:left w:val="single" w:sz="4" w:space="0" w:color="D9E2EC"/>
+              <w:bottom w:val="single" w:sz="4" w:space="0" w:color="D9E2EC"/>
+              <w:right w:val="single" w:sz="4" w:space="0" w:color="D9E2EC"/>
+            </w:tcBorders>
           </w:tcPr>
           <w:p>
             <w:pPr>
-              <w:jc w:val="center"/>
+              <w:spacing w:before="0" w:after="0" w:line="264" w:lineRule="auto"/>
+              <w:jc w:val="left"/>
             </w:pPr>
-            <w:r/>
             <w:r>
               <w:rPr>
-                <w:rFonts w:ascii="Microsoft YaHei" w:hAnsi="Microsoft YaHei" w:eastAsia="Microsoft YaHei"/>
-                <w:b/>
-                <w:sz w:val="18"/>
+                <w:rFonts w:ascii="Calibri" w:hAnsi="Calibri" w:eastAsia="Microsoft YaHei"/>
+                <w:b w:val="0"/>
+                <w:color w:val="1F2937"/>
+                <w:sz w:val="21"/>
               </w:rPr>
-              <w:t>说明</w:t>
+              <w:t>V2.0</w:t>
             </w:r>
           </w:p>
         </w:tc>
@@ -252,41 +100,54 @@
       <w:tr>
         <w:tc>
           <w:tcPr>
-            <w:tcW w:type="dxa" w:w="4873"/>
-            <w:vAlign w:val="center"/>
+            <w:tcW w:type="dxa" w:w="2304"/>
+            <w:tcBorders>
+              <w:top w:val="single" w:sz="4" w:space="0" w:color="D9E2EC"/>
+              <w:left w:val="single" w:sz="4" w:space="0" w:color="D9E2EC"/>
+              <w:bottom w:val="single" w:sz="4" w:space="0" w:color="D9E2EC"/>
+              <w:right w:val="single" w:sz="4" w:space="0" w:color="D9E2EC"/>
+            </w:tcBorders>
+            <w:shd w:fill="F2F4F7"/>
           </w:tcPr>
           <w:p>
             <w:pPr>
-              <w:jc w:val="center"/>
+              <w:spacing w:before="0" w:after="0" w:line="264" w:lineRule="auto"/>
+              <w:jc w:val="left"/>
             </w:pPr>
-            <w:r/>
             <w:r>
               <w:rPr>
-                <w:rFonts w:ascii="Microsoft YaHei" w:hAnsi="Microsoft YaHei" w:eastAsia="Microsoft YaHei"/>
-                <w:b w:val="0"/>
-                <w:sz w:val="18"/>
+                <w:rFonts w:ascii="Calibri" w:hAnsi="Calibri" w:eastAsia="Microsoft YaHei"/>
+                <w:b/>
+                <w:color w:val="1F2937"/>
+                <w:sz w:val="21"/>
               </w:rPr>
-              <w:t>用户提问</w:t>
+              <w:t>更新日期</w:t>
             </w:r>
           </w:p>
         </w:tc>
         <w:tc>
           <w:tcPr>
-            <w:tcW w:type="dxa" w:w="4873"/>
-            <w:vAlign w:val="center"/>
+            <w:tcW w:type="dxa" w:w="6336"/>
+            <w:tcBorders>
+              <w:top w:val="single" w:sz="4" w:space="0" w:color="D9E2EC"/>
+              <w:left w:val="single" w:sz="4" w:space="0" w:color="D9E2EC"/>
+              <w:bottom w:val="single" w:sz="4" w:space="0" w:color="D9E2EC"/>
+              <w:right w:val="single" w:sz="4" w:space="0" w:color="D9E2EC"/>
+            </w:tcBorders>
           </w:tcPr>
           <w:p>
             <w:pPr>
+              <w:spacing w:before="0" w:after="0" w:line="264" w:lineRule="auto"/>
               <w:jc w:val="left"/>
             </w:pPr>
-            <w:r/>
             <w:r>
               <w:rPr>
-                <w:rFonts w:ascii="Microsoft YaHei" w:hAnsi="Microsoft YaHei" w:eastAsia="Microsoft YaHei"/>
+                <w:rFonts w:ascii="Calibri" w:hAnsi="Calibri" w:eastAsia="Microsoft YaHei"/>
                 <w:b w:val="0"/>
-                <w:sz w:val="18"/>
+                <w:color w:val="1F2937"/>
+                <w:sz w:val="21"/>
               </w:rPr>
-              <w:t>前端提交自然语言问题，并记录当前会话 ID。</w:t>
+              <w:t>2026-07-20</w:t>
             </w:r>
           </w:p>
         </w:tc>
@@ -294,41 +155,54 @@
       <w:tr>
         <w:tc>
           <w:tcPr>
-            <w:tcW w:type="dxa" w:w="4873"/>
-            <w:vAlign w:val="center"/>
+            <w:tcW w:type="dxa" w:w="2304"/>
+            <w:tcBorders>
+              <w:top w:val="single" w:sz="4" w:space="0" w:color="D9E2EC"/>
+              <w:left w:val="single" w:sz="4" w:space="0" w:color="D9E2EC"/>
+              <w:bottom w:val="single" w:sz="4" w:space="0" w:color="D9E2EC"/>
+              <w:right w:val="single" w:sz="4" w:space="0" w:color="D9E2EC"/>
+            </w:tcBorders>
+            <w:shd w:fill="F2F4F7"/>
           </w:tcPr>
           <w:p>
             <w:pPr>
-              <w:jc w:val="center"/>
+              <w:spacing w:before="0" w:after="0" w:line="264" w:lineRule="auto"/>
+              <w:jc w:val="left"/>
             </w:pPr>
-            <w:r/>
             <w:r>
               <w:rPr>
-                <w:rFonts w:ascii="Microsoft YaHei" w:hAnsi="Microsoft YaHei" w:eastAsia="Microsoft YaHei"/>
-                <w:b w:val="0"/>
-                <w:sz w:val="18"/>
+                <w:rFonts w:ascii="Calibri" w:hAnsi="Calibri" w:eastAsia="Microsoft YaHei"/>
+                <w:b/>
+                <w:color w:val="1F2937"/>
+                <w:sz w:val="21"/>
               </w:rPr>
-              <w:t>上下文合并</w:t>
+              <w:t>适用范围</w:t>
             </w:r>
           </w:p>
         </w:tc>
         <w:tc>
           <w:tcPr>
-            <w:tcW w:type="dxa" w:w="4873"/>
-            <w:vAlign w:val="center"/>
+            <w:tcW w:type="dxa" w:w="6336"/>
+            <w:tcBorders>
+              <w:top w:val="single" w:sz="4" w:space="0" w:color="D9E2EC"/>
+              <w:left w:val="single" w:sz="4" w:space="0" w:color="D9E2EC"/>
+              <w:bottom w:val="single" w:sz="4" w:space="0" w:color="D9E2EC"/>
+              <w:right w:val="single" w:sz="4" w:space="0" w:color="D9E2EC"/>
+            </w:tcBorders>
           </w:tcPr>
           <w:p>
             <w:pPr>
+              <w:spacing w:before="0" w:after="0" w:line="264" w:lineRule="auto"/>
               <w:jc w:val="left"/>
             </w:pPr>
-            <w:r/>
             <w:r>
               <w:rPr>
-                <w:rFonts w:ascii="Microsoft YaHei" w:hAnsi="Microsoft YaHei" w:eastAsia="Microsoft YaHei"/>
+                <w:rFonts w:ascii="Calibri" w:hAnsi="Calibri" w:eastAsia="Microsoft YaHei"/>
                 <w:b w:val="0"/>
-                <w:sz w:val="18"/>
+                <w:color w:val="1F2937"/>
+                <w:sz w:val="21"/>
               </w:rPr>
-              <w:t>后端读取历史会话，合并年份、区域、指标等上下文；本轮显式输入优先。</w:t>
+              <w:t>本地 Demo 演示、实习项目交付、后续平台化开发参考</w:t>
             </w:r>
           </w:p>
         </w:tc>
@@ -336,251 +210,54 @@
       <w:tr>
         <w:tc>
           <w:tcPr>
-            <w:tcW w:type="dxa" w:w="4873"/>
-            <w:vAlign w:val="center"/>
+            <w:tcW w:type="dxa" w:w="2304"/>
+            <w:tcBorders>
+              <w:top w:val="single" w:sz="4" w:space="0" w:color="D9E2EC"/>
+              <w:left w:val="single" w:sz="4" w:space="0" w:color="D9E2EC"/>
+              <w:bottom w:val="single" w:sz="4" w:space="0" w:color="D9E2EC"/>
+              <w:right w:val="single" w:sz="4" w:space="0" w:color="D9E2EC"/>
+            </w:tcBorders>
+            <w:shd w:fill="F2F4F7"/>
           </w:tcPr>
           <w:p>
             <w:pPr>
-              <w:jc w:val="center"/>
+              <w:spacing w:before="0" w:after="0" w:line="264" w:lineRule="auto"/>
+              <w:jc w:val="left"/>
             </w:pPr>
-            <w:r/>
             <w:r>
               <w:rPr>
-                <w:rFonts w:ascii="Microsoft YaHei" w:hAnsi="Microsoft YaHei" w:eastAsia="Microsoft YaHei"/>
-                <w:b w:val="0"/>
-                <w:sz w:val="18"/>
+                <w:rFonts w:ascii="Calibri" w:hAnsi="Calibri" w:eastAsia="Microsoft YaHei"/>
+                <w:b/>
+                <w:color w:val="1F2937"/>
+                <w:sz w:val="21"/>
               </w:rPr>
-              <w:t>知识检索</w:t>
+              <w:t>项目定位</w:t>
             </w:r>
           </w:p>
         </w:tc>
         <w:tc>
           <w:tcPr>
-            <w:tcW w:type="dxa" w:w="4873"/>
-            <w:vAlign w:val="center"/>
+            <w:tcW w:type="dxa" w:w="6336"/>
+            <w:tcBorders>
+              <w:top w:val="single" w:sz="4" w:space="0" w:color="D9E2EC"/>
+              <w:left w:val="single" w:sz="4" w:space="0" w:color="D9E2EC"/>
+              <w:bottom w:val="single" w:sz="4" w:space="0" w:color="D9E2EC"/>
+              <w:right w:val="single" w:sz="4" w:space="0" w:color="D9E2EC"/>
+            </w:tcBorders>
           </w:tcPr>
           <w:p>
             <w:pPr>
+              <w:spacing w:before="0" w:after="0" w:line="264" w:lineRule="auto"/>
               <w:jc w:val="left"/>
             </w:pPr>
-            <w:r/>
             <w:r>
               <w:rPr>
-                <w:rFonts w:ascii="Microsoft YaHei" w:hAnsi="Microsoft YaHei" w:eastAsia="Microsoft YaHei"/>
+                <w:rFonts w:ascii="Calibri" w:hAnsi="Calibri" w:eastAsia="Microsoft YaHei"/>
                 <w:b w:val="0"/>
-                <w:sz w:val="18"/>
+                <w:color w:val="1F2937"/>
+                <w:sz w:val="21"/>
               </w:rPr>
-              <w:t>从知识库中检索相关口径、SQL 示例和数据表说明，优先使用私有知识。</w:t>
-            </w:r>
-          </w:p>
-        </w:tc>
-      </w:tr>
-      <w:tr>
-        <w:tc>
-          <w:tcPr>
-            <w:tcW w:type="dxa" w:w="4873"/>
-            <w:vAlign w:val="center"/>
-          </w:tcPr>
-          <w:p>
-            <w:pPr>
-              <w:jc w:val="center"/>
-            </w:pPr>
-            <w:r/>
-            <w:r>
-              <w:rPr>
-                <w:rFonts w:ascii="Microsoft YaHei" w:hAnsi="Microsoft YaHei" w:eastAsia="Microsoft YaHei"/>
-                <w:b w:val="0"/>
-                <w:sz w:val="18"/>
-              </w:rPr>
-              <w:t>Text-to-SQL</w:t>
-            </w:r>
-          </w:p>
-        </w:tc>
-        <w:tc>
-          <w:tcPr>
-            <w:tcW w:type="dxa" w:w="4873"/>
-            <w:vAlign w:val="center"/>
-          </w:tcPr>
-          <w:p>
-            <w:pPr>
-              <w:jc w:val="left"/>
-            </w:pPr>
-            <w:r/>
-            <w:r>
-              <w:rPr>
-                <w:rFonts w:ascii="Microsoft YaHei" w:hAnsi="Microsoft YaHei" w:eastAsia="Microsoft YaHei"/>
-                <w:b w:val="0"/>
-                <w:sz w:val="18"/>
-              </w:rPr>
-              <w:t>DeepSeek 根据问题、上下文和检索结果生成候选 SQL 与图表建议；离线模式使用规则引擎。</w:t>
-            </w:r>
-          </w:p>
-        </w:tc>
-      </w:tr>
-      <w:tr>
-        <w:tc>
-          <w:tcPr>
-            <w:tcW w:type="dxa" w:w="4873"/>
-            <w:vAlign w:val="center"/>
-          </w:tcPr>
-          <w:p>
-            <w:pPr>
-              <w:jc w:val="center"/>
-            </w:pPr>
-            <w:r/>
-            <w:r>
-              <w:rPr>
-                <w:rFonts w:ascii="Microsoft YaHei" w:hAnsi="Microsoft YaHei" w:eastAsia="Microsoft YaHei"/>
-                <w:b w:val="0"/>
-                <w:sz w:val="18"/>
-              </w:rPr>
-              <w:t>SQL 安全校验</w:t>
-            </w:r>
-          </w:p>
-        </w:tc>
-        <w:tc>
-          <w:tcPr>
-            <w:tcW w:type="dxa" w:w="4873"/>
-            <w:vAlign w:val="center"/>
-          </w:tcPr>
-          <w:p>
-            <w:pPr>
-              <w:jc w:val="left"/>
-            </w:pPr>
-            <w:r/>
-            <w:r>
-              <w:rPr>
-                <w:rFonts w:ascii="Microsoft YaHei" w:hAnsi="Microsoft YaHei" w:eastAsia="Microsoft YaHei"/>
-                <w:b w:val="0"/>
-                <w:sz w:val="18"/>
-              </w:rPr>
-              <w:t>后端校验只读、单语句、授权表和行数限制，通过后才查询 SQLite。</w:t>
-            </w:r>
-          </w:p>
-        </w:tc>
-      </w:tr>
-      <w:tr>
-        <w:tc>
-          <w:tcPr>
-            <w:tcW w:type="dxa" w:w="4873"/>
-            <w:vAlign w:val="center"/>
-          </w:tcPr>
-          <w:p>
-            <w:pPr>
-              <w:jc w:val="center"/>
-            </w:pPr>
-            <w:r/>
-            <w:r>
-              <w:rPr>
-                <w:rFonts w:ascii="Microsoft YaHei" w:hAnsi="Microsoft YaHei" w:eastAsia="Microsoft YaHei"/>
-                <w:b w:val="0"/>
-                <w:sz w:val="18"/>
-              </w:rPr>
-              <w:t>图表修复</w:t>
-            </w:r>
-          </w:p>
-        </w:tc>
-        <w:tc>
-          <w:tcPr>
-            <w:tcW w:type="dxa" w:w="4873"/>
-            <w:vAlign w:val="center"/>
-          </w:tcPr>
-          <w:p>
-            <w:pPr>
-              <w:jc w:val="left"/>
-            </w:pPr>
-            <w:r/>
-            <w:r>
-              <w:rPr>
-                <w:rFonts w:ascii="Microsoft YaHei" w:hAnsi="Microsoft YaHei" w:eastAsia="Microsoft YaHei"/>
-                <w:b w:val="0"/>
-                <w:sz w:val="18"/>
-              </w:rPr>
-              <w:t>后端校验图表字段是否存在于 SQL 结果；不一致时按实际字段和问题关键词重建图表。</w:t>
-            </w:r>
-          </w:p>
-        </w:tc>
-      </w:tr>
-      <w:tr>
-        <w:tc>
-          <w:tcPr>
-            <w:tcW w:type="dxa" w:w="4873"/>
-            <w:vAlign w:val="center"/>
-          </w:tcPr>
-          <w:p>
-            <w:pPr>
-              <w:jc w:val="center"/>
-            </w:pPr>
-            <w:r/>
-            <w:r>
-              <w:rPr>
-                <w:rFonts w:ascii="Microsoft YaHei" w:hAnsi="Microsoft YaHei" w:eastAsia="Microsoft YaHei"/>
-                <w:b w:val="0"/>
-                <w:sz w:val="18"/>
-              </w:rPr>
-              <w:t>结果返回</w:t>
-            </w:r>
-          </w:p>
-        </w:tc>
-        <w:tc>
-          <w:tcPr>
-            <w:tcW w:type="dxa" w:w="4873"/>
-            <w:vAlign w:val="center"/>
-          </w:tcPr>
-          <w:p>
-            <w:pPr>
-              <w:jc w:val="left"/>
-            </w:pPr>
-            <w:r/>
-            <w:r>
-              <w:rPr>
-                <w:rFonts w:ascii="Microsoft YaHei" w:hAnsi="Microsoft YaHei" w:eastAsia="Microsoft YaHei"/>
-                <w:b w:val="0"/>
-                <w:sz w:val="18"/>
-              </w:rPr>
-              <w:t>返回 SQL、数据来源、图表、洞察结论和后续推荐问题。</w:t>
-            </w:r>
-          </w:p>
-        </w:tc>
-      </w:tr>
-      <w:tr>
-        <w:tc>
-          <w:tcPr>
-            <w:tcW w:type="dxa" w:w="4873"/>
-            <w:vAlign w:val="center"/>
-          </w:tcPr>
-          <w:p>
-            <w:pPr>
-              <w:jc w:val="center"/>
-            </w:pPr>
-            <w:r/>
-            <w:r>
-              <w:rPr>
-                <w:rFonts w:ascii="Microsoft YaHei" w:hAnsi="Microsoft YaHei" w:eastAsia="Microsoft YaHei"/>
-                <w:b w:val="0"/>
-                <w:sz w:val="18"/>
-              </w:rPr>
-              <w:t>仪表盘沉淀</w:t>
-            </w:r>
-          </w:p>
-        </w:tc>
-        <w:tc>
-          <w:tcPr>
-            <w:tcW w:type="dxa" w:w="4873"/>
-            <w:vAlign w:val="center"/>
-          </w:tcPr>
-          <w:p>
-            <w:pPr>
-              <w:jc w:val="left"/>
-            </w:pPr>
-            <w:r/>
-            <w:r>
-              <w:rPr>
-                <w:rFonts w:ascii="Microsoft YaHei" w:hAnsi="Microsoft YaHei" w:eastAsia="Microsoft YaHei"/>
-                <w:b w:val="0"/>
-                <w:sz w:val="18"/>
-              </w:rPr>
-              <w:t>用户可将当前图表保存到仪表盘，并通过本地只读链接查看。</w:t>
+              <w:t>独立全栈原型，不直接修改或合并生产平台源码</w:t>
             </w:r>
           </w:p>
         </w:tc>
@@ -589,1125 +266,3002 @@
     <w:p/>
     <w:p>
       <w:pPr>
-        <w:pStyle w:val="Heading1"/>
+        <w:jc w:val="center"/>
       </w:pPr>
       <w:r>
         <w:rPr>
-          <w:rFonts w:ascii="Microsoft YaHei" w:hAnsi="Microsoft YaHei" w:eastAsia="Microsoft YaHei"/>
-          <w:color w:val="1F4E79"/>
+          <w:rFonts w:ascii="Calibri" w:hAnsi="Calibri" w:eastAsia="Microsoft YaHei"/>
+          <w:b w:val="0"/>
+          <w:color w:val="4B5563"/>
+          <w:sz w:val="21"/>
         </w:rPr>
-        <w:t>4. 数据与知识库说明</w:t>
+        <w:t>本文件同步当前项目功能、运行逻辑、技术架构、测试验收和后续扩展建议。</w:t>
       </w:r>
     </w:p>
     <w:p>
-      <w:pPr>
-        <w:spacing w:after="120" w:line="283" w:lineRule="auto"/>
-      </w:pPr>
       <w:r>
-        <w:rPr>
-          <w:rFonts w:ascii="Microsoft YaHei" w:hAnsi="Microsoft YaHei" w:eastAsia="Microsoft YaHei"/>
-          <w:sz w:val="21"/>
-        </w:rPr>
-        <w:t>演示数据库为本地自动生成的 SQLite 数据库，不包含真实生产数据。当前数据维度覆盖房价、租金、挂牌量、空置率、成交量、新房/二手房成交、成交均价、人口、收入、家庭数、通勤时间、跨区通勤比例、地铁覆盖率和就业密度等字段。</w:t>
+        <w:br w:type="page"/>
       </w:r>
     </w:p>
     <w:p>
       <w:pPr>
-        <w:spacing w:after="120" w:line="283" w:lineRule="auto"/>
+        <w:pStyle w:val="Heading2"/>
       </w:pPr>
       <w:r>
-        <w:rPr>
-          <w:rFonts w:ascii="Microsoft YaHei" w:hAnsi="Microsoft YaHei" w:eastAsia="Microsoft YaHei"/>
-          <w:sz w:val="21"/>
-        </w:rPr>
-        <w:t>知识库用于向模型补充业务口径、SQL 示例和数据表关联信息。系统支持公共知识与私有知识并存，私有知识在检索和生成时具有更高优先级。</w:t>
+        <w:t>1. 项目背景</w:t>
       </w:r>
     </w:p>
     <w:p>
       <w:pPr>
-        <w:pStyle w:val="Heading1"/>
+        <w:spacing w:before="0" w:after="120" w:line="264" w:lineRule="auto"/>
       </w:pPr>
       <w:r>
         <w:rPr>
-          <w:rFonts w:ascii="Microsoft YaHei" w:hAnsi="Microsoft YaHei" w:eastAsia="Microsoft YaHei"/>
-          <w:color w:val="1F4E79"/>
+          <w:rFonts w:ascii="Calibri" w:hAnsi="Calibri" w:eastAsia="Microsoft YaHei"/>
+          <w:b w:val="0"/>
+          <w:color w:val="1F2937"/>
+          <w:sz w:val="21"/>
         </w:rPr>
-        <w:t>5. 核心功能实现方式</w:t>
-      </w:r>
-    </w:p>
-    <w:tbl>
-      <w:tblPr>
-        <w:tblStyle w:val="TableGrid"/>
-        <w:tblW w:type="auto" w:w="0"/>
-        <w:jc w:val="center"/>
-        <w:tblLook w:firstColumn="1" w:firstRow="1" w:lastColumn="0" w:lastRow="0" w:noHBand="0" w:noVBand="1" w:val="04A0"/>
-      </w:tblPr>
-      <w:tblGrid>
-        <w:gridCol w:w="3249"/>
-        <w:gridCol w:w="3249"/>
-        <w:gridCol w:w="3249"/>
-      </w:tblGrid>
-      <w:tr>
-        <w:tc>
-          <w:tcPr>
-            <w:tcW w:type="dxa" w:w="3249"/>
-            <w:shd w:fill="D9EAF7"/>
-            <w:vAlign w:val="center"/>
-          </w:tcPr>
-          <w:p>
-            <w:pPr>
-              <w:jc w:val="center"/>
-            </w:pPr>
-            <w:r/>
-            <w:r>
-              <w:rPr>
-                <w:rFonts w:ascii="Microsoft YaHei" w:hAnsi="Microsoft YaHei" w:eastAsia="Microsoft YaHei"/>
-                <w:b/>
-                <w:sz w:val="18"/>
-              </w:rPr>
-              <w:t>功能</w:t>
-            </w:r>
-          </w:p>
-        </w:tc>
-        <w:tc>
-          <w:tcPr>
-            <w:tcW w:type="dxa" w:w="3249"/>
-            <w:shd w:fill="D9EAF7"/>
-            <w:vAlign w:val="center"/>
-          </w:tcPr>
-          <w:p>
-            <w:pPr>
-              <w:jc w:val="center"/>
-            </w:pPr>
-            <w:r/>
-            <w:r>
-              <w:rPr>
-                <w:rFonts w:ascii="Microsoft YaHei" w:hAnsi="Microsoft YaHei" w:eastAsia="Microsoft YaHei"/>
-                <w:b/>
-                <w:sz w:val="18"/>
-              </w:rPr>
-              <w:t>实现方式</w:t>
-            </w:r>
-          </w:p>
-        </w:tc>
-        <w:tc>
-          <w:tcPr>
-            <w:tcW w:type="dxa" w:w="3249"/>
-            <w:shd w:fill="D9EAF7"/>
-            <w:vAlign w:val="center"/>
-          </w:tcPr>
-          <w:p>
-            <w:pPr>
-              <w:jc w:val="center"/>
-            </w:pPr>
-            <w:r/>
-            <w:r>
-              <w:rPr>
-                <w:rFonts w:ascii="Microsoft YaHei" w:hAnsi="Microsoft YaHei" w:eastAsia="Microsoft YaHei"/>
-                <w:b/>
-                <w:sz w:val="18"/>
-              </w:rPr>
-              <w:t>当前状态</w:t>
-            </w:r>
-          </w:p>
-        </w:tc>
-      </w:tr>
-      <w:tr>
-        <w:tc>
-          <w:tcPr>
-            <w:tcW w:type="dxa" w:w="3249"/>
-            <w:vAlign w:val="center"/>
-          </w:tcPr>
-          <w:p>
-            <w:pPr>
-              <w:jc w:val="center"/>
-            </w:pPr>
-            <w:r/>
-            <w:r>
-              <w:rPr>
-                <w:rFonts w:ascii="Microsoft YaHei" w:hAnsi="Microsoft YaHei" w:eastAsia="Microsoft YaHei"/>
-                <w:b w:val="0"/>
-                <w:sz w:val="18"/>
-              </w:rPr>
-              <w:t>智能问数</w:t>
-            </w:r>
-          </w:p>
-        </w:tc>
-        <w:tc>
-          <w:tcPr>
-            <w:tcW w:type="dxa" w:w="3249"/>
-            <w:vAlign w:val="center"/>
-          </w:tcPr>
-          <w:p>
-            <w:pPr>
-              <w:jc w:val="left"/>
-            </w:pPr>
-            <w:r/>
-            <w:r>
-              <w:rPr>
-                <w:rFonts w:ascii="Microsoft YaHei" w:hAnsi="Microsoft YaHei" w:eastAsia="Microsoft YaHei"/>
-                <w:b w:val="0"/>
-                <w:sz w:val="18"/>
-              </w:rPr>
-              <w:t>自然语言问题经后端工作流转换为 SQL 查询和图表结果。</w:t>
-            </w:r>
-          </w:p>
-        </w:tc>
-        <w:tc>
-          <w:tcPr>
-            <w:tcW w:type="dxa" w:w="3249"/>
-            <w:vAlign w:val="center"/>
-          </w:tcPr>
-          <w:p>
-            <w:pPr>
-              <w:jc w:val="center"/>
-            </w:pPr>
-            <w:r/>
-            <w:r>
-              <w:rPr>
-                <w:rFonts w:ascii="Microsoft YaHei" w:hAnsi="Microsoft YaHei" w:eastAsia="Microsoft YaHei"/>
-                <w:b w:val="0"/>
-                <w:sz w:val="18"/>
-              </w:rPr>
-              <w:t>已完成</w:t>
-            </w:r>
-          </w:p>
-        </w:tc>
-      </w:tr>
-      <w:tr>
-        <w:tc>
-          <w:tcPr>
-            <w:tcW w:type="dxa" w:w="3249"/>
-            <w:vAlign w:val="center"/>
-          </w:tcPr>
-          <w:p>
-            <w:pPr>
-              <w:jc w:val="center"/>
-            </w:pPr>
-            <w:r/>
-            <w:r>
-              <w:rPr>
-                <w:rFonts w:ascii="Microsoft YaHei" w:hAnsi="Microsoft YaHei" w:eastAsia="Microsoft YaHei"/>
-                <w:b w:val="0"/>
-                <w:sz w:val="18"/>
-              </w:rPr>
-              <w:t>DeepSeek 接入</w:t>
-            </w:r>
-          </w:p>
-        </w:tc>
-        <w:tc>
-          <w:tcPr>
-            <w:tcW w:type="dxa" w:w="3249"/>
-            <w:vAlign w:val="center"/>
-          </w:tcPr>
-          <w:p>
-            <w:pPr>
-              <w:jc w:val="left"/>
-            </w:pPr>
-            <w:r/>
-            <w:r>
-              <w:rPr>
-                <w:rFonts w:ascii="Microsoft YaHei" w:hAnsi="Microsoft YaHei" w:eastAsia="Microsoft YaHei"/>
-                <w:b w:val="0"/>
-                <w:sz w:val="18"/>
-              </w:rPr>
-              <w:t>使用 DeepSeek Chat Completions 生成结构化 JSON，包含 SQL、推理说明和图表建议。</w:t>
-            </w:r>
-          </w:p>
-        </w:tc>
-        <w:tc>
-          <w:tcPr>
-            <w:tcW w:type="dxa" w:w="3249"/>
-            <w:vAlign w:val="center"/>
-          </w:tcPr>
-          <w:p>
-            <w:pPr>
-              <w:jc w:val="center"/>
-            </w:pPr>
-            <w:r/>
-            <w:r>
-              <w:rPr>
-                <w:rFonts w:ascii="Microsoft YaHei" w:hAnsi="Microsoft YaHei" w:eastAsia="Microsoft YaHei"/>
-                <w:b w:val="0"/>
-                <w:sz w:val="18"/>
-              </w:rPr>
-              <w:t>已完成</w:t>
-            </w:r>
-          </w:p>
-        </w:tc>
-      </w:tr>
-      <w:tr>
-        <w:tc>
-          <w:tcPr>
-            <w:tcW w:type="dxa" w:w="3249"/>
-            <w:vAlign w:val="center"/>
-          </w:tcPr>
-          <w:p>
-            <w:pPr>
-              <w:jc w:val="center"/>
-            </w:pPr>
-            <w:r/>
-            <w:r>
-              <w:rPr>
-                <w:rFonts w:ascii="Microsoft YaHei" w:hAnsi="Microsoft YaHei" w:eastAsia="Microsoft YaHei"/>
-                <w:b w:val="0"/>
-                <w:sz w:val="18"/>
-              </w:rPr>
-              <w:t>知识增强</w:t>
-            </w:r>
-          </w:p>
-        </w:tc>
-        <w:tc>
-          <w:tcPr>
-            <w:tcW w:type="dxa" w:w="3249"/>
-            <w:vAlign w:val="center"/>
-          </w:tcPr>
-          <w:p>
-            <w:pPr>
-              <w:jc w:val="left"/>
-            </w:pPr>
-            <w:r/>
-            <w:r>
-              <w:rPr>
-                <w:rFonts w:ascii="Microsoft YaHei" w:hAnsi="Microsoft YaHei" w:eastAsia="Microsoft YaHei"/>
-                <w:b w:val="0"/>
-                <w:sz w:val="18"/>
-              </w:rPr>
-              <w:t>基于问题关键词和表关联检索知识项，作为模型上下文。</w:t>
-            </w:r>
-          </w:p>
-        </w:tc>
-        <w:tc>
-          <w:tcPr>
-            <w:tcW w:type="dxa" w:w="3249"/>
-            <w:vAlign w:val="center"/>
-          </w:tcPr>
-          <w:p>
-            <w:pPr>
-              <w:jc w:val="center"/>
-            </w:pPr>
-            <w:r/>
-            <w:r>
-              <w:rPr>
-                <w:rFonts w:ascii="Microsoft YaHei" w:hAnsi="Microsoft YaHei" w:eastAsia="Microsoft YaHei"/>
-                <w:b w:val="0"/>
-                <w:sz w:val="18"/>
-              </w:rPr>
-              <w:t>已完成</w:t>
-            </w:r>
-          </w:p>
-        </w:tc>
-      </w:tr>
-      <w:tr>
-        <w:tc>
-          <w:tcPr>
-            <w:tcW w:type="dxa" w:w="3249"/>
-            <w:vAlign w:val="center"/>
-          </w:tcPr>
-          <w:p>
-            <w:pPr>
-              <w:jc w:val="center"/>
-            </w:pPr>
-            <w:r/>
-            <w:r>
-              <w:rPr>
-                <w:rFonts w:ascii="Microsoft YaHei" w:hAnsi="Microsoft YaHei" w:eastAsia="Microsoft YaHei"/>
-                <w:b w:val="0"/>
-                <w:sz w:val="18"/>
-              </w:rPr>
-              <w:t>SQL 防线</w:t>
-            </w:r>
-          </w:p>
-        </w:tc>
-        <w:tc>
-          <w:tcPr>
-            <w:tcW w:type="dxa" w:w="3249"/>
-            <w:vAlign w:val="center"/>
-          </w:tcPr>
-          <w:p>
-            <w:pPr>
-              <w:jc w:val="left"/>
-            </w:pPr>
-            <w:r/>
-            <w:r>
-              <w:rPr>
-                <w:rFonts w:ascii="Microsoft YaHei" w:hAnsi="Microsoft YaHei" w:eastAsia="Microsoft YaHei"/>
-                <w:b w:val="0"/>
-                <w:sz w:val="18"/>
-              </w:rPr>
-              <w:t>校验危险操作、非授权表、多语句和非只读查询。</w:t>
-            </w:r>
-          </w:p>
-        </w:tc>
-        <w:tc>
-          <w:tcPr>
-            <w:tcW w:type="dxa" w:w="3249"/>
-            <w:vAlign w:val="center"/>
-          </w:tcPr>
-          <w:p>
-            <w:pPr>
-              <w:jc w:val="center"/>
-            </w:pPr>
-            <w:r/>
-            <w:r>
-              <w:rPr>
-                <w:rFonts w:ascii="Microsoft YaHei" w:hAnsi="Microsoft YaHei" w:eastAsia="Microsoft YaHei"/>
-                <w:b w:val="0"/>
-                <w:sz w:val="18"/>
-              </w:rPr>
-              <w:t>已完成</w:t>
-            </w:r>
-          </w:p>
-        </w:tc>
-      </w:tr>
-      <w:tr>
-        <w:tc>
-          <w:tcPr>
-            <w:tcW w:type="dxa" w:w="3249"/>
-            <w:vAlign w:val="center"/>
-          </w:tcPr>
-          <w:p>
-            <w:pPr>
-              <w:jc w:val="center"/>
-            </w:pPr>
-            <w:r/>
-            <w:r>
-              <w:rPr>
-                <w:rFonts w:ascii="Microsoft YaHei" w:hAnsi="Microsoft YaHei" w:eastAsia="Microsoft YaHei"/>
-                <w:b w:val="0"/>
-                <w:sz w:val="18"/>
-              </w:rPr>
-              <w:t>图表修复</w:t>
-            </w:r>
-          </w:p>
-        </w:tc>
-        <w:tc>
-          <w:tcPr>
-            <w:tcW w:type="dxa" w:w="3249"/>
-            <w:vAlign w:val="center"/>
-          </w:tcPr>
-          <w:p>
-            <w:pPr>
-              <w:jc w:val="left"/>
-            </w:pPr>
-            <w:r/>
-            <w:r>
-              <w:rPr>
-                <w:rFonts w:ascii="Microsoft YaHei" w:hAnsi="Microsoft YaHei" w:eastAsia="Microsoft YaHei"/>
-                <w:b w:val="0"/>
-                <w:sz w:val="18"/>
-              </w:rPr>
-              <w:t>校验 x/y 字段与结果字段一致性，必要时自动重建图表。</w:t>
-            </w:r>
-          </w:p>
-        </w:tc>
-        <w:tc>
-          <w:tcPr>
-            <w:tcW w:type="dxa" w:w="3249"/>
-            <w:vAlign w:val="center"/>
-          </w:tcPr>
-          <w:p>
-            <w:pPr>
-              <w:jc w:val="center"/>
-            </w:pPr>
-            <w:r/>
-            <w:r>
-              <w:rPr>
-                <w:rFonts w:ascii="Microsoft YaHei" w:hAnsi="Microsoft YaHei" w:eastAsia="Microsoft YaHei"/>
-                <w:b w:val="0"/>
-                <w:sz w:val="18"/>
-              </w:rPr>
-              <w:t>已完成</w:t>
-            </w:r>
-          </w:p>
-        </w:tc>
-      </w:tr>
-      <w:tr>
-        <w:tc>
-          <w:tcPr>
-            <w:tcW w:type="dxa" w:w="3249"/>
-            <w:vAlign w:val="center"/>
-          </w:tcPr>
-          <w:p>
-            <w:pPr>
-              <w:jc w:val="center"/>
-            </w:pPr>
-            <w:r/>
-            <w:r>
-              <w:rPr>
-                <w:rFonts w:ascii="Microsoft YaHei" w:hAnsi="Microsoft YaHei" w:eastAsia="Microsoft YaHei"/>
-                <w:b w:val="0"/>
-                <w:sz w:val="18"/>
-              </w:rPr>
-              <w:t>推荐问题</w:t>
-            </w:r>
-          </w:p>
-        </w:tc>
-        <w:tc>
-          <w:tcPr>
-            <w:tcW w:type="dxa" w:w="3249"/>
-            <w:vAlign w:val="center"/>
-          </w:tcPr>
-          <w:p>
-            <w:pPr>
-              <w:jc w:val="left"/>
-            </w:pPr>
-            <w:r/>
-            <w:r>
-              <w:rPr>
-                <w:rFonts w:ascii="Microsoft YaHei" w:hAnsi="Microsoft YaHei" w:eastAsia="Microsoft YaHei"/>
-                <w:b w:val="0"/>
-                <w:sz w:val="18"/>
-              </w:rPr>
-              <w:t>简单问题和完成结果后分别生成 3 个去重推荐问题。</w:t>
-            </w:r>
-          </w:p>
-        </w:tc>
-        <w:tc>
-          <w:tcPr>
-            <w:tcW w:type="dxa" w:w="3249"/>
-            <w:vAlign w:val="center"/>
-          </w:tcPr>
-          <w:p>
-            <w:pPr>
-              <w:jc w:val="center"/>
-            </w:pPr>
-            <w:r/>
-            <w:r>
-              <w:rPr>
-                <w:rFonts w:ascii="Microsoft YaHei" w:hAnsi="Microsoft YaHei" w:eastAsia="Microsoft YaHei"/>
-                <w:b w:val="0"/>
-                <w:sz w:val="18"/>
-              </w:rPr>
-              <w:t>已完成</w:t>
-            </w:r>
-          </w:p>
-        </w:tc>
-      </w:tr>
-      <w:tr>
-        <w:tc>
-          <w:tcPr>
-            <w:tcW w:type="dxa" w:w="3249"/>
-            <w:vAlign w:val="center"/>
-          </w:tcPr>
-          <w:p>
-            <w:pPr>
-              <w:jc w:val="center"/>
-            </w:pPr>
-            <w:r/>
-            <w:r>
-              <w:rPr>
-                <w:rFonts w:ascii="Microsoft YaHei" w:hAnsi="Microsoft YaHei" w:eastAsia="Microsoft YaHei"/>
-                <w:b w:val="0"/>
-                <w:sz w:val="18"/>
-              </w:rPr>
-              <w:t>仪表盘</w:t>
-            </w:r>
-          </w:p>
-        </w:tc>
-        <w:tc>
-          <w:tcPr>
-            <w:tcW w:type="dxa" w:w="3249"/>
-            <w:vAlign w:val="center"/>
-          </w:tcPr>
-          <w:p>
-            <w:pPr>
-              <w:jc w:val="left"/>
-            </w:pPr>
-            <w:r/>
-            <w:r>
-              <w:rPr>
-                <w:rFonts w:ascii="Microsoft YaHei" w:hAnsi="Microsoft YaHei" w:eastAsia="Microsoft YaHei"/>
-                <w:b w:val="0"/>
-                <w:sz w:val="18"/>
-              </w:rPr>
-              <w:t>卡片布局持久化到 SQLite，前端支持拖拽排序和分享查看。</w:t>
-            </w:r>
-          </w:p>
-        </w:tc>
-        <w:tc>
-          <w:tcPr>
-            <w:tcW w:type="dxa" w:w="3249"/>
-            <w:vAlign w:val="center"/>
-          </w:tcPr>
-          <w:p>
-            <w:pPr>
-              <w:jc w:val="center"/>
-            </w:pPr>
-            <w:r/>
-            <w:r>
-              <w:rPr>
-                <w:rFonts w:ascii="Microsoft YaHei" w:hAnsi="Microsoft YaHei" w:eastAsia="Microsoft YaHei"/>
-                <w:b w:val="0"/>
-                <w:sz w:val="18"/>
-              </w:rPr>
-              <w:t>已完成</w:t>
-            </w:r>
-          </w:p>
-        </w:tc>
-      </w:tr>
-      <w:tr>
-        <w:tc>
-          <w:tcPr>
-            <w:tcW w:type="dxa" w:w="3249"/>
-            <w:vAlign w:val="center"/>
-          </w:tcPr>
-          <w:p>
-            <w:pPr>
-              <w:jc w:val="center"/>
-            </w:pPr>
-            <w:r/>
-            <w:r>
-              <w:rPr>
-                <w:rFonts w:ascii="Microsoft YaHei" w:hAnsi="Microsoft YaHei" w:eastAsia="Microsoft YaHei"/>
-                <w:b w:val="0"/>
-                <w:sz w:val="18"/>
-              </w:rPr>
-              <w:t>API Key 配置</w:t>
-            </w:r>
-          </w:p>
-        </w:tc>
-        <w:tc>
-          <w:tcPr>
-            <w:tcW w:type="dxa" w:w="3249"/>
-            <w:vAlign w:val="center"/>
-          </w:tcPr>
-          <w:p>
-            <w:pPr>
-              <w:jc w:val="left"/>
-            </w:pPr>
-            <w:r/>
-            <w:r>
-              <w:rPr>
-                <w:rFonts w:ascii="Microsoft YaHei" w:hAnsi="Microsoft YaHei" w:eastAsia="Microsoft YaHei"/>
-                <w:b w:val="0"/>
-                <w:sz w:val="18"/>
-              </w:rPr>
-              <w:t>前端填写 Key，后端运行时更新配置，不回显密钥。</w:t>
-            </w:r>
-          </w:p>
-        </w:tc>
-        <w:tc>
-          <w:tcPr>
-            <w:tcW w:type="dxa" w:w="3249"/>
-            <w:vAlign w:val="center"/>
-          </w:tcPr>
-          <w:p>
-            <w:pPr>
-              <w:jc w:val="center"/>
-            </w:pPr>
-            <w:r/>
-            <w:r>
-              <w:rPr>
-                <w:rFonts w:ascii="Microsoft YaHei" w:hAnsi="Microsoft YaHei" w:eastAsia="Microsoft YaHei"/>
-                <w:b w:val="0"/>
-                <w:sz w:val="18"/>
-              </w:rPr>
-              <w:t>已完成</w:t>
-            </w:r>
-          </w:p>
-        </w:tc>
-      </w:tr>
-    </w:tbl>
-    <w:p/>
-    <w:p>
-      <w:pPr>
-        <w:pStyle w:val="Heading1"/>
-      </w:pPr>
-      <w:r>
-        <w:rPr>
-          <w:rFonts w:ascii="Microsoft YaHei" w:hAnsi="Microsoft YaHei" w:eastAsia="Microsoft YaHei"/>
-          <w:color w:val="1F4E79"/>
-        </w:rPr>
-        <w:t>6. 本地运行方式</w:t>
+        <w:t>GeniusQ DaaS 是面向企业数据资产使用场景建设的数据平台，核心目标是让业务用户可以通过自然语言查询授权数据，并将常见 SQL、分析逻辑或脚本沉淀为可复用模型。当前 Demo 围绕“智能问数”能力构建一个可本地运行的全栈原型，用于验证自然语言问数、Text-to-SQL、知识检索增强、图表分析、仪表盘沉淀和运行配置等关键链路。</w:t>
       </w:r>
     </w:p>
     <w:p>
       <w:pPr>
-        <w:spacing w:after="120" w:line="283" w:lineRule="auto"/>
+        <w:spacing w:before="0" w:after="120" w:line="264" w:lineRule="auto"/>
       </w:pPr>
       <w:r>
         <w:rPr>
-          <w:rFonts w:ascii="Microsoft YaHei" w:hAnsi="Microsoft YaHei" w:eastAsia="Microsoft YaHei"/>
+          <w:rFonts w:ascii="Calibri" w:hAnsi="Calibri" w:eastAsia="Microsoft YaHei"/>
+          <w:b w:val="0"/>
+          <w:color w:val="1F2937"/>
           <w:sz w:val="21"/>
         </w:rPr>
-        <w:t>在项目根目录执行以下命令可一键启动：</w:t>
+        <w:t>本项目不接入真实生产数据库，也不修改 GeniusQ DaaS 生产源码。Demo 通过本地 SQLite 生成确定性的房价、成交、人口、通勤和知识库样例数据，复刻企业数据平台中的核心交互和工程边界，便于演示、评审和后续迁移设计。</w:t>
       </w:r>
     </w:p>
     <w:p>
       <w:pPr>
-        <w:spacing w:after="120" w:line="283" w:lineRule="auto"/>
+        <w:pStyle w:val="Heading2"/>
+      </w:pPr>
+      <w:r>
+        <w:t>2. 建设目标</w:t>
+      </w:r>
+    </w:p>
+    <w:p>
+      <w:pPr>
+        <w:pStyle w:val="Heading3"/>
+      </w:pPr>
+      <w:r>
+        <w:t>2.1 产品目标</w:t>
+      </w:r>
+    </w:p>
+    <w:p>
+      <w:pPr>
+        <w:pStyle w:val="ListBullet"/>
+        <w:spacing w:before="0" w:after="80" w:line="269" w:lineRule="auto"/>
       </w:pPr>
       <w:r>
         <w:rPr>
-          <w:rFonts w:ascii="Microsoft YaHei" w:hAnsi="Microsoft YaHei" w:eastAsia="Microsoft YaHei"/>
+          <w:rFonts w:ascii="Calibri" w:hAnsi="Calibri" w:eastAsia="Microsoft YaHei"/>
+          <w:b w:val="0"/>
+          <w:color w:val="1F2937"/>
           <w:sz w:val="21"/>
+        </w:rPr>
+        <w:t>让用户可以用自然语言完成“提问 - 分析 - 图表 - 追问 - 保存看板”的完整流程。</w:t>
+      </w:r>
+    </w:p>
+    <w:p>
+      <w:pPr>
+        <w:pStyle w:val="ListBullet"/>
+        <w:spacing w:before="0" w:after="80" w:line="269" w:lineRule="auto"/>
+      </w:pPr>
+      <w:r>
+        <w:rPr>
+          <w:rFonts w:ascii="Calibri" w:hAnsi="Calibri" w:eastAsia="Microsoft YaHei"/>
+          <w:b w:val="0"/>
+          <w:color w:val="1F2937"/>
+          <w:sz w:val="21"/>
+        </w:rPr>
+        <w:t>让系统执行过程可观察：展示问题理解、上下文合并、知识检索、字段选择、SQL 生成、SQL 校验、查询执行和图表推荐等步骤。</w:t>
+      </w:r>
+    </w:p>
+    <w:p>
+      <w:pPr>
+        <w:pStyle w:val="ListBullet"/>
+        <w:spacing w:before="0" w:after="80" w:line="269" w:lineRule="auto"/>
+      </w:pPr>
+      <w:r>
+        <w:rPr>
+          <w:rFonts w:ascii="Calibri" w:hAnsi="Calibri" w:eastAsia="Microsoft YaHei"/>
+          <w:b w:val="0"/>
+          <w:color w:val="1F2937"/>
+          <w:sz w:val="21"/>
+        </w:rPr>
+        <w:t>支持 DeepSeek Text-to-SQL，同时保留本地离线规则兜底，保证无 API Key 时仍可演示。</w:t>
+      </w:r>
+    </w:p>
+    <w:p>
+      <w:pPr>
+        <w:pStyle w:val="ListBullet"/>
+        <w:spacing w:before="0" w:after="80" w:line="269" w:lineRule="auto"/>
+      </w:pPr>
+      <w:r>
+        <w:rPr>
+          <w:rFonts w:ascii="Calibri" w:hAnsi="Calibri" w:eastAsia="Microsoft YaHei"/>
+          <w:b w:val="0"/>
+          <w:color w:val="1F2937"/>
+          <w:sz w:val="21"/>
+        </w:rPr>
+        <w:t>支持数据源查看、知识库管理、仪表盘管理、历史会话管理和运行配置。</w:t>
+      </w:r>
+    </w:p>
+    <w:p>
+      <w:pPr>
+        <w:pStyle w:val="ListBullet"/>
+        <w:spacing w:before="0" w:after="80" w:line="269" w:lineRule="auto"/>
+      </w:pPr>
+      <w:r>
+        <w:rPr>
+          <w:rFonts w:ascii="Calibri" w:hAnsi="Calibri" w:eastAsia="Microsoft YaHei"/>
+          <w:b w:val="0"/>
+          <w:color w:val="1F2937"/>
+          <w:sz w:val="21"/>
+        </w:rPr>
+        <w:t>形成清晰的项目文档、README、测试用例和一键启动方式，便于交付和二次开发。</w:t>
+      </w:r>
+    </w:p>
+    <w:p>
+      <w:pPr>
+        <w:pStyle w:val="Heading3"/>
+      </w:pPr>
+      <w:r>
+        <w:t>2.2 工程目标</w:t>
+      </w:r>
+    </w:p>
+    <w:p>
+      <w:pPr>
+        <w:pStyle w:val="ListBullet"/>
+        <w:spacing w:before="0" w:after="80" w:line="269" w:lineRule="auto"/>
+      </w:pPr>
+      <w:r>
+        <w:rPr>
+          <w:rFonts w:ascii="Calibri" w:hAnsi="Calibri" w:eastAsia="Microsoft YaHei"/>
+          <w:b w:val="0"/>
+          <w:color w:val="1F2937"/>
+          <w:sz w:val="21"/>
+        </w:rPr>
+        <w:t>前后端职责清晰：React 负责交互和可视化，FastAPI 负责编排、SQL 安全、数据访问和模型调用。</w:t>
+      </w:r>
+    </w:p>
+    <w:p>
+      <w:pPr>
+        <w:pStyle w:val="ListBullet"/>
+        <w:spacing w:before="0" w:after="80" w:line="269" w:lineRule="auto"/>
+      </w:pPr>
+      <w:r>
+        <w:rPr>
+          <w:rFonts w:ascii="Calibri" w:hAnsi="Calibri" w:eastAsia="Microsoft YaHei"/>
+          <w:b w:val="0"/>
+          <w:color w:val="1F2937"/>
+          <w:sz w:val="21"/>
+        </w:rPr>
+        <w:t>后端按 api / services / repositories / domain 分层，降低业务逻辑与数据库访问耦合。</w:t>
+      </w:r>
+    </w:p>
+    <w:p>
+      <w:pPr>
+        <w:pStyle w:val="ListBullet"/>
+        <w:spacing w:before="0" w:after="80" w:line="269" w:lineRule="auto"/>
+      </w:pPr>
+      <w:r>
+        <w:rPr>
+          <w:rFonts w:ascii="Calibri" w:hAnsi="Calibri" w:eastAsia="Microsoft YaHei"/>
+          <w:b w:val="0"/>
+          <w:color w:val="1F2937"/>
+          <w:sz w:val="21"/>
+        </w:rPr>
+        <w:t>前端拆分大型页面和图表组件，降低 QueryWorkspace、DashboardWorkspace、AnalysisChart 的维护成本。</w:t>
+      </w:r>
+    </w:p>
+    <w:p>
+      <w:pPr>
+        <w:pStyle w:val="ListBullet"/>
+        <w:spacing w:before="0" w:after="80" w:line="269" w:lineRule="auto"/>
+      </w:pPr>
+      <w:r>
+        <w:rPr>
+          <w:rFonts w:ascii="Calibri" w:hAnsi="Calibri" w:eastAsia="Microsoft YaHei"/>
+          <w:b w:val="0"/>
+          <w:color w:val="1F2937"/>
+          <w:sz w:val="21"/>
+        </w:rPr>
+        <w:t>API Key 只在本地后端运行时使用，不在页面回显完整密钥，不提交到仓库。</w:t>
+      </w:r>
+    </w:p>
+    <w:p>
+      <w:pPr>
+        <w:pStyle w:val="ListBullet"/>
+        <w:spacing w:before="0" w:after="80" w:line="269" w:lineRule="auto"/>
+      </w:pPr>
+      <w:r>
+        <w:rPr>
+          <w:rFonts w:ascii="Calibri" w:hAnsi="Calibri" w:eastAsia="Microsoft YaHei"/>
+          <w:b w:val="0"/>
+          <w:color w:val="1F2937"/>
+          <w:sz w:val="21"/>
+        </w:rPr>
+        <w:t>SQL 只允许只读查询，禁止 DDL、DML、PRAGMA、ATTACH、多语句和越权表访问。</w:t>
+      </w:r>
+    </w:p>
+    <w:p>
+      <w:pPr>
+        <w:pStyle w:val="Heading2"/>
+      </w:pPr>
+      <w:r>
+        <w:t>3. 当前已实现功能</w:t>
+      </w:r>
+    </w:p>
+    <w:p>
+      <w:pPr>
+        <w:pStyle w:val="Heading3"/>
+      </w:pPr>
+      <w:r>
+        <w:t>3.1 智能问数工作台</w:t>
+      </w:r>
+    </w:p>
+    <w:p>
+      <w:pPr>
+        <w:spacing w:before="0" w:after="120" w:line="264" w:lineRule="auto"/>
+      </w:pPr>
+      <w:r>
+        <w:rPr>
+          <w:rFonts w:ascii="Calibri" w:hAnsi="Calibri" w:eastAsia="Microsoft YaHei"/>
+          <w:b w:val="0"/>
+          <w:color w:val="1F2937"/>
+          <w:sz w:val="21"/>
+        </w:rPr>
+        <w:t>用户输入问题后，系统会创建一次分析任务，并按步骤展示执行过程。步骤会逐个出现并完成，呈现类似 Agent 工具调用的体验，但不会暴露模型隐藏推理链。</w:t>
+      </w:r>
+    </w:p>
+    <w:p>
+      <w:pPr>
+        <w:spacing w:before="0" w:after="120" w:line="264" w:lineRule="auto"/>
+      </w:pPr>
+      <w:r>
+        <w:rPr>
+          <w:rFonts w:ascii="Calibri" w:hAnsi="Calibri" w:eastAsia="Microsoft YaHei"/>
+          <w:b w:val="0"/>
+          <w:color w:val="1F2937"/>
+          <w:sz w:val="21"/>
+        </w:rPr>
+        <w:t>已实现能力：</w:t>
+      </w:r>
+    </w:p>
+    <w:p>
+      <w:pPr>
+        <w:pStyle w:val="ListBullet"/>
+        <w:spacing w:before="0" w:after="80" w:line="269" w:lineRule="auto"/>
+      </w:pPr>
+      <w:r>
+        <w:rPr>
+          <w:rFonts w:ascii="Calibri" w:hAnsi="Calibri" w:eastAsia="Microsoft YaHei"/>
+          <w:b w:val="0"/>
+          <w:color w:val="1F2937"/>
+          <w:sz w:val="21"/>
+        </w:rPr>
+        <w:t>自然语言问数。</w:t>
+      </w:r>
+    </w:p>
+    <w:p>
+      <w:pPr>
+        <w:pStyle w:val="ListBullet"/>
+        <w:spacing w:before="0" w:after="80" w:line="269" w:lineRule="auto"/>
+      </w:pPr>
+      <w:r>
+        <w:rPr>
+          <w:rFonts w:ascii="Calibri" w:hAnsi="Calibri" w:eastAsia="Microsoft YaHei"/>
+          <w:b w:val="0"/>
+          <w:color w:val="1F2937"/>
+          <w:sz w:val="21"/>
+        </w:rPr>
+        <w:t>问题过短或条件不足时，推荐 3 个可点击问题。</w:t>
+      </w:r>
+    </w:p>
+    <w:p>
+      <w:pPr>
+        <w:pStyle w:val="ListBullet"/>
+        <w:spacing w:before="0" w:after="80" w:line="269" w:lineRule="auto"/>
+      </w:pPr>
+      <w:r>
+        <w:rPr>
+          <w:rFonts w:ascii="Calibri" w:hAnsi="Calibri" w:eastAsia="Microsoft YaHei"/>
+          <w:b w:val="0"/>
+          <w:color w:val="1F2937"/>
+          <w:sz w:val="21"/>
+        </w:rPr>
+        <w:t>多轮会话上下文继承，例如继续限定年份、区域或指标。</w:t>
+      </w:r>
+    </w:p>
+    <w:p>
+      <w:pPr>
+        <w:pStyle w:val="ListBullet"/>
+        <w:spacing w:before="0" w:after="80" w:line="269" w:lineRule="auto"/>
+      </w:pPr>
+      <w:r>
+        <w:rPr>
+          <w:rFonts w:ascii="Calibri" w:hAnsi="Calibri" w:eastAsia="Microsoft YaHei"/>
+          <w:b w:val="0"/>
+          <w:color w:val="1F2937"/>
+          <w:sz w:val="21"/>
+        </w:rPr>
+        <w:t>知识库检索增强，优先使用业务口径、字段说明和 SQL 示例。</w:t>
+      </w:r>
+    </w:p>
+    <w:p>
+      <w:pPr>
+        <w:pStyle w:val="ListBullet"/>
+        <w:spacing w:before="0" w:after="80" w:line="269" w:lineRule="auto"/>
+      </w:pPr>
+      <w:r>
+        <w:rPr>
+          <w:rFonts w:ascii="Calibri" w:hAnsi="Calibri" w:eastAsia="Microsoft YaHei"/>
+          <w:b w:val="0"/>
+          <w:color w:val="1F2937"/>
+          <w:sz w:val="21"/>
+        </w:rPr>
+        <w:t>DeepSeek Text-to-SQL 生成 SQL。</w:t>
+      </w:r>
+    </w:p>
+    <w:p>
+      <w:pPr>
+        <w:pStyle w:val="ListBullet"/>
+        <w:spacing w:before="0" w:after="80" w:line="269" w:lineRule="auto"/>
+      </w:pPr>
+      <w:r>
+        <w:rPr>
+          <w:rFonts w:ascii="Calibri" w:hAnsi="Calibri" w:eastAsia="Microsoft YaHei"/>
+          <w:b w:val="0"/>
+          <w:color w:val="1F2937"/>
+          <w:sz w:val="21"/>
+        </w:rPr>
+        <w:t>SQL 只读安全校验。</w:t>
+      </w:r>
+    </w:p>
+    <w:p>
+      <w:pPr>
+        <w:pStyle w:val="ListBullet"/>
+        <w:spacing w:before="0" w:after="80" w:line="269" w:lineRule="auto"/>
+      </w:pPr>
+      <w:r>
+        <w:rPr>
+          <w:rFonts w:ascii="Calibri" w:hAnsi="Calibri" w:eastAsia="Microsoft YaHei"/>
+          <w:b w:val="0"/>
+          <w:color w:val="1F2937"/>
+          <w:sz w:val="21"/>
+        </w:rPr>
+        <w:t>SQL 执行和结果集返回。</w:t>
+      </w:r>
+    </w:p>
+    <w:p>
+      <w:pPr>
+        <w:pStyle w:val="ListBullet"/>
+        <w:spacing w:before="0" w:after="80" w:line="269" w:lineRule="auto"/>
+      </w:pPr>
+      <w:r>
+        <w:rPr>
+          <w:rFonts w:ascii="Calibri" w:hAnsi="Calibri" w:eastAsia="Microsoft YaHei"/>
+          <w:b w:val="0"/>
+          <w:color w:val="1F2937"/>
+          <w:sz w:val="21"/>
+        </w:rPr>
+        <w:t>自动图表推荐和分析结论生成。</w:t>
+      </w:r>
+    </w:p>
+    <w:p>
+      <w:pPr>
+        <w:pStyle w:val="ListBullet"/>
+        <w:spacing w:before="0" w:after="80" w:line="269" w:lineRule="auto"/>
+      </w:pPr>
+      <w:r>
+        <w:rPr>
+          <w:rFonts w:ascii="Calibri" w:hAnsi="Calibri" w:eastAsia="Microsoft YaHei"/>
+          <w:b w:val="0"/>
+          <w:color w:val="1F2937"/>
+          <w:sz w:val="21"/>
+        </w:rPr>
+        <w:t>查询结果后的 3 个后续追问建议，避免与历史推荐重复。</w:t>
+      </w:r>
+    </w:p>
+    <w:p>
+      <w:pPr>
+        <w:pStyle w:val="ListBullet"/>
+        <w:spacing w:before="0" w:after="80" w:line="269" w:lineRule="auto"/>
+      </w:pPr>
+      <w:r>
+        <w:rPr>
+          <w:rFonts w:ascii="Calibri" w:hAnsi="Calibri" w:eastAsia="Microsoft YaHei"/>
+          <w:b w:val="0"/>
+          <w:color w:val="1F2937"/>
+          <w:sz w:val="21"/>
+        </w:rPr>
+        <w:t>历史会话自动保存，支持恢复、删除、清空；删除和清空均有二次确认。</w:t>
+      </w:r>
+    </w:p>
+    <w:p>
+      <w:pPr>
+        <w:pStyle w:val="Heading3"/>
+      </w:pPr>
+      <w:r>
+        <w:t>3.2 数据源管理</w:t>
+      </w:r>
+    </w:p>
+    <w:p>
+      <w:pPr>
+        <w:spacing w:before="0" w:after="120" w:line="264" w:lineRule="auto"/>
+      </w:pPr>
+      <w:r>
+        <w:rPr>
+          <w:rFonts w:ascii="Calibri" w:hAnsi="Calibri" w:eastAsia="Microsoft YaHei"/>
+          <w:b w:val="0"/>
+          <w:color w:val="1F2937"/>
+          <w:sz w:val="21"/>
+        </w:rPr>
+        <w:t>数据源页面用于解释当前 Demo 可查询的数据结构，帮助用户理解“能问什么”和“每张表有哪些字段”。</w:t>
+      </w:r>
+    </w:p>
+    <w:p>
+      <w:pPr>
+        <w:spacing w:before="0" w:after="120" w:line="264" w:lineRule="auto"/>
+      </w:pPr>
+      <w:r>
+        <w:rPr>
+          <w:rFonts w:ascii="Calibri" w:hAnsi="Calibri" w:eastAsia="Microsoft YaHei"/>
+          <w:b w:val="0"/>
+          <w:color w:val="1F2937"/>
+          <w:sz w:val="21"/>
+        </w:rPr>
+        <w:t>已实现能力：</w:t>
+      </w:r>
+    </w:p>
+    <w:p>
+      <w:pPr>
+        <w:pStyle w:val="ListBullet"/>
+        <w:spacing w:before="0" w:after="80" w:line="269" w:lineRule="auto"/>
+      </w:pPr>
+      <w:r>
+        <w:rPr>
+          <w:rFonts w:ascii="Calibri" w:hAnsi="Calibri" w:eastAsia="Microsoft YaHei"/>
+          <w:b w:val="0"/>
+          <w:color w:val="1F2937"/>
+          <w:sz w:val="21"/>
+        </w:rPr>
+        <w:t>自动读取 SQLite 表结构。</w:t>
+      </w:r>
+    </w:p>
+    <w:p>
+      <w:pPr>
+        <w:pStyle w:val="ListBullet"/>
+        <w:spacing w:before="0" w:after="80" w:line="269" w:lineRule="auto"/>
+      </w:pPr>
+      <w:r>
+        <w:rPr>
+          <w:rFonts w:ascii="Calibri" w:hAnsi="Calibri" w:eastAsia="Microsoft YaHei"/>
+          <w:b w:val="0"/>
+          <w:color w:val="1F2937"/>
+          <w:sz w:val="21"/>
+        </w:rPr>
+        <w:t>展示字段名称、含义、类型、用途、示例值。</w:t>
+      </w:r>
+    </w:p>
+    <w:p>
+      <w:pPr>
+        <w:pStyle w:val="ListBullet"/>
+        <w:spacing w:before="0" w:after="80" w:line="269" w:lineRule="auto"/>
+      </w:pPr>
+      <w:r>
+        <w:rPr>
+          <w:rFonts w:ascii="Calibri" w:hAnsi="Calibri" w:eastAsia="Microsoft YaHei"/>
+          <w:b w:val="0"/>
+          <w:color w:val="1F2937"/>
+          <w:sz w:val="21"/>
+        </w:rPr>
+        <w:t>展示样例数据。</w:t>
+      </w:r>
+    </w:p>
+    <w:p>
+      <w:pPr>
+        <w:pStyle w:val="ListBullet"/>
+        <w:spacing w:before="0" w:after="80" w:line="269" w:lineRule="auto"/>
+      </w:pPr>
+      <w:r>
+        <w:rPr>
+          <w:rFonts w:ascii="Calibri" w:hAnsi="Calibri" w:eastAsia="Microsoft YaHei"/>
+          <w:b w:val="0"/>
+          <w:color w:val="1F2937"/>
+          <w:sz w:val="21"/>
+        </w:rPr>
+        <w:t>每张表生成可点击的推荐问题，并可跳转回智能问数页面。</w:t>
+      </w:r>
+    </w:p>
+    <w:p>
+      <w:pPr>
+        <w:pStyle w:val="ListBullet"/>
+        <w:spacing w:before="0" w:after="80" w:line="269" w:lineRule="auto"/>
+      </w:pPr>
+      <w:r>
+        <w:rPr>
+          <w:rFonts w:ascii="Calibri" w:hAnsi="Calibri" w:eastAsia="Microsoft YaHei"/>
+          <w:b w:val="0"/>
+          <w:color w:val="1F2937"/>
+          <w:sz w:val="21"/>
+        </w:rPr>
+        <w:t>数据库文件集中放在后端 data/runtime 目录中，避免根目录散乱。</w:t>
+      </w:r>
+    </w:p>
+    <w:p>
+      <w:pPr>
+        <w:spacing w:before="0" w:after="120" w:line="264" w:lineRule="auto"/>
+      </w:pPr>
+      <w:r>
+        <w:rPr>
+          <w:rFonts w:ascii="Calibri" w:hAnsi="Calibri" w:eastAsia="Microsoft YaHei"/>
+          <w:b w:val="0"/>
+          <w:color w:val="1F2937"/>
+          <w:sz w:val="21"/>
+        </w:rPr>
+        <w:t>当前演示数据表：</w:t>
+      </w:r>
+    </w:p>
+    <w:p>
+      <w:pPr>
+        <w:pStyle w:val="ListBullet"/>
+        <w:spacing w:before="0" w:after="80" w:line="269" w:lineRule="auto"/>
+      </w:pPr>
+      <w:r>
+        <w:rPr>
+          <w:rFonts w:ascii="Calibri" w:hAnsi="Calibri" w:eastAsia="Microsoft YaHei"/>
+          <w:b w:val="0"/>
+          <w:color w:val="1F2937"/>
+          <w:sz w:val="21"/>
+        </w:rPr>
+        <w:t>`house_price_monthly`：房价月度指标。</w:t>
+      </w:r>
+    </w:p>
+    <w:p>
+      <w:pPr>
+        <w:pStyle w:val="ListBullet"/>
+        <w:spacing w:before="0" w:after="80" w:line="269" w:lineRule="auto"/>
+      </w:pPr>
+      <w:r>
+        <w:rPr>
+          <w:rFonts w:ascii="Calibri" w:hAnsi="Calibri" w:eastAsia="Microsoft YaHei"/>
+          <w:b w:val="0"/>
+          <w:color w:val="1F2937"/>
+          <w:sz w:val="21"/>
+        </w:rPr>
+        <w:t>`housing_transactions`：住房成交指标。</w:t>
+      </w:r>
+    </w:p>
+    <w:p>
+      <w:pPr>
+        <w:pStyle w:val="ListBullet"/>
+        <w:spacing w:before="0" w:after="80" w:line="269" w:lineRule="auto"/>
+      </w:pPr>
+      <w:r>
+        <w:rPr>
+          <w:rFonts w:ascii="Calibri" w:hAnsi="Calibri" w:eastAsia="Microsoft YaHei"/>
+          <w:b w:val="0"/>
+          <w:color w:val="1F2937"/>
+          <w:sz w:val="21"/>
+        </w:rPr>
+        <w:t>`district_population`：区域人口指标。</w:t>
+      </w:r>
+    </w:p>
+    <w:p>
+      <w:pPr>
+        <w:pStyle w:val="ListBullet"/>
+        <w:spacing w:before="0" w:after="80" w:line="269" w:lineRule="auto"/>
+      </w:pPr>
+      <w:r>
+        <w:rPr>
+          <w:rFonts w:ascii="Calibri" w:hAnsi="Calibri" w:eastAsia="Microsoft YaHei"/>
+          <w:b w:val="0"/>
+          <w:color w:val="1F2937"/>
+          <w:sz w:val="21"/>
+        </w:rPr>
+        <w:t>`commuting_metrics`：通勤与就业指标。</w:t>
+      </w:r>
+    </w:p>
+    <w:p>
+      <w:pPr>
+        <w:pStyle w:val="ListBullet"/>
+        <w:spacing w:before="0" w:after="80" w:line="269" w:lineRule="auto"/>
+      </w:pPr>
+      <w:r>
+        <w:rPr>
+          <w:rFonts w:ascii="Calibri" w:hAnsi="Calibri" w:eastAsia="Microsoft YaHei"/>
+          <w:b w:val="0"/>
+          <w:color w:val="1F2937"/>
+          <w:sz w:val="21"/>
+        </w:rPr>
+        <w:t>`knowledge_items`：知识库条目。</w:t>
+      </w:r>
+    </w:p>
+    <w:p>
+      <w:pPr>
+        <w:pStyle w:val="ListBullet"/>
+        <w:spacing w:before="0" w:after="80" w:line="269" w:lineRule="auto"/>
+      </w:pPr>
+      <w:r>
+        <w:rPr>
+          <w:rFonts w:ascii="Calibri" w:hAnsi="Calibri" w:eastAsia="Microsoft YaHei"/>
+          <w:b w:val="0"/>
+          <w:color w:val="1F2937"/>
+          <w:sz w:val="21"/>
+        </w:rPr>
+        <w:t>`semantic_metrics`：语义指标库。</w:t>
+      </w:r>
+    </w:p>
+    <w:p>
+      <w:pPr>
+        <w:pStyle w:val="ListBullet"/>
+        <w:spacing w:before="0" w:after="80" w:line="269" w:lineRule="auto"/>
+      </w:pPr>
+      <w:r>
+        <w:rPr>
+          <w:rFonts w:ascii="Calibri" w:hAnsi="Calibri" w:eastAsia="Microsoft YaHei"/>
+          <w:b w:val="0"/>
+          <w:color w:val="1F2937"/>
+          <w:sz w:val="21"/>
+        </w:rPr>
+        <w:t>`conversations` / `messages` / `analysis_runs`：会话和分析运行状态。</w:t>
+      </w:r>
+    </w:p>
+    <w:p>
+      <w:pPr>
+        <w:pStyle w:val="ListBullet"/>
+        <w:spacing w:before="0" w:after="80" w:line="269" w:lineRule="auto"/>
+      </w:pPr>
+      <w:r>
+        <w:rPr>
+          <w:rFonts w:ascii="Calibri" w:hAnsi="Calibri" w:eastAsia="Microsoft YaHei"/>
+          <w:b w:val="0"/>
+          <w:color w:val="1F2937"/>
+          <w:sz w:val="21"/>
+        </w:rPr>
+        <w:t>`dashboards` / `dashboard_cards` / `share_links`：仪表盘和分享状态。</w:t>
+      </w:r>
+    </w:p>
+    <w:p>
+      <w:pPr>
+        <w:pStyle w:val="Heading3"/>
+      </w:pPr>
+      <w:r>
+        <w:t>3.3 知识库管理</w:t>
+      </w:r>
+    </w:p>
+    <w:p>
+      <w:pPr>
+        <w:spacing w:before="0" w:after="120" w:line="264" w:lineRule="auto"/>
+      </w:pPr>
+      <w:r>
+        <w:rPr>
+          <w:rFonts w:ascii="Calibri" w:hAnsi="Calibri" w:eastAsia="Microsoft YaHei"/>
+          <w:b w:val="0"/>
+          <w:color w:val="1F2937"/>
+          <w:sz w:val="21"/>
+        </w:rPr>
+        <w:t>知识库用于增强 Text-to-SQL 的业务理解能力。模型生成 SQL 前，后端会检索相关知识，将业务口径、字段说明、SQL 示例等内容作为上下文。</w:t>
+      </w:r>
+    </w:p>
+    <w:p>
+      <w:pPr>
+        <w:spacing w:before="0" w:after="120" w:line="264" w:lineRule="auto"/>
+      </w:pPr>
+      <w:r>
+        <w:rPr>
+          <w:rFonts w:ascii="Calibri" w:hAnsi="Calibri" w:eastAsia="Microsoft YaHei"/>
+          <w:b w:val="0"/>
+          <w:color w:val="1F2937"/>
+          <w:sz w:val="21"/>
+        </w:rPr>
+        <w:t>已实现能力：</w:t>
+      </w:r>
+    </w:p>
+    <w:p>
+      <w:pPr>
+        <w:pStyle w:val="ListBullet"/>
+        <w:spacing w:before="0" w:after="80" w:line="269" w:lineRule="auto"/>
+      </w:pPr>
+      <w:r>
+        <w:rPr>
+          <w:rFonts w:ascii="Calibri" w:hAnsi="Calibri" w:eastAsia="Microsoft YaHei"/>
+          <w:b w:val="0"/>
+          <w:color w:val="1F2937"/>
+          <w:sz w:val="21"/>
+        </w:rPr>
+        <w:t>私有 / 公共知识条目管理。</w:t>
+      </w:r>
+    </w:p>
+    <w:p>
+      <w:pPr>
+        <w:pStyle w:val="ListBullet"/>
+        <w:spacing w:before="0" w:after="80" w:line="269" w:lineRule="auto"/>
+      </w:pPr>
+      <w:r>
+        <w:rPr>
+          <w:rFonts w:ascii="Calibri" w:hAnsi="Calibri" w:eastAsia="Microsoft YaHei"/>
+          <w:b w:val="0"/>
+          <w:color w:val="1F2937"/>
+          <w:sz w:val="21"/>
+        </w:rPr>
+        <w:t>按标签、类型、范围筛选。</w:t>
+      </w:r>
+    </w:p>
+    <w:p>
+      <w:pPr>
+        <w:pStyle w:val="ListBullet"/>
+        <w:spacing w:before="0" w:after="80" w:line="269" w:lineRule="auto"/>
+      </w:pPr>
+      <w:r>
+        <w:rPr>
+          <w:rFonts w:ascii="Calibri" w:hAnsi="Calibri" w:eastAsia="Microsoft YaHei"/>
+          <w:b w:val="0"/>
+          <w:color w:val="1F2937"/>
+          <w:sz w:val="21"/>
+        </w:rPr>
+        <w:t>知识与数据表关系维护。</w:t>
+      </w:r>
+    </w:p>
+    <w:p>
+      <w:pPr>
+        <w:pStyle w:val="ListBullet"/>
+        <w:spacing w:before="0" w:after="80" w:line="269" w:lineRule="auto"/>
+      </w:pPr>
+      <w:r>
+        <w:rPr>
+          <w:rFonts w:ascii="Calibri" w:hAnsi="Calibri" w:eastAsia="Microsoft YaHei"/>
+          <w:b w:val="0"/>
+          <w:color w:val="1F2937"/>
+          <w:sz w:val="21"/>
+        </w:rPr>
+        <w:t>重复内容识别。</w:t>
+      </w:r>
+    </w:p>
+    <w:p>
+      <w:pPr>
+        <w:pStyle w:val="ListBullet"/>
+        <w:spacing w:before="0" w:after="80" w:line="269" w:lineRule="auto"/>
+      </w:pPr>
+      <w:r>
+        <w:rPr>
+          <w:rFonts w:ascii="Calibri" w:hAnsi="Calibri" w:eastAsia="Microsoft YaHei"/>
+          <w:b w:val="0"/>
+          <w:color w:val="1F2937"/>
+          <w:sz w:val="21"/>
+        </w:rPr>
+        <w:t>私有知识优先级覆盖。</w:t>
+      </w:r>
+    </w:p>
+    <w:p>
+      <w:pPr>
+        <w:pStyle w:val="ListBullet"/>
+        <w:spacing w:before="0" w:after="80" w:line="269" w:lineRule="auto"/>
+      </w:pPr>
+      <w:r>
+        <w:rPr>
+          <w:rFonts w:ascii="Calibri" w:hAnsi="Calibri" w:eastAsia="Microsoft YaHei"/>
+          <w:b w:val="0"/>
+          <w:color w:val="1F2937"/>
+          <w:sz w:val="21"/>
+        </w:rPr>
+        <w:t>字段同步、模型同步和冲突提示。</w:t>
+      </w:r>
+    </w:p>
+    <w:p>
+      <w:pPr>
+        <w:pStyle w:val="Heading3"/>
+      </w:pPr>
+      <w:r>
+        <w:t>3.4 DeepSeek Text-to-SQL 与离线兜底</w:t>
+      </w:r>
+    </w:p>
+    <w:p>
+      <w:pPr>
+        <w:spacing w:before="0" w:after="120" w:line="264" w:lineRule="auto"/>
+      </w:pPr>
+      <w:r>
+        <w:rPr>
+          <w:rFonts w:ascii="Calibri" w:hAnsi="Calibri" w:eastAsia="Microsoft YaHei"/>
+          <w:b w:val="0"/>
+          <w:color w:val="1F2937"/>
+          <w:sz w:val="21"/>
+        </w:rPr>
+        <w:t>系统支持两种模型模式：</w:t>
+      </w:r>
+    </w:p>
+    <w:p>
+      <w:pPr>
+        <w:pStyle w:val="ListBullet"/>
+        <w:spacing w:before="0" w:after="80" w:line="269" w:lineRule="auto"/>
+      </w:pPr>
+      <w:r>
+        <w:rPr>
+          <w:rFonts w:ascii="Calibri" w:hAnsi="Calibri" w:eastAsia="Microsoft YaHei"/>
+          <w:b w:val="0"/>
+          <w:color w:val="1F2937"/>
+          <w:sz w:val="21"/>
+        </w:rPr>
+        <w:t>`offline`：默认模式，使用本地规则生成可演示的 SQL 和图表结果。</w:t>
+      </w:r>
+    </w:p>
+    <w:p>
+      <w:pPr>
+        <w:pStyle w:val="ListBullet"/>
+        <w:spacing w:before="0" w:after="80" w:line="269" w:lineRule="auto"/>
+      </w:pPr>
+      <w:r>
+        <w:rPr>
+          <w:rFonts w:ascii="Calibri" w:hAnsi="Calibri" w:eastAsia="Microsoft YaHei"/>
+          <w:b w:val="0"/>
+          <w:color w:val="1F2937"/>
+          <w:sz w:val="21"/>
+        </w:rPr>
+        <w:t>`deepseek`：在线模式，调用 DeepSeek API 生成 SQL。</w:t>
+      </w:r>
+    </w:p>
+    <w:p>
+      <w:pPr>
+        <w:spacing w:before="0" w:after="120" w:line="264" w:lineRule="auto"/>
+      </w:pPr>
+      <w:r>
+        <w:rPr>
+          <w:rFonts w:ascii="Calibri" w:hAnsi="Calibri" w:eastAsia="Microsoft YaHei"/>
+          <w:b w:val="0"/>
+          <w:color w:val="1F2937"/>
+          <w:sz w:val="21"/>
+        </w:rPr>
+        <w:t>已实现能力：</w:t>
+      </w:r>
+    </w:p>
+    <w:p>
+      <w:pPr>
+        <w:pStyle w:val="ListBullet"/>
+        <w:spacing w:before="0" w:after="80" w:line="269" w:lineRule="auto"/>
+      </w:pPr>
+      <w:r>
+        <w:rPr>
+          <w:rFonts w:ascii="Calibri" w:hAnsi="Calibri" w:eastAsia="Microsoft YaHei"/>
+          <w:b w:val="0"/>
+          <w:color w:val="1F2937"/>
+          <w:sz w:val="21"/>
+        </w:rPr>
+        <w:t>页面内配置 API Key、Base URL 和 Model。</w:t>
+      </w:r>
+    </w:p>
+    <w:p>
+      <w:pPr>
+        <w:pStyle w:val="ListBullet"/>
+        <w:spacing w:before="0" w:after="80" w:line="269" w:lineRule="auto"/>
+      </w:pPr>
+      <w:r>
+        <w:rPr>
+          <w:rFonts w:ascii="Calibri" w:hAnsi="Calibri" w:eastAsia="Microsoft YaHei"/>
+          <w:b w:val="0"/>
+          <w:color w:val="1F2937"/>
+          <w:sz w:val="21"/>
+        </w:rPr>
+        <w:t>后端运行时保存配置，前端只展示脱敏 API Key。</w:t>
+      </w:r>
+    </w:p>
+    <w:p>
+      <w:pPr>
+        <w:pStyle w:val="ListBullet"/>
+        <w:spacing w:before="0" w:after="80" w:line="269" w:lineRule="auto"/>
+      </w:pPr>
+      <w:r>
+        <w:rPr>
+          <w:rFonts w:ascii="Calibri" w:hAnsi="Calibri" w:eastAsia="Microsoft YaHei"/>
+          <w:b w:val="0"/>
+          <w:color w:val="1F2937"/>
+          <w:sz w:val="21"/>
+        </w:rPr>
+        <w:t>DeepSeek 默认配置已抽离到独立配置文件，便于后续替换模型服务。</w:t>
+      </w:r>
+    </w:p>
+    <w:p>
+      <w:pPr>
+        <w:pStyle w:val="ListBullet"/>
+        <w:spacing w:before="0" w:after="80" w:line="269" w:lineRule="auto"/>
+      </w:pPr>
+      <w:r>
+        <w:rPr>
+          <w:rFonts w:ascii="Calibri" w:hAnsi="Calibri" w:eastAsia="Microsoft YaHei"/>
+          <w:b w:val="0"/>
+          <w:color w:val="1F2937"/>
+          <w:sz w:val="21"/>
+        </w:rPr>
+        <w:t>连接测试支持错误分类：缺少 Key、超时、鉴权失败、限流、网络异常、服务异常。</w:t>
+      </w:r>
+    </w:p>
+    <w:p>
+      <w:pPr>
+        <w:pStyle w:val="ListBullet"/>
+        <w:spacing w:before="0" w:after="80" w:line="269" w:lineRule="auto"/>
+      </w:pPr>
+      <w:r>
+        <w:rPr>
+          <w:rFonts w:ascii="Calibri" w:hAnsi="Calibri" w:eastAsia="Microsoft YaHei"/>
+          <w:b w:val="0"/>
+          <w:color w:val="1F2937"/>
+          <w:sz w:val="21"/>
+        </w:rPr>
+        <w:t>Text-to-SQL 失败时返回更明确的错误提示，并允许切回离线规则模式演示。</w:t>
+      </w:r>
+    </w:p>
+    <w:p>
+      <w:pPr>
+        <w:pStyle w:val="Heading3"/>
+      </w:pPr>
+      <w:r>
+        <w:t>3.5 图表和仪表盘</w:t>
+      </w:r>
+    </w:p>
+    <w:p>
+      <w:pPr>
+        <w:spacing w:before="0" w:after="120" w:line="264" w:lineRule="auto"/>
+      </w:pPr>
+      <w:r>
+        <w:rPr>
+          <w:rFonts w:ascii="Calibri" w:hAnsi="Calibri" w:eastAsia="Microsoft YaHei"/>
+          <w:b w:val="0"/>
+          <w:color w:val="1F2937"/>
+          <w:sz w:val="21"/>
+        </w:rPr>
+        <w:t>问数结果可以保存到仪表盘，形成可持续查看的分析看板。</w:t>
+      </w:r>
+    </w:p>
+    <w:p>
+      <w:pPr>
+        <w:spacing w:before="0" w:after="120" w:line="264" w:lineRule="auto"/>
+      </w:pPr>
+      <w:r>
+        <w:rPr>
+          <w:rFonts w:ascii="Calibri" w:hAnsi="Calibri" w:eastAsia="Microsoft YaHei"/>
+          <w:b w:val="0"/>
+          <w:color w:val="1F2937"/>
+          <w:sz w:val="21"/>
+        </w:rPr>
+        <w:t>已实现能力：</w:t>
+      </w:r>
+    </w:p>
+    <w:p>
+      <w:pPr>
+        <w:pStyle w:val="ListBullet"/>
+        <w:spacing w:before="0" w:after="80" w:line="269" w:lineRule="auto"/>
+      </w:pPr>
+      <w:r>
+        <w:rPr>
+          <w:rFonts w:ascii="Calibri" w:hAnsi="Calibri" w:eastAsia="Microsoft YaHei"/>
+          <w:b w:val="0"/>
+          <w:color w:val="1F2937"/>
+          <w:sz w:val="21"/>
+        </w:rPr>
+        <w:t>新建多个仪表盘。</w:t>
+      </w:r>
+    </w:p>
+    <w:p>
+      <w:pPr>
+        <w:pStyle w:val="ListBullet"/>
+        <w:spacing w:before="0" w:after="80" w:line="269" w:lineRule="auto"/>
+      </w:pPr>
+      <w:r>
+        <w:rPr>
+          <w:rFonts w:ascii="Calibri" w:hAnsi="Calibri" w:eastAsia="Microsoft YaHei"/>
+          <w:b w:val="0"/>
+          <w:color w:val="1F2937"/>
+          <w:sz w:val="21"/>
+        </w:rPr>
+        <w:t>仪表盘支持自定义名称和重命名。</w:t>
+      </w:r>
+    </w:p>
+    <w:p>
+      <w:pPr>
+        <w:pStyle w:val="ListBullet"/>
+        <w:spacing w:before="0" w:after="80" w:line="269" w:lineRule="auto"/>
+      </w:pPr>
+      <w:r>
+        <w:rPr>
+          <w:rFonts w:ascii="Calibri" w:hAnsi="Calibri" w:eastAsia="Microsoft YaHei"/>
+          <w:b w:val="0"/>
+          <w:color w:val="1F2937"/>
+          <w:sz w:val="21"/>
+        </w:rPr>
+        <w:t>重命名时校验空名称和重复名称。</w:t>
+      </w:r>
+    </w:p>
+    <w:p>
+      <w:pPr>
+        <w:pStyle w:val="ListBullet"/>
+        <w:spacing w:before="0" w:after="80" w:line="269" w:lineRule="auto"/>
+      </w:pPr>
+      <w:r>
+        <w:rPr>
+          <w:rFonts w:ascii="Calibri" w:hAnsi="Calibri" w:eastAsia="Microsoft YaHei"/>
+          <w:b w:val="0"/>
+          <w:color w:val="1F2937"/>
+          <w:sz w:val="21"/>
+        </w:rPr>
+        <w:t>两列看板布局。</w:t>
+      </w:r>
+    </w:p>
+    <w:p>
+      <w:pPr>
+        <w:pStyle w:val="ListBullet"/>
+        <w:spacing w:before="0" w:after="80" w:line="269" w:lineRule="auto"/>
+      </w:pPr>
+      <w:r>
+        <w:rPr>
+          <w:rFonts w:ascii="Calibri" w:hAnsi="Calibri" w:eastAsia="Microsoft YaHei"/>
+          <w:b w:val="0"/>
+          <w:color w:val="1F2937"/>
+          <w:sz w:val="21"/>
+        </w:rPr>
+        <w:t>卡片拖拽排序，并提供蓝色虚线占位提示。</w:t>
+      </w:r>
+    </w:p>
+    <w:p>
+      <w:pPr>
+        <w:pStyle w:val="ListBullet"/>
+        <w:spacing w:before="0" w:after="80" w:line="269" w:lineRule="auto"/>
+      </w:pPr>
+      <w:r>
+        <w:rPr>
+          <w:rFonts w:ascii="Calibri" w:hAnsi="Calibri" w:eastAsia="Microsoft YaHei"/>
+          <w:b w:val="0"/>
+          <w:color w:val="1F2937"/>
+          <w:sz w:val="21"/>
+        </w:rPr>
+        <w:t>图表类型切换：折线图、柱状图、饼图、散点图、堆叠柱状图、表格。</w:t>
+      </w:r>
+    </w:p>
+    <w:p>
+      <w:pPr>
+        <w:pStyle w:val="ListBullet"/>
+        <w:spacing w:before="0" w:after="80" w:line="269" w:lineRule="auto"/>
+      </w:pPr>
+      <w:r>
+        <w:rPr>
+          <w:rFonts w:ascii="Calibri" w:hAnsi="Calibri" w:eastAsia="Microsoft YaHei"/>
+          <w:b w:val="0"/>
+          <w:color w:val="1F2937"/>
+          <w:sz w:val="21"/>
+        </w:rPr>
+        <w:t>年份、区域、指标筛选器。</w:t>
+      </w:r>
+    </w:p>
+    <w:p>
+      <w:pPr>
+        <w:pStyle w:val="ListBullet"/>
+        <w:spacing w:before="0" w:after="80" w:line="269" w:lineRule="auto"/>
+      </w:pPr>
+      <w:r>
+        <w:rPr>
+          <w:rFonts w:ascii="Calibri" w:hAnsi="Calibri" w:eastAsia="Microsoft YaHei"/>
+          <w:b w:val="0"/>
+          <w:color w:val="1F2937"/>
+          <w:sz w:val="21"/>
+        </w:rPr>
+        <w:t>卡片刷新、放大、移除。</w:t>
+      </w:r>
+    </w:p>
+    <w:p>
+      <w:pPr>
+        <w:pStyle w:val="ListBullet"/>
+        <w:spacing w:before="0" w:after="80" w:line="269" w:lineRule="auto"/>
+      </w:pPr>
+      <w:r>
+        <w:rPr>
+          <w:rFonts w:ascii="Calibri" w:hAnsi="Calibri" w:eastAsia="Microsoft YaHei"/>
+          <w:b w:val="0"/>
+          <w:color w:val="1F2937"/>
+          <w:sz w:val="21"/>
+        </w:rPr>
+        <w:t>本地只读分享页。</w:t>
+      </w:r>
+    </w:p>
+    <w:p>
+      <w:pPr>
+        <w:pStyle w:val="Heading3"/>
+      </w:pPr>
+      <w:r>
+        <w:t>3.6 项目文档和测试</w:t>
+      </w:r>
+    </w:p>
+    <w:p>
+      <w:pPr>
+        <w:spacing w:before="0" w:after="120" w:line="264" w:lineRule="auto"/>
+      </w:pPr>
+      <w:r>
+        <w:rPr>
+          <w:rFonts w:ascii="Calibri" w:hAnsi="Calibri" w:eastAsia="Microsoft YaHei"/>
+          <w:b w:val="0"/>
+          <w:color w:val="1F2937"/>
+          <w:sz w:val="21"/>
+        </w:rPr>
+        <w:t>当前项目已包含 README、设计文档、实施计划书和自动化测试。</w:t>
+      </w:r>
+    </w:p>
+    <w:p>
+      <w:pPr>
+        <w:spacing w:before="0" w:after="120" w:line="264" w:lineRule="auto"/>
+      </w:pPr>
+      <w:r>
+        <w:rPr>
+          <w:rFonts w:ascii="Calibri" w:hAnsi="Calibri" w:eastAsia="Microsoft YaHei"/>
+          <w:b w:val="0"/>
+          <w:color w:val="1F2937"/>
+          <w:sz w:val="21"/>
+        </w:rPr>
+        <w:t>已实现验证：</w:t>
+      </w:r>
+    </w:p>
+    <w:p>
+      <w:pPr>
+        <w:pStyle w:val="ListBullet"/>
+        <w:spacing w:before="0" w:after="80" w:line="269" w:lineRule="auto"/>
+      </w:pPr>
+      <w:r>
+        <w:rPr>
+          <w:rFonts w:ascii="Calibri" w:hAnsi="Calibri" w:eastAsia="Microsoft YaHei"/>
+          <w:b w:val="0"/>
+          <w:color w:val="1F2937"/>
+          <w:sz w:val="21"/>
+        </w:rPr>
+        <w:t>后端测试覆盖 SQL Guard、会话历史、DeepSeek 错误分类、数据源、知识库、仪表盘 API。</w:t>
+      </w:r>
+    </w:p>
+    <w:p>
+      <w:pPr>
+        <w:pStyle w:val="ListBullet"/>
+        <w:spacing w:before="0" w:after="80" w:line="269" w:lineRule="auto"/>
+      </w:pPr>
+      <w:r>
+        <w:rPr>
+          <w:rFonts w:ascii="Calibri" w:hAnsi="Calibri" w:eastAsia="Microsoft YaHei"/>
+          <w:b w:val="0"/>
+          <w:color w:val="1F2937"/>
+          <w:sz w:val="21"/>
+        </w:rPr>
+        <w:t>前端测试覆盖智能问数、历史会话、图表切换、数据源推荐问题、仪表盘创建/重命名、运行配置和分享页。</w:t>
+      </w:r>
+    </w:p>
+    <w:p>
+      <w:pPr>
+        <w:pStyle w:val="ListBullet"/>
+        <w:spacing w:before="0" w:after="80" w:line="269" w:lineRule="auto"/>
+      </w:pPr>
+      <w:r>
+        <w:rPr>
+          <w:rFonts w:ascii="Calibri" w:hAnsi="Calibri" w:eastAsia="Microsoft YaHei"/>
+          <w:b w:val="0"/>
+          <w:color w:val="1F2937"/>
+          <w:sz w:val="21"/>
+        </w:rPr>
+        <w:t>前端生产构建通过。</w:t>
+      </w:r>
+    </w:p>
+    <w:p>
+      <w:pPr>
+        <w:pStyle w:val="Heading2"/>
+      </w:pPr>
+      <w:r>
+        <w:t>4. 技术架构</w:t>
+      </w:r>
+    </w:p>
+    <w:p>
+      <w:pPr>
+        <w:spacing w:before="40" w:after="120" w:line="240" w:lineRule="auto"/>
+      </w:pPr>
+      <w:r>
+        <w:rPr>
+          <w:rFonts w:ascii="Consolas" w:hAnsi="Consolas" w:eastAsia="Microsoft YaHei"/>
+          <w:color w:val="334155"/>
+          <w:sz w:val="17"/>
+        </w:rPr>
+        <w:t>flowchart LR</w:t>
+      </w:r>
+      <w:r>
+        <w:br/>
+      </w:r>
+      <w:r>
+        <w:rPr>
+          <w:rFonts w:ascii="Consolas" w:hAnsi="Consolas" w:eastAsia="Microsoft YaHei"/>
+          <w:color w:val="334155"/>
+          <w:sz w:val="17"/>
+        </w:rPr>
+        <w:t xml:space="preserve">  USER[用户自然语言问题]</w:t>
+      </w:r>
+      <w:r>
+        <w:br/>
+      </w:r>
+      <w:r>
+        <w:rPr>
+          <w:rFonts w:ascii="Consolas" w:hAnsi="Consolas" w:eastAsia="Microsoft YaHei"/>
+          <w:color w:val="334155"/>
+          <w:sz w:val="17"/>
+        </w:rPr>
+        <w:t xml:space="preserve">  UI[React + TypeScript 前端]</w:t>
+      </w:r>
+      <w:r>
+        <w:br/>
+      </w:r>
+      <w:r>
+        <w:rPr>
+          <w:rFonts w:ascii="Consolas" w:hAnsi="Consolas" w:eastAsia="Microsoft YaHei"/>
+          <w:color w:val="334155"/>
+          <w:sz w:val="17"/>
+        </w:rPr>
+        <w:t xml:space="preserve">  API[FastAPI REST API]</w:t>
+      </w:r>
+      <w:r>
+        <w:br/>
+      </w:r>
+      <w:r>
+        <w:rPr>
+          <w:rFonts w:ascii="Consolas" w:hAnsi="Consolas" w:eastAsia="Microsoft YaHei"/>
+          <w:color w:val="334155"/>
+          <w:sz w:val="17"/>
+        </w:rPr>
+        <w:t xml:space="preserve">  ORCH[会话与分析编排服务]</w:t>
+      </w:r>
+      <w:r>
+        <w:br/>
+      </w:r>
+      <w:r>
+        <w:rPr>
+          <w:rFonts w:ascii="Consolas" w:hAnsi="Consolas" w:eastAsia="Microsoft YaHei"/>
+          <w:color w:val="334155"/>
+          <w:sz w:val="17"/>
+        </w:rPr>
+        <w:t xml:space="preserve">  RAG[知识检索增强]</w:t>
+      </w:r>
+      <w:r>
+        <w:br/>
+      </w:r>
+      <w:r>
+        <w:rPr>
+          <w:rFonts w:ascii="Consolas" w:hAnsi="Consolas" w:eastAsia="Microsoft YaHei"/>
+          <w:color w:val="334155"/>
+          <w:sz w:val="17"/>
+        </w:rPr>
+        <w:t xml:space="preserve">  LLM[DeepSeek Text-to-SQL / 离线规则]</w:t>
+      </w:r>
+      <w:r>
+        <w:br/>
+      </w:r>
+      <w:r>
+        <w:rPr>
+          <w:rFonts w:ascii="Consolas" w:hAnsi="Consolas" w:eastAsia="Microsoft YaHei"/>
+          <w:color w:val="334155"/>
+          <w:sz w:val="17"/>
+        </w:rPr>
+        <w:t xml:space="preserve">  GUARD[只读 SQL Guard]</w:t>
+      </w:r>
+      <w:r>
+        <w:br/>
+      </w:r>
+      <w:r>
+        <w:rPr>
+          <w:rFonts w:ascii="Consolas" w:hAnsi="Consolas" w:eastAsia="Microsoft YaHei"/>
+          <w:color w:val="334155"/>
+          <w:sz w:val="17"/>
+        </w:rPr>
+        <w:t xml:space="preserve">  DB[(SQLite Demo Database)]</w:t>
+      </w:r>
+      <w:r>
+        <w:br/>
+      </w:r>
+      <w:r>
+        <w:rPr>
+          <w:rFonts w:ascii="Consolas" w:hAnsi="Consolas" w:eastAsia="Microsoft YaHei"/>
+          <w:color w:val="334155"/>
+          <w:sz w:val="17"/>
+        </w:rPr>
+        <w:t xml:space="preserve">  CHART[图表与仪表盘]</w:t>
+      </w:r>
+      <w:r>
+        <w:br/>
+      </w:r>
+      <w:r>
+        <w:rPr>
+          <w:rFonts w:ascii="Consolas" w:hAnsi="Consolas" w:eastAsia="Microsoft YaHei"/>
+          <w:color w:val="334155"/>
+          <w:sz w:val="17"/>
+        </w:rPr>
+      </w:r>
+      <w:r>
+        <w:br/>
+      </w:r>
+      <w:r>
+        <w:rPr>
+          <w:rFonts w:ascii="Consolas" w:hAnsi="Consolas" w:eastAsia="Microsoft YaHei"/>
+          <w:color w:val="334155"/>
+          <w:sz w:val="17"/>
+        </w:rPr>
+        <w:t xml:space="preserve">  USER --&gt; UI</w:t>
+      </w:r>
+      <w:r>
+        <w:br/>
+      </w:r>
+      <w:r>
+        <w:rPr>
+          <w:rFonts w:ascii="Consolas" w:hAnsi="Consolas" w:eastAsia="Microsoft YaHei"/>
+          <w:color w:val="334155"/>
+          <w:sz w:val="17"/>
+        </w:rPr>
+        <w:t xml:space="preserve">  UI --&gt; API</w:t>
+      </w:r>
+      <w:r>
+        <w:br/>
+      </w:r>
+      <w:r>
+        <w:rPr>
+          <w:rFonts w:ascii="Consolas" w:hAnsi="Consolas" w:eastAsia="Microsoft YaHei"/>
+          <w:color w:val="334155"/>
+          <w:sz w:val="17"/>
+        </w:rPr>
+        <w:t xml:space="preserve">  API --&gt; ORCH</w:t>
+      </w:r>
+      <w:r>
+        <w:br/>
+      </w:r>
+      <w:r>
+        <w:rPr>
+          <w:rFonts w:ascii="Consolas" w:hAnsi="Consolas" w:eastAsia="Microsoft YaHei"/>
+          <w:color w:val="334155"/>
+          <w:sz w:val="17"/>
+        </w:rPr>
+        <w:t xml:space="preserve">  ORCH --&gt; RAG</w:t>
+      </w:r>
+      <w:r>
+        <w:br/>
+      </w:r>
+      <w:r>
+        <w:rPr>
+          <w:rFonts w:ascii="Consolas" w:hAnsi="Consolas" w:eastAsia="Microsoft YaHei"/>
+          <w:color w:val="334155"/>
+          <w:sz w:val="17"/>
+        </w:rPr>
+        <w:t xml:space="preserve">  ORCH --&gt; LLM</w:t>
+      </w:r>
+      <w:r>
+        <w:br/>
+      </w:r>
+      <w:r>
+        <w:rPr>
+          <w:rFonts w:ascii="Consolas" w:hAnsi="Consolas" w:eastAsia="Microsoft YaHei"/>
+          <w:color w:val="334155"/>
+          <w:sz w:val="17"/>
+        </w:rPr>
+        <w:t xml:space="preserve">  LLM --&gt; GUARD</w:t>
+      </w:r>
+      <w:r>
+        <w:br/>
+      </w:r>
+      <w:r>
+        <w:rPr>
+          <w:rFonts w:ascii="Consolas" w:hAnsi="Consolas" w:eastAsia="Microsoft YaHei"/>
+          <w:color w:val="334155"/>
+          <w:sz w:val="17"/>
+        </w:rPr>
+        <w:t xml:space="preserve">  GUARD --&gt; DB</w:t>
+      </w:r>
+      <w:r>
+        <w:br/>
+      </w:r>
+      <w:r>
+        <w:rPr>
+          <w:rFonts w:ascii="Consolas" w:hAnsi="Consolas" w:eastAsia="Microsoft YaHei"/>
+          <w:color w:val="334155"/>
+          <w:sz w:val="17"/>
+        </w:rPr>
+        <w:t xml:space="preserve">  DB --&gt; ORCH</w:t>
+      </w:r>
+      <w:r>
+        <w:br/>
+      </w:r>
+      <w:r>
+        <w:rPr>
+          <w:rFonts w:ascii="Consolas" w:hAnsi="Consolas" w:eastAsia="Microsoft YaHei"/>
+          <w:color w:val="334155"/>
+          <w:sz w:val="17"/>
+        </w:rPr>
+        <w:t xml:space="preserve">  ORCH --&gt; CHART</w:t>
+      </w:r>
+      <w:r>
+        <w:br/>
+      </w:r>
+      <w:r>
+        <w:rPr>
+          <w:rFonts w:ascii="Consolas" w:hAnsi="Consolas" w:eastAsia="Microsoft YaHei"/>
+          <w:color w:val="334155"/>
+          <w:sz w:val="17"/>
+        </w:rPr>
+        <w:t xml:space="preserve">  CHART --&gt; UI</w:t>
+      </w:r>
+    </w:p>
+    <w:p>
+      <w:pPr>
+        <w:pStyle w:val="Heading3"/>
+      </w:pPr>
+      <w:r>
+        <w:t>4.1 前端架构</w:t>
+      </w:r>
+    </w:p>
+    <w:p>
+      <w:pPr>
+        <w:spacing w:before="0" w:after="120" w:line="264" w:lineRule="auto"/>
+      </w:pPr>
+      <w:r>
+        <w:rPr>
+          <w:rFonts w:ascii="Calibri" w:hAnsi="Calibri" w:eastAsia="Microsoft YaHei"/>
+          <w:b w:val="0"/>
+          <w:color w:val="1F2937"/>
+          <w:sz w:val="21"/>
+        </w:rPr>
+        <w:t>前端使用 React + Vite + TypeScript，页面按业务工作区组织：</w:t>
+      </w:r>
+    </w:p>
+    <w:p>
+      <w:pPr>
+        <w:pStyle w:val="ListBullet"/>
+        <w:spacing w:before="0" w:after="80" w:line="269" w:lineRule="auto"/>
+      </w:pPr>
+      <w:r>
+        <w:rPr>
+          <w:rFonts w:ascii="Calibri" w:hAnsi="Calibri" w:eastAsia="Microsoft YaHei"/>
+          <w:b w:val="0"/>
+          <w:color w:val="1F2937"/>
+          <w:sz w:val="21"/>
+        </w:rPr>
+        <w:t>`QueryWorkspace`：智能问数主页面。</w:t>
+      </w:r>
+    </w:p>
+    <w:p>
+      <w:pPr>
+        <w:pStyle w:val="ListBullet"/>
+        <w:spacing w:before="0" w:after="80" w:line="269" w:lineRule="auto"/>
+      </w:pPr>
+      <w:r>
+        <w:rPr>
+          <w:rFonts w:ascii="Calibri" w:hAnsi="Calibri" w:eastAsia="Microsoft YaHei"/>
+          <w:b w:val="0"/>
+          <w:color w:val="1F2937"/>
+          <w:sz w:val="21"/>
+        </w:rPr>
+        <w:t>`DataSourceWorkspace`：数据源管理。</w:t>
+      </w:r>
+    </w:p>
+    <w:p>
+      <w:pPr>
+        <w:pStyle w:val="ListBullet"/>
+        <w:spacing w:before="0" w:after="80" w:line="269" w:lineRule="auto"/>
+      </w:pPr>
+      <w:r>
+        <w:rPr>
+          <w:rFonts w:ascii="Calibri" w:hAnsi="Calibri" w:eastAsia="Microsoft YaHei"/>
+          <w:b w:val="0"/>
+          <w:color w:val="1F2937"/>
+          <w:sz w:val="21"/>
+        </w:rPr>
+        <w:t>`KnowledgeWorkspace`：知识库管理。</w:t>
+      </w:r>
+    </w:p>
+    <w:p>
+      <w:pPr>
+        <w:pStyle w:val="ListBullet"/>
+        <w:spacing w:before="0" w:after="80" w:line="269" w:lineRule="auto"/>
+      </w:pPr>
+      <w:r>
+        <w:rPr>
+          <w:rFonts w:ascii="Calibri" w:hAnsi="Calibri" w:eastAsia="Microsoft YaHei"/>
+          <w:b w:val="0"/>
+          <w:color w:val="1F2937"/>
+          <w:sz w:val="21"/>
+        </w:rPr>
+        <w:t>`DashboardWorkspace`：仪表盘管理。</w:t>
+      </w:r>
+    </w:p>
+    <w:p>
+      <w:pPr>
+        <w:pStyle w:val="ListBullet"/>
+        <w:spacing w:before="0" w:after="80" w:line="269" w:lineRule="auto"/>
+      </w:pPr>
+      <w:r>
+        <w:rPr>
+          <w:rFonts w:ascii="Calibri" w:hAnsi="Calibri" w:eastAsia="Microsoft YaHei"/>
+          <w:b w:val="0"/>
+          <w:color w:val="1F2937"/>
+          <w:sz w:val="21"/>
+        </w:rPr>
+        <w:t>`SettingsWorkspace`：DeepSeek API 配置。</w:t>
+      </w:r>
+    </w:p>
+    <w:p>
+      <w:pPr>
+        <w:pStyle w:val="ListBullet"/>
+        <w:spacing w:before="0" w:after="80" w:line="269" w:lineRule="auto"/>
+      </w:pPr>
+      <w:r>
+        <w:rPr>
+          <w:rFonts w:ascii="Calibri" w:hAnsi="Calibri" w:eastAsia="Microsoft YaHei"/>
+          <w:b w:val="0"/>
+          <w:color w:val="1F2937"/>
+          <w:sz w:val="21"/>
+        </w:rPr>
+        <w:t>`SharedDashboardPage`：只读分享页。</w:t>
+      </w:r>
+    </w:p>
+    <w:p>
+      <w:pPr>
+        <w:spacing w:before="0" w:after="120" w:line="264" w:lineRule="auto"/>
+      </w:pPr>
+      <w:r>
+        <w:rPr>
+          <w:rFonts w:ascii="Calibri" w:hAnsi="Calibri" w:eastAsia="Microsoft YaHei"/>
+          <w:b w:val="0"/>
+          <w:color w:val="1F2937"/>
+          <w:sz w:val="21"/>
+        </w:rPr>
+        <w:t>近期重构重点：</w:t>
+      </w:r>
+    </w:p>
+    <w:p>
+      <w:pPr>
+        <w:pStyle w:val="ListBullet"/>
+        <w:spacing w:before="0" w:after="80" w:line="269" w:lineRule="auto"/>
+      </w:pPr>
+      <w:r>
+        <w:rPr>
+          <w:rFonts w:ascii="Calibri" w:hAnsi="Calibri" w:eastAsia="Microsoft YaHei"/>
+          <w:b w:val="0"/>
+          <w:color w:val="1F2937"/>
+          <w:sz w:val="21"/>
+        </w:rPr>
+        <w:t>QueryWorkspace 拆出模型配置 hook、仪表盘保存 hook 和输入组件。</w:t>
+      </w:r>
+    </w:p>
+    <w:p>
+      <w:pPr>
+        <w:pStyle w:val="ListBullet"/>
+        <w:spacing w:before="0" w:after="80" w:line="269" w:lineRule="auto"/>
+      </w:pPr>
+      <w:r>
+        <w:rPr>
+          <w:rFonts w:ascii="Calibri" w:hAnsi="Calibri" w:eastAsia="Microsoft YaHei"/>
+          <w:b w:val="0"/>
+          <w:color w:val="1F2937"/>
+          <w:sz w:val="21"/>
+        </w:rPr>
+        <w:t>AnalysisChart 拆出图表类型、数据转换和图表配置。</w:t>
+      </w:r>
+    </w:p>
+    <w:p>
+      <w:pPr>
+        <w:pStyle w:val="ListBullet"/>
+        <w:spacing w:before="0" w:after="80" w:line="269" w:lineRule="auto"/>
+      </w:pPr>
+      <w:r>
+        <w:rPr>
+          <w:rFonts w:ascii="Calibri" w:hAnsi="Calibri" w:eastAsia="Microsoft YaHei"/>
+          <w:b w:val="0"/>
+          <w:color w:val="1F2937"/>
+          <w:sz w:val="21"/>
+        </w:rPr>
+        <w:t>图表样式从全局 CSS 拆出到独立样式文件。</w:t>
+      </w:r>
+    </w:p>
+    <w:p>
+      <w:pPr>
+        <w:pStyle w:val="ListBullet"/>
+        <w:spacing w:before="0" w:after="80" w:line="269" w:lineRule="auto"/>
+      </w:pPr>
+      <w:r>
+        <w:rPr>
+          <w:rFonts w:ascii="Calibri" w:hAnsi="Calibri" w:eastAsia="Microsoft YaHei"/>
+          <w:b w:val="0"/>
+          <w:color w:val="1F2937"/>
+          <w:sz w:val="21"/>
+        </w:rPr>
+        <w:t>前端模型默认配置抽离到 `frontend/src/config/modelDefaults.ts`。</w:t>
+      </w:r>
+    </w:p>
+    <w:p>
+      <w:pPr>
+        <w:pStyle w:val="Heading3"/>
+      </w:pPr>
+      <w:r>
+        <w:t>4.2 后端架构</w:t>
+      </w:r>
+    </w:p>
+    <w:p>
+      <w:pPr>
+        <w:spacing w:before="0" w:after="120" w:line="264" w:lineRule="auto"/>
+      </w:pPr>
+      <w:r>
+        <w:rPr>
+          <w:rFonts w:ascii="Calibri" w:hAnsi="Calibri" w:eastAsia="Microsoft YaHei"/>
+          <w:b w:val="0"/>
+          <w:color w:val="1F2937"/>
+          <w:sz w:val="21"/>
+        </w:rPr>
+        <w:t>后端使用 FastAPI + SQLAlchemy，按以下层次组织：</w:t>
+      </w:r>
+    </w:p>
+    <w:p>
+      <w:pPr>
+        <w:pStyle w:val="ListBullet"/>
+        <w:spacing w:before="0" w:after="80" w:line="269" w:lineRule="auto"/>
+      </w:pPr>
+      <w:r>
+        <w:rPr>
+          <w:rFonts w:ascii="Calibri" w:hAnsi="Calibri" w:eastAsia="Microsoft YaHei"/>
+          <w:b w:val="0"/>
+          <w:color w:val="1F2937"/>
+          <w:sz w:val="21"/>
+        </w:rPr>
+        <w:t>`api/`：HTTP 路由和响应模型。</w:t>
+      </w:r>
+    </w:p>
+    <w:p>
+      <w:pPr>
+        <w:pStyle w:val="ListBullet"/>
+        <w:spacing w:before="0" w:after="80" w:line="269" w:lineRule="auto"/>
+      </w:pPr>
+      <w:r>
+        <w:rPr>
+          <w:rFonts w:ascii="Calibri" w:hAnsi="Calibri" w:eastAsia="Microsoft YaHei"/>
+          <w:b w:val="0"/>
+          <w:color w:val="1F2937"/>
+          <w:sz w:val="21"/>
+        </w:rPr>
+        <w:t>`services/`：业务流程、会话编排、知识检索、SQL 校验、仪表盘服务。</w:t>
+      </w:r>
+    </w:p>
+    <w:p>
+      <w:pPr>
+        <w:pStyle w:val="ListBullet"/>
+        <w:spacing w:before="0" w:after="80" w:line="269" w:lineRule="auto"/>
+      </w:pPr>
+      <w:r>
+        <w:rPr>
+          <w:rFonts w:ascii="Calibri" w:hAnsi="Calibri" w:eastAsia="Microsoft YaHei"/>
+          <w:b w:val="0"/>
+          <w:color w:val="1F2937"/>
+          <w:sz w:val="21"/>
+        </w:rPr>
+        <w:t>`repositories/`：数据库访问层，隔离 SQLAlchemy 查询。</w:t>
+      </w:r>
+    </w:p>
+    <w:p>
+      <w:pPr>
+        <w:pStyle w:val="ListBullet"/>
+        <w:spacing w:before="0" w:after="80" w:line="269" w:lineRule="auto"/>
+      </w:pPr>
+      <w:r>
+        <w:rPr>
+          <w:rFonts w:ascii="Calibri" w:hAnsi="Calibri" w:eastAsia="Microsoft YaHei"/>
+          <w:b w:val="0"/>
+          <w:color w:val="1F2937"/>
+          <w:sz w:val="21"/>
+        </w:rPr>
+        <w:t>`domain/`：业务域配置和模型默认配置。</w:t>
+      </w:r>
+    </w:p>
+    <w:p>
+      <w:pPr>
+        <w:pStyle w:val="ListBullet"/>
+        <w:spacing w:before="0" w:after="80" w:line="269" w:lineRule="auto"/>
+      </w:pPr>
+      <w:r>
+        <w:rPr>
+          <w:rFonts w:ascii="Calibri" w:hAnsi="Calibri" w:eastAsia="Microsoft YaHei"/>
+          <w:b w:val="0"/>
+          <w:color w:val="1F2937"/>
+          <w:sz w:val="21"/>
+        </w:rPr>
+        <w:t>`db.py`：数据库连接和 session 管理。</w:t>
+      </w:r>
+    </w:p>
+    <w:p>
+      <w:pPr>
+        <w:pStyle w:val="ListBullet"/>
+        <w:spacing w:before="0" w:after="80" w:line="269" w:lineRule="auto"/>
+      </w:pPr>
+      <w:r>
+        <w:rPr>
+          <w:rFonts w:ascii="Calibri" w:hAnsi="Calibri" w:eastAsia="Microsoft YaHei"/>
+          <w:b w:val="0"/>
+          <w:color w:val="1F2937"/>
+          <w:sz w:val="21"/>
+        </w:rPr>
+        <w:t>`seed.py`：演示数据库初始化和样例数据生成。</w:t>
+      </w:r>
+    </w:p>
+    <w:p>
+      <w:pPr>
+        <w:spacing w:before="0" w:after="120" w:line="264" w:lineRule="auto"/>
+      </w:pPr>
+      <w:r>
+        <w:rPr>
+          <w:rFonts w:ascii="Calibri" w:hAnsi="Calibri" w:eastAsia="Microsoft YaHei"/>
+          <w:b w:val="0"/>
+          <w:color w:val="1F2937"/>
+          <w:sz w:val="21"/>
+        </w:rPr>
+        <w:t>近期重构重点：</w:t>
+      </w:r>
+    </w:p>
+    <w:p>
+      <w:pPr>
+        <w:pStyle w:val="ListBullet"/>
+        <w:spacing w:before="0" w:after="80" w:line="269" w:lineRule="auto"/>
+      </w:pPr>
+      <w:r>
+        <w:rPr>
+          <w:rFonts w:ascii="Calibri" w:hAnsi="Calibri" w:eastAsia="Microsoft YaHei"/>
+          <w:b w:val="0"/>
+          <w:color w:val="1F2937"/>
+          <w:sz w:val="21"/>
+        </w:rPr>
+        <w:t>新增 `repositories/conversations.py`，承接会话删除、清空、存在性检查等数据访问逻辑。</w:t>
+      </w:r>
+    </w:p>
+    <w:p>
+      <w:pPr>
+        <w:pStyle w:val="ListBullet"/>
+        <w:spacing w:before="0" w:after="80" w:line="269" w:lineRule="auto"/>
+      </w:pPr>
+      <w:r>
+        <w:rPr>
+          <w:rFonts w:ascii="Calibri" w:hAnsi="Calibri" w:eastAsia="Microsoft YaHei"/>
+          <w:b w:val="0"/>
+          <w:color w:val="1F2937"/>
+          <w:sz w:val="21"/>
+        </w:rPr>
+        <w:t>新增 `repositories/dashboards.py`，承接仪表盘查询、分享标识查询、名称重复校验等数据访问逻辑。</w:t>
+      </w:r>
+    </w:p>
+    <w:p>
+      <w:pPr>
+        <w:pStyle w:val="ListBullet"/>
+        <w:spacing w:before="0" w:after="80" w:line="269" w:lineRule="auto"/>
+      </w:pPr>
+      <w:r>
+        <w:rPr>
+          <w:rFonts w:ascii="Calibri" w:hAnsi="Calibri" w:eastAsia="Microsoft YaHei"/>
+          <w:b w:val="0"/>
+          <w:color w:val="1F2937"/>
+          <w:sz w:val="21"/>
+        </w:rPr>
+        <w:t>Settings API 使用更明确的响应模型，减少宽泛的 `dict[str, Any]`。</w:t>
+      </w:r>
+    </w:p>
+    <w:p>
+      <w:pPr>
+        <w:pStyle w:val="ListBullet"/>
+        <w:spacing w:before="0" w:after="80" w:line="269" w:lineRule="auto"/>
+      </w:pPr>
+      <w:r>
+        <w:rPr>
+          <w:rFonts w:ascii="Calibri" w:hAnsi="Calibri" w:eastAsia="Microsoft YaHei"/>
+          <w:b w:val="0"/>
+          <w:color w:val="1F2937"/>
+          <w:sz w:val="21"/>
+        </w:rPr>
+        <w:t>DeepSeek 调用增加超时和错误类型分类。</w:t>
+      </w:r>
+    </w:p>
+    <w:p>
+      <w:pPr>
+        <w:pStyle w:val="Heading2"/>
+      </w:pPr>
+      <w:r>
+        <w:t>5. 核心运行逻辑</w:t>
+      </w:r>
+    </w:p>
+    <w:p>
+      <w:pPr>
+        <w:pStyle w:val="Heading3"/>
+      </w:pPr>
+      <w:r>
+        <w:t>5.1 智能问数链路</w:t>
+      </w:r>
+    </w:p>
+    <w:p>
+      <w:pPr>
+        <w:pStyle w:val="ListNumber"/>
+        <w:spacing w:before="0" w:after="80" w:line="269" w:lineRule="auto"/>
+      </w:pPr>
+      <w:r>
+        <w:rPr>
+          <w:rFonts w:ascii="Calibri" w:hAnsi="Calibri" w:eastAsia="Microsoft YaHei"/>
+          <w:b w:val="0"/>
+          <w:color w:val="1F2937"/>
+          <w:sz w:val="21"/>
+        </w:rPr>
+        <w:t>前端提交用户问题和当前会话 ID。</w:t>
+      </w:r>
+    </w:p>
+    <w:p>
+      <w:pPr>
+        <w:pStyle w:val="ListNumber"/>
+        <w:spacing w:before="0" w:after="80" w:line="269" w:lineRule="auto"/>
+      </w:pPr>
+      <w:r>
+        <w:rPr>
+          <w:rFonts w:ascii="Calibri" w:hAnsi="Calibri" w:eastAsia="Microsoft YaHei"/>
+          <w:b w:val="0"/>
+          <w:color w:val="1F2937"/>
+          <w:sz w:val="21"/>
+        </w:rPr>
+        <w:t>后端读取历史会话上下文。</w:t>
+      </w:r>
+    </w:p>
+    <w:p>
+      <w:pPr>
+        <w:pStyle w:val="ListNumber"/>
+        <w:spacing w:before="0" w:after="80" w:line="269" w:lineRule="auto"/>
+      </w:pPr>
+      <w:r>
+        <w:rPr>
+          <w:rFonts w:ascii="Calibri" w:hAnsi="Calibri" w:eastAsia="Microsoft YaHei"/>
+          <w:b w:val="0"/>
+          <w:color w:val="1F2937"/>
+          <w:sz w:val="21"/>
+        </w:rPr>
+        <w:t>系统判断问题是否完整；如果不完整，则返回推荐问题而不执行 SQL。</w:t>
+      </w:r>
+    </w:p>
+    <w:p>
+      <w:pPr>
+        <w:pStyle w:val="ListNumber"/>
+        <w:spacing w:before="0" w:after="80" w:line="269" w:lineRule="auto"/>
+      </w:pPr>
+      <w:r>
+        <w:rPr>
+          <w:rFonts w:ascii="Calibri" w:hAnsi="Calibri" w:eastAsia="Microsoft YaHei"/>
+          <w:b w:val="0"/>
+          <w:color w:val="1F2937"/>
+          <w:sz w:val="21"/>
+        </w:rPr>
+        <w:t>系统检索知识库，获取相关业务口径、字段说明和 SQL 示例。</w:t>
+      </w:r>
+    </w:p>
+    <w:p>
+      <w:pPr>
+        <w:pStyle w:val="ListNumber"/>
+        <w:spacing w:before="0" w:after="80" w:line="269" w:lineRule="auto"/>
+      </w:pPr>
+      <w:r>
+        <w:rPr>
+          <w:rFonts w:ascii="Calibri" w:hAnsi="Calibri" w:eastAsia="Microsoft YaHei"/>
+          <w:b w:val="0"/>
+          <w:color w:val="1F2937"/>
+          <w:sz w:val="21"/>
+        </w:rPr>
+        <w:t>系统选择候选数据表和字段。</w:t>
+      </w:r>
+    </w:p>
+    <w:p>
+      <w:pPr>
+        <w:pStyle w:val="ListNumber"/>
+        <w:spacing w:before="0" w:after="80" w:line="269" w:lineRule="auto"/>
+      </w:pPr>
+      <w:r>
+        <w:rPr>
+          <w:rFonts w:ascii="Calibri" w:hAnsi="Calibri" w:eastAsia="Microsoft YaHei"/>
+          <w:b w:val="0"/>
+          <w:color w:val="1F2937"/>
+          <w:sz w:val="21"/>
+        </w:rPr>
+        <w:t>DeepSeek 或离线规则生成候选 SQL。</w:t>
+      </w:r>
+    </w:p>
+    <w:p>
+      <w:pPr>
+        <w:pStyle w:val="ListNumber"/>
+        <w:spacing w:before="0" w:after="80" w:line="269" w:lineRule="auto"/>
+      </w:pPr>
+      <w:r>
+        <w:rPr>
+          <w:rFonts w:ascii="Calibri" w:hAnsi="Calibri" w:eastAsia="Microsoft YaHei"/>
+          <w:b w:val="0"/>
+          <w:color w:val="1F2937"/>
+          <w:sz w:val="21"/>
+        </w:rPr>
+        <w:t>SQL Guard 校验语句是否只读、是否单语句、是否访问授权表。</w:t>
+      </w:r>
+    </w:p>
+    <w:p>
+      <w:pPr>
+        <w:pStyle w:val="ListNumber"/>
+        <w:spacing w:before="0" w:after="80" w:line="269" w:lineRule="auto"/>
+      </w:pPr>
+      <w:r>
+        <w:rPr>
+          <w:rFonts w:ascii="Calibri" w:hAnsi="Calibri" w:eastAsia="Microsoft YaHei"/>
+          <w:b w:val="0"/>
+          <w:color w:val="1F2937"/>
+          <w:sz w:val="21"/>
+        </w:rPr>
+        <w:t>校验通过后查询 SQLite。</w:t>
+      </w:r>
+    </w:p>
+    <w:p>
+      <w:pPr>
+        <w:pStyle w:val="ListNumber"/>
+        <w:spacing w:before="0" w:after="80" w:line="269" w:lineRule="auto"/>
+      </w:pPr>
+      <w:r>
+        <w:rPr>
+          <w:rFonts w:ascii="Calibri" w:hAnsi="Calibri" w:eastAsia="Microsoft YaHei"/>
+          <w:b w:val="0"/>
+          <w:color w:val="1F2937"/>
+          <w:sz w:val="21"/>
+        </w:rPr>
+        <w:t>后端生成图表建议、分析结论和追问建议。</w:t>
+      </w:r>
+    </w:p>
+    <w:p>
+      <w:pPr>
+        <w:pStyle w:val="ListNumber"/>
+        <w:spacing w:before="0" w:after="80" w:line="269" w:lineRule="auto"/>
+      </w:pPr>
+      <w:r>
+        <w:rPr>
+          <w:rFonts w:ascii="Calibri" w:hAnsi="Calibri" w:eastAsia="Microsoft YaHei"/>
+          <w:b w:val="0"/>
+          <w:color w:val="1F2937"/>
+          <w:sz w:val="21"/>
+        </w:rPr>
+        <w:t>前端渲染工具调用步骤、SQL、图表、结论和追问问题。</w:t>
+      </w:r>
+    </w:p>
+    <w:p>
+      <w:pPr>
+        <w:pStyle w:val="ListNumber"/>
+        <w:spacing w:before="0" w:after="80" w:line="269" w:lineRule="auto"/>
+      </w:pPr>
+      <w:r>
+        <w:rPr>
+          <w:rFonts w:ascii="Calibri" w:hAnsi="Calibri" w:eastAsia="Microsoft YaHei"/>
+          <w:b w:val="0"/>
+          <w:color w:val="1F2937"/>
+          <w:sz w:val="21"/>
+        </w:rPr>
+        <w:t>用户可继续追问、保存到仪表盘或查看历史会话。</w:t>
+      </w:r>
+    </w:p>
+    <w:p>
+      <w:pPr>
+        <w:pStyle w:val="Heading3"/>
+      </w:pPr>
+      <w:r>
+        <w:t>5.2 仪表盘链路</w:t>
+      </w:r>
+    </w:p>
+    <w:p>
+      <w:pPr>
+        <w:pStyle w:val="ListNumber"/>
+        <w:spacing w:before="0" w:after="80" w:line="269" w:lineRule="auto"/>
+      </w:pPr>
+      <w:r>
+        <w:rPr>
+          <w:rFonts w:ascii="Calibri" w:hAnsi="Calibri" w:eastAsia="Microsoft YaHei"/>
+          <w:b w:val="0"/>
+          <w:color w:val="1F2937"/>
+          <w:sz w:val="21"/>
+        </w:rPr>
+        <w:t>用户在问数结果中点击加入仪表盘。</w:t>
+      </w:r>
+    </w:p>
+    <w:p>
+      <w:pPr>
+        <w:pStyle w:val="ListNumber"/>
+        <w:spacing w:before="0" w:after="80" w:line="269" w:lineRule="auto"/>
+      </w:pPr>
+      <w:r>
+        <w:rPr>
+          <w:rFonts w:ascii="Calibri" w:hAnsi="Calibri" w:eastAsia="Microsoft YaHei"/>
+          <w:b w:val="0"/>
+          <w:color w:val="1F2937"/>
+          <w:sz w:val="21"/>
+        </w:rPr>
+        <w:t>后端保存图表配置、结果数据和布局信息。</w:t>
+      </w:r>
+    </w:p>
+    <w:p>
+      <w:pPr>
+        <w:pStyle w:val="ListNumber"/>
+        <w:spacing w:before="0" w:after="80" w:line="269" w:lineRule="auto"/>
+      </w:pPr>
+      <w:r>
+        <w:rPr>
+          <w:rFonts w:ascii="Calibri" w:hAnsi="Calibri" w:eastAsia="Microsoft YaHei"/>
+          <w:b w:val="0"/>
+          <w:color w:val="1F2937"/>
+          <w:sz w:val="21"/>
+        </w:rPr>
+        <w:t>仪表盘页面读取看板和卡片列表。</w:t>
+      </w:r>
+    </w:p>
+    <w:p>
+      <w:pPr>
+        <w:pStyle w:val="ListNumber"/>
+        <w:spacing w:before="0" w:after="80" w:line="269" w:lineRule="auto"/>
+      </w:pPr>
+      <w:r>
+        <w:rPr>
+          <w:rFonts w:ascii="Calibri" w:hAnsi="Calibri" w:eastAsia="Microsoft YaHei"/>
+          <w:b w:val="0"/>
+          <w:color w:val="1F2937"/>
+          <w:sz w:val="21"/>
+        </w:rPr>
+        <w:t>用户可切换图表类型、拖拽排序、筛选、刷新、放大或删除卡片。</w:t>
+      </w:r>
+    </w:p>
+    <w:p>
+      <w:pPr>
+        <w:pStyle w:val="ListNumber"/>
+        <w:spacing w:before="0" w:after="80" w:line="269" w:lineRule="auto"/>
+      </w:pPr>
+      <w:r>
+        <w:rPr>
+          <w:rFonts w:ascii="Calibri" w:hAnsi="Calibri" w:eastAsia="Microsoft YaHei"/>
+          <w:b w:val="0"/>
+          <w:color w:val="1F2937"/>
+          <w:sz w:val="21"/>
+        </w:rPr>
+        <w:t>分享时后端生成分享标识，前端打开只读分享页。</w:t>
+      </w:r>
+    </w:p>
+    <w:p>
+      <w:pPr>
+        <w:pStyle w:val="Heading3"/>
+      </w:pPr>
+      <w:r>
+        <w:t>5.3 DeepSeek 配置链路</w:t>
+      </w:r>
+    </w:p>
+    <w:p>
+      <w:pPr>
+        <w:pStyle w:val="ListNumber"/>
+        <w:spacing w:before="0" w:after="80" w:line="269" w:lineRule="auto"/>
+      </w:pPr>
+      <w:r>
+        <w:rPr>
+          <w:rFonts w:ascii="Calibri" w:hAnsi="Calibri" w:eastAsia="Microsoft YaHei"/>
+          <w:b w:val="0"/>
+          <w:color w:val="1F2937"/>
+          <w:sz w:val="21"/>
+        </w:rPr>
+        <w:t>用户在运行配置页输入 API Key、Base URL、Model。</w:t>
+      </w:r>
+    </w:p>
+    <w:p>
+      <w:pPr>
+        <w:pStyle w:val="ListNumber"/>
+        <w:spacing w:before="0" w:after="80" w:line="269" w:lineRule="auto"/>
+      </w:pPr>
+      <w:r>
+        <w:rPr>
+          <w:rFonts w:ascii="Calibri" w:hAnsi="Calibri" w:eastAsia="Microsoft YaHei"/>
+          <w:b w:val="0"/>
+          <w:color w:val="1F2937"/>
+          <w:sz w:val="21"/>
+        </w:rPr>
+        <w:t>前端提交给本地后端，后端保存运行时配置。</w:t>
+      </w:r>
+    </w:p>
+    <w:p>
+      <w:pPr>
+        <w:pStyle w:val="ListNumber"/>
+        <w:spacing w:before="0" w:after="80" w:line="269" w:lineRule="auto"/>
+      </w:pPr>
+      <w:r>
+        <w:rPr>
+          <w:rFonts w:ascii="Calibri" w:hAnsi="Calibri" w:eastAsia="Microsoft YaHei"/>
+          <w:b w:val="0"/>
+          <w:color w:val="1F2937"/>
+          <w:sz w:val="21"/>
+        </w:rPr>
+        <w:t>前端只展示脱敏后的 API Key。</w:t>
+      </w:r>
+    </w:p>
+    <w:p>
+      <w:pPr>
+        <w:pStyle w:val="ListNumber"/>
+        <w:spacing w:before="0" w:after="80" w:line="269" w:lineRule="auto"/>
+      </w:pPr>
+      <w:r>
+        <w:rPr>
+          <w:rFonts w:ascii="Calibri" w:hAnsi="Calibri" w:eastAsia="Microsoft YaHei"/>
+          <w:b w:val="0"/>
+          <w:color w:val="1F2937"/>
+          <w:sz w:val="21"/>
+        </w:rPr>
+        <w:t>测试连接时，后端调用 DeepSeek API 并分类错误。</w:t>
+      </w:r>
+    </w:p>
+    <w:p>
+      <w:pPr>
+        <w:pStyle w:val="ListNumber"/>
+        <w:spacing w:before="0" w:after="80" w:line="269" w:lineRule="auto"/>
+      </w:pPr>
+      <w:r>
+        <w:rPr>
+          <w:rFonts w:ascii="Calibri" w:hAnsi="Calibri" w:eastAsia="Microsoft YaHei"/>
+          <w:b w:val="0"/>
+          <w:color w:val="1F2937"/>
+          <w:sz w:val="21"/>
+        </w:rPr>
+        <w:t>智能问数时，如果 DeepSeek 可用则调用在线模型，否则使用离线规则兜底。</w:t>
+      </w:r>
+    </w:p>
+    <w:p>
+      <w:pPr>
+        <w:pStyle w:val="Heading2"/>
+      </w:pPr>
+      <w:r>
+        <w:t>6. 数据与安全设计</w:t>
+      </w:r>
+    </w:p>
+    <w:p>
+      <w:pPr>
+        <w:pStyle w:val="ListBullet"/>
+        <w:spacing w:before="0" w:after="80" w:line="269" w:lineRule="auto"/>
+      </w:pPr>
+      <w:r>
+        <w:rPr>
+          <w:rFonts w:ascii="Calibri" w:hAnsi="Calibri" w:eastAsia="Microsoft YaHei"/>
+          <w:b w:val="0"/>
+          <w:color w:val="1F2937"/>
+          <w:sz w:val="21"/>
+        </w:rPr>
+        <w:t>演示数据为本地生成的虚构数据，不接入生产库。</w:t>
+      </w:r>
+    </w:p>
+    <w:p>
+      <w:pPr>
+        <w:pStyle w:val="ListBullet"/>
+        <w:spacing w:before="0" w:after="80" w:line="269" w:lineRule="auto"/>
+      </w:pPr>
+      <w:r>
+        <w:rPr>
+          <w:rFonts w:ascii="Calibri" w:hAnsi="Calibri" w:eastAsia="Microsoft YaHei"/>
+          <w:b w:val="0"/>
+          <w:color w:val="1F2937"/>
+          <w:sz w:val="21"/>
+        </w:rPr>
+        <w:t>SQL 只允许 `SELECT` / `WITH`。</w:t>
+      </w:r>
+    </w:p>
+    <w:p>
+      <w:pPr>
+        <w:pStyle w:val="ListBullet"/>
+        <w:spacing w:before="0" w:after="80" w:line="269" w:lineRule="auto"/>
+      </w:pPr>
+      <w:r>
+        <w:rPr>
+          <w:rFonts w:ascii="Calibri" w:hAnsi="Calibri" w:eastAsia="Microsoft YaHei"/>
+          <w:b w:val="0"/>
+          <w:color w:val="1F2937"/>
+          <w:sz w:val="21"/>
+        </w:rPr>
+        <w:t>禁止 DDL、DML、PRAGMA、ATTACH、多语句。</w:t>
+      </w:r>
+    </w:p>
+    <w:p>
+      <w:pPr>
+        <w:pStyle w:val="ListBullet"/>
+        <w:spacing w:before="0" w:after="80" w:line="269" w:lineRule="auto"/>
+      </w:pPr>
+      <w:r>
+        <w:rPr>
+          <w:rFonts w:ascii="Calibri" w:hAnsi="Calibri" w:eastAsia="Microsoft YaHei"/>
+          <w:b w:val="0"/>
+          <w:color w:val="1F2937"/>
+          <w:sz w:val="21"/>
+        </w:rPr>
+        <w:t>查询表必须在白名单内。</w:t>
+      </w:r>
+    </w:p>
+    <w:p>
+      <w:pPr>
+        <w:pStyle w:val="ListBullet"/>
+        <w:spacing w:before="0" w:after="80" w:line="269" w:lineRule="auto"/>
+      </w:pPr>
+      <w:r>
+        <w:rPr>
+          <w:rFonts w:ascii="Calibri" w:hAnsi="Calibri" w:eastAsia="Microsoft YaHei"/>
+          <w:b w:val="0"/>
+          <w:color w:val="1F2937"/>
+          <w:sz w:val="21"/>
+        </w:rPr>
+        <w:t>查询结果有行数上限，避免页面过载。</w:t>
+      </w:r>
+    </w:p>
+    <w:p>
+      <w:pPr>
+        <w:pStyle w:val="ListBullet"/>
+        <w:spacing w:before="0" w:after="80" w:line="269" w:lineRule="auto"/>
+      </w:pPr>
+      <w:r>
+        <w:rPr>
+          <w:rFonts w:ascii="Calibri" w:hAnsi="Calibri" w:eastAsia="Microsoft YaHei"/>
+          <w:b w:val="0"/>
+          <w:color w:val="1F2937"/>
+          <w:sz w:val="21"/>
+        </w:rPr>
+        <w:t>API Key 不写入 README，不提交 `.env`。</w:t>
+      </w:r>
+    </w:p>
+    <w:p>
+      <w:pPr>
+        <w:pStyle w:val="ListBullet"/>
+        <w:spacing w:before="0" w:after="80" w:line="269" w:lineRule="auto"/>
+      </w:pPr>
+      <w:r>
+        <w:rPr>
+          <w:rFonts w:ascii="Calibri" w:hAnsi="Calibri" w:eastAsia="Microsoft YaHei"/>
+          <w:b w:val="0"/>
+          <w:color w:val="1F2937"/>
+          <w:sz w:val="21"/>
+        </w:rPr>
+        <w:t>前端不保存完整 API Key。</w:t>
+      </w:r>
+    </w:p>
+    <w:p>
+      <w:pPr>
+        <w:pStyle w:val="ListBullet"/>
+        <w:spacing w:before="0" w:after="80" w:line="269" w:lineRule="auto"/>
+      </w:pPr>
+      <w:r>
+        <w:rPr>
+          <w:rFonts w:ascii="Calibri" w:hAnsi="Calibri" w:eastAsia="Microsoft YaHei"/>
+          <w:b w:val="0"/>
+          <w:color w:val="1F2937"/>
+          <w:sz w:val="21"/>
+        </w:rPr>
+        <w:t>删除历史会话和清空历史会话均需要二次确认。</w:t>
+      </w:r>
+    </w:p>
+    <w:p>
+      <w:pPr>
+        <w:pStyle w:val="ListBullet"/>
+        <w:spacing w:before="0" w:after="80" w:line="269" w:lineRule="auto"/>
+      </w:pPr>
+      <w:r>
+        <w:rPr>
+          <w:rFonts w:ascii="Calibri" w:hAnsi="Calibri" w:eastAsia="Microsoft YaHei"/>
+          <w:b w:val="0"/>
+          <w:color w:val="1F2937"/>
+          <w:sz w:val="21"/>
+        </w:rPr>
+        <w:t>仪表盘重命名需要校验空名和重名。</w:t>
+      </w:r>
+    </w:p>
+    <w:p>
+      <w:pPr>
+        <w:pStyle w:val="Heading2"/>
+      </w:pPr>
+      <w:r>
+        <w:t>7. 本地运行方式</w:t>
+      </w:r>
+    </w:p>
+    <w:p>
+      <w:pPr>
+        <w:spacing w:before="0" w:after="120" w:line="264" w:lineRule="auto"/>
+      </w:pPr>
+      <w:r>
+        <w:rPr>
+          <w:rFonts w:ascii="Calibri" w:hAnsi="Calibri" w:eastAsia="Microsoft YaHei"/>
+          <w:b w:val="0"/>
+          <w:color w:val="1F2937"/>
+          <w:sz w:val="21"/>
+        </w:rPr>
+        <w:t>推荐在项目根目录执行：</w:t>
+      </w:r>
+    </w:p>
+    <w:p>
+      <w:pPr>
+        <w:spacing w:before="40" w:after="120" w:line="240" w:lineRule="auto"/>
+      </w:pPr>
+      <w:r>
+        <w:rPr>
+          <w:rFonts w:ascii="Consolas" w:hAnsi="Consolas" w:eastAsia="Microsoft YaHei"/>
+          <w:color w:val="334155"/>
+          <w:sz w:val="17"/>
         </w:rPr>
         <w:t>powershell -ExecutionPolicy Bypass -File .\start-demo.ps1</w:t>
       </w:r>
     </w:p>
     <w:p>
       <w:pPr>
-        <w:spacing w:after="120" w:line="283" w:lineRule="auto"/>
+        <w:spacing w:before="0" w:after="120" w:line="264" w:lineRule="auto"/>
       </w:pPr>
       <w:r>
         <w:rPr>
-          <w:rFonts w:ascii="Microsoft YaHei" w:hAnsi="Microsoft YaHei" w:eastAsia="Microsoft YaHei"/>
+          <w:rFonts w:ascii="Calibri" w:hAnsi="Calibri" w:eastAsia="Microsoft YaHei"/>
+          <w:b w:val="0"/>
+          <w:color w:val="1F2937"/>
           <w:sz w:val="21"/>
         </w:rPr>
-        <w:t>默认前端地址：http://127.0.0.1:5173；后端健康检查地址：http://127.0.0.1:8000/api/health。</w:t>
+        <w:t>也可以分开启动：</w:t>
       </w:r>
     </w:p>
     <w:p>
       <w:pPr>
-        <w:pStyle w:val="Heading1"/>
+        <w:spacing w:before="40" w:after="120" w:line="240" w:lineRule="auto"/>
       </w:pPr>
       <w:r>
         <w:rPr>
-          <w:rFonts w:ascii="Microsoft YaHei" w:hAnsi="Microsoft YaHei" w:eastAsia="Microsoft YaHei"/>
-          <w:color w:val="1F4E79"/>
+          <w:rFonts w:ascii="Consolas" w:hAnsi="Consolas" w:eastAsia="Microsoft YaHei"/>
+          <w:color w:val="334155"/>
+          <w:sz w:val="17"/>
         </w:rPr>
-        <w:t>7. DeepSeek 配置方式</w:t>
+        <w:t>python -m uvicorn backend.app.main:app --reload --port 8000</w:t>
+      </w:r>
+      <w:r>
+        <w:br/>
+      </w:r>
+      <w:r>
+        <w:rPr>
+          <w:rFonts w:ascii="Consolas" w:hAnsi="Consolas" w:eastAsia="Microsoft YaHei"/>
+          <w:color w:val="334155"/>
+          <w:sz w:val="17"/>
+        </w:rPr>
+        <w:t>npm --prefix frontend install</w:t>
+      </w:r>
+      <w:r>
+        <w:br/>
+      </w:r>
+      <w:r>
+        <w:rPr>
+          <w:rFonts w:ascii="Consolas" w:hAnsi="Consolas" w:eastAsia="Microsoft YaHei"/>
+          <w:color w:val="334155"/>
+          <w:sz w:val="17"/>
+        </w:rPr>
+        <w:t>npm --prefix frontend run dev</w:t>
       </w:r>
     </w:p>
     <w:p>
       <w:pPr>
-        <w:spacing w:after="120" w:line="283" w:lineRule="auto"/>
+        <w:spacing w:before="0" w:after="120" w:line="264" w:lineRule="auto"/>
       </w:pPr>
       <w:r>
         <w:rPr>
-          <w:rFonts w:ascii="Microsoft YaHei" w:hAnsi="Microsoft YaHei" w:eastAsia="Microsoft YaHei"/>
+          <w:rFonts w:ascii="Calibri" w:hAnsi="Calibri" w:eastAsia="Microsoft YaHei"/>
+          <w:b w:val="0"/>
+          <w:color w:val="1F2937"/>
           <w:sz w:val="21"/>
         </w:rPr>
-        <w:t>默认可使用离线演示模式。如需启用真实 DeepSeek Text-to-SQL，可在页面点击“配置 DeepSeek API”填写 Key，也可在本地 .env 文件中配置 LLM_MODE=deepseek、DEEPSEEK_API_KEY、DEEPSEEK_BASE_URL 和 DEEPSEEK_MODEL。真实 Key 不应提交到 GitHub。</w:t>
+        <w:t>访问地址：</w:t>
       </w:r>
     </w:p>
     <w:p>
       <w:pPr>
-        <w:pStyle w:val="Heading1"/>
+        <w:pStyle w:val="ListBullet"/>
+        <w:spacing w:before="0" w:after="80" w:line="269" w:lineRule="auto"/>
       </w:pPr>
       <w:r>
         <w:rPr>
-          <w:rFonts w:ascii="Microsoft YaHei" w:hAnsi="Microsoft YaHei" w:eastAsia="Microsoft YaHei"/>
-          <w:color w:val="1F4E79"/>
+          <w:rFonts w:ascii="Calibri" w:hAnsi="Calibri" w:eastAsia="Microsoft YaHei"/>
+          <w:b w:val="0"/>
+          <w:color w:val="1F2937"/>
+          <w:sz w:val="21"/>
         </w:rPr>
-        <w:t>8. 验证结果</w:t>
-      </w:r>
-    </w:p>
-    <w:tbl>
-      <w:tblPr>
-        <w:tblStyle w:val="TableGrid"/>
-        <w:tblW w:type="auto" w:w="0"/>
-        <w:jc w:val="center"/>
-        <w:tblLook w:firstColumn="1" w:firstRow="1" w:lastColumn="0" w:lastRow="0" w:noHBand="0" w:noVBand="1" w:val="04A0"/>
-      </w:tblPr>
-      <w:tblGrid>
-        <w:gridCol w:w="3249"/>
-        <w:gridCol w:w="3249"/>
-        <w:gridCol w:w="3249"/>
-      </w:tblGrid>
-      <w:tr>
-        <w:tc>
-          <w:tcPr>
-            <w:tcW w:type="dxa" w:w="3249"/>
-            <w:shd w:fill="D9EAF7"/>
-            <w:vAlign w:val="center"/>
-          </w:tcPr>
-          <w:p>
-            <w:pPr>
-              <w:jc w:val="center"/>
-            </w:pPr>
-            <w:r/>
-            <w:r>
-              <w:rPr>
-                <w:rFonts w:ascii="Microsoft YaHei" w:hAnsi="Microsoft YaHei" w:eastAsia="Microsoft YaHei"/>
-                <w:b/>
-                <w:sz w:val="18"/>
-              </w:rPr>
-              <w:t>验证项</w:t>
-            </w:r>
-          </w:p>
-        </w:tc>
-        <w:tc>
-          <w:tcPr>
-            <w:tcW w:type="dxa" w:w="3249"/>
-            <w:shd w:fill="D9EAF7"/>
-            <w:vAlign w:val="center"/>
-          </w:tcPr>
-          <w:p>
-            <w:pPr>
-              <w:jc w:val="center"/>
-            </w:pPr>
-            <w:r/>
-            <w:r>
-              <w:rPr>
-                <w:rFonts w:ascii="Microsoft YaHei" w:hAnsi="Microsoft YaHei" w:eastAsia="Microsoft YaHei"/>
-                <w:b/>
-                <w:sz w:val="18"/>
-              </w:rPr>
-              <w:t>命令</w:t>
-            </w:r>
-          </w:p>
-        </w:tc>
-        <w:tc>
-          <w:tcPr>
-            <w:tcW w:type="dxa" w:w="3249"/>
-            <w:shd w:fill="D9EAF7"/>
-            <w:vAlign w:val="center"/>
-          </w:tcPr>
-          <w:p>
-            <w:pPr>
-              <w:jc w:val="center"/>
-            </w:pPr>
-            <w:r/>
-            <w:r>
-              <w:rPr>
-                <w:rFonts w:ascii="Microsoft YaHei" w:hAnsi="Microsoft YaHei" w:eastAsia="Microsoft YaHei"/>
-                <w:b/>
-                <w:sz w:val="18"/>
-              </w:rPr>
-              <w:t>结果</w:t>
-            </w:r>
-          </w:p>
-        </w:tc>
-      </w:tr>
-      <w:tr>
-        <w:tc>
-          <w:tcPr>
-            <w:tcW w:type="dxa" w:w="3249"/>
-            <w:vAlign w:val="center"/>
-          </w:tcPr>
-          <w:p>
-            <w:pPr>
-              <w:jc w:val="center"/>
-            </w:pPr>
-            <w:r/>
-            <w:r>
-              <w:rPr>
-                <w:rFonts w:ascii="Microsoft YaHei" w:hAnsi="Microsoft YaHei" w:eastAsia="Microsoft YaHei"/>
-                <w:b w:val="0"/>
-                <w:sz w:val="18"/>
-              </w:rPr>
-              <w:t>后端测试</w:t>
-            </w:r>
-          </w:p>
-        </w:tc>
-        <w:tc>
-          <w:tcPr>
-            <w:tcW w:type="dxa" w:w="3249"/>
-            <w:vAlign w:val="center"/>
-          </w:tcPr>
-          <w:p>
-            <w:pPr>
-              <w:jc w:val="left"/>
-            </w:pPr>
-            <w:r/>
-            <w:r>
-              <w:rPr>
-                <w:rFonts w:ascii="Microsoft YaHei" w:hAnsi="Microsoft YaHei" w:eastAsia="Microsoft YaHei"/>
-                <w:b w:val="0"/>
-                <w:sz w:val="18"/>
-              </w:rPr>
-              <w:t>python -m pytest backend/tests -q</w:t>
-            </w:r>
-          </w:p>
-        </w:tc>
-        <w:tc>
-          <w:tcPr>
-            <w:tcW w:type="dxa" w:w="3249"/>
-            <w:vAlign w:val="center"/>
-          </w:tcPr>
-          <w:p>
-            <w:pPr>
-              <w:jc w:val="center"/>
-            </w:pPr>
-            <w:r/>
-            <w:r>
-              <w:rPr>
-                <w:rFonts w:ascii="Microsoft YaHei" w:hAnsi="Microsoft YaHei" w:eastAsia="Microsoft YaHei"/>
-                <w:b w:val="0"/>
-                <w:sz w:val="18"/>
-              </w:rPr>
-              <w:t>48 passed</w:t>
-            </w:r>
-          </w:p>
-        </w:tc>
-      </w:tr>
-      <w:tr>
-        <w:tc>
-          <w:tcPr>
-            <w:tcW w:type="dxa" w:w="3249"/>
-            <w:vAlign w:val="center"/>
-          </w:tcPr>
-          <w:p>
-            <w:pPr>
-              <w:jc w:val="center"/>
-            </w:pPr>
-            <w:r/>
-            <w:r>
-              <w:rPr>
-                <w:rFonts w:ascii="Microsoft YaHei" w:hAnsi="Microsoft YaHei" w:eastAsia="Microsoft YaHei"/>
-                <w:b w:val="0"/>
-                <w:sz w:val="18"/>
-              </w:rPr>
-              <w:t>前端测试</w:t>
-            </w:r>
-          </w:p>
-        </w:tc>
-        <w:tc>
-          <w:tcPr>
-            <w:tcW w:type="dxa" w:w="3249"/>
-            <w:vAlign w:val="center"/>
-          </w:tcPr>
-          <w:p>
-            <w:pPr>
-              <w:jc w:val="left"/>
-            </w:pPr>
-            <w:r/>
-            <w:r>
-              <w:rPr>
-                <w:rFonts w:ascii="Microsoft YaHei" w:hAnsi="Microsoft YaHei" w:eastAsia="Microsoft YaHei"/>
-                <w:b w:val="0"/>
-                <w:sz w:val="18"/>
-              </w:rPr>
-              <w:t>npm.cmd run test:run</w:t>
-            </w:r>
-          </w:p>
-        </w:tc>
-        <w:tc>
-          <w:tcPr>
-            <w:tcW w:type="dxa" w:w="3249"/>
-            <w:vAlign w:val="center"/>
-          </w:tcPr>
-          <w:p>
-            <w:pPr>
-              <w:jc w:val="center"/>
-            </w:pPr>
-            <w:r/>
-            <w:r>
-              <w:rPr>
-                <w:rFonts w:ascii="Microsoft YaHei" w:hAnsi="Microsoft YaHei" w:eastAsia="Microsoft YaHei"/>
-                <w:b w:val="0"/>
-                <w:sz w:val="18"/>
-              </w:rPr>
-              <w:t>22 passed</w:t>
-            </w:r>
-          </w:p>
-        </w:tc>
-      </w:tr>
-      <w:tr>
-        <w:tc>
-          <w:tcPr>
-            <w:tcW w:type="dxa" w:w="3249"/>
-            <w:vAlign w:val="center"/>
-          </w:tcPr>
-          <w:p>
-            <w:pPr>
-              <w:jc w:val="center"/>
-            </w:pPr>
-            <w:r/>
-            <w:r>
-              <w:rPr>
-                <w:rFonts w:ascii="Microsoft YaHei" w:hAnsi="Microsoft YaHei" w:eastAsia="Microsoft YaHei"/>
-                <w:b w:val="0"/>
-                <w:sz w:val="18"/>
-              </w:rPr>
-              <w:t>前端构建</w:t>
-            </w:r>
-          </w:p>
-        </w:tc>
-        <w:tc>
-          <w:tcPr>
-            <w:tcW w:type="dxa" w:w="3249"/>
-            <w:vAlign w:val="center"/>
-          </w:tcPr>
-          <w:p>
-            <w:pPr>
-              <w:jc w:val="left"/>
-            </w:pPr>
-            <w:r/>
-            <w:r>
-              <w:rPr>
-                <w:rFonts w:ascii="Microsoft YaHei" w:hAnsi="Microsoft YaHei" w:eastAsia="Microsoft YaHei"/>
-                <w:b w:val="0"/>
-                <w:sz w:val="18"/>
-              </w:rPr>
-              <w:t>npm.cmd run build</w:t>
-            </w:r>
-          </w:p>
-        </w:tc>
-        <w:tc>
-          <w:tcPr>
-            <w:tcW w:type="dxa" w:w="3249"/>
-            <w:vAlign w:val="center"/>
-          </w:tcPr>
-          <w:p>
-            <w:pPr>
-              <w:jc w:val="center"/>
-            </w:pPr>
-            <w:r/>
-            <w:r>
-              <w:rPr>
-                <w:rFonts w:ascii="Microsoft YaHei" w:hAnsi="Microsoft YaHei" w:eastAsia="Microsoft YaHei"/>
-                <w:b w:val="0"/>
-                <w:sz w:val="18"/>
-              </w:rPr>
-              <w:t>passed</w:t>
-            </w:r>
-          </w:p>
-        </w:tc>
-      </w:tr>
-    </w:tbl>
-    <w:p/>
-    <w:p>
-      <w:pPr>
-        <w:pStyle w:val="Heading1"/>
-      </w:pPr>
-      <w:r>
-        <w:rPr>
-          <w:rFonts w:ascii="Microsoft YaHei" w:hAnsi="Microsoft YaHei" w:eastAsia="Microsoft YaHei"/>
-          <w:color w:val="1F4E79"/>
-        </w:rPr>
-        <w:t>9. 建议演示问题</w:t>
+        <w:t>前端：http://127.0.0.1:5173</w:t>
       </w:r>
     </w:p>
     <w:p>
       <w:pPr>
         <w:pStyle w:val="ListBullet"/>
-        <w:spacing w:after="60"/>
+        <w:spacing w:before="0" w:after="80" w:line="269" w:lineRule="auto"/>
       </w:pPr>
       <w:r>
         <w:rPr>
-          <w:rFonts w:ascii="Microsoft YaHei" w:hAnsi="Microsoft YaHei" w:eastAsia="Microsoft YaHei"/>
-          <w:sz w:val="20"/>
+          <w:rFonts w:ascii="Calibri" w:hAnsi="Calibri" w:eastAsia="Microsoft YaHei"/>
+          <w:b w:val="0"/>
+          <w:color w:val="1F2937"/>
+          <w:sz w:val="21"/>
         </w:rPr>
-        <w:t>分析2025年各区平均房价趋势</w:t>
+        <w:t>后端 API：http://127.0.0.1:8000</w:t>
       </w:r>
     </w:p>
     <w:p>
       <w:pPr>
-        <w:pStyle w:val="ListBullet"/>
-        <w:spacing w:after="60"/>
+        <w:pStyle w:val="Heading2"/>
       </w:pPr>
       <w:r>
-        <w:rPr>
-          <w:rFonts w:ascii="Microsoft YaHei" w:hAnsi="Microsoft YaHei" w:eastAsia="Microsoft YaHei"/>
-          <w:sz w:val="20"/>
-        </w:rPr>
-        <w:t>分析2025年海淀区和朝阳区租金趋势</w:t>
+        <w:t>8. 测试与验收</w:t>
       </w:r>
     </w:p>
     <w:p>
       <w:pPr>
-        <w:pStyle w:val="ListBullet"/>
-        <w:spacing w:after="60"/>
+        <w:spacing w:before="0" w:after="120" w:line="264" w:lineRule="auto"/>
       </w:pPr>
       <w:r>
         <w:rPr>
-          <w:rFonts w:ascii="Microsoft YaHei" w:hAnsi="Microsoft YaHei" w:eastAsia="Microsoft YaHei"/>
-          <w:sz w:val="20"/>
+          <w:rFonts w:ascii="Calibri" w:hAnsi="Calibri" w:eastAsia="Microsoft YaHei"/>
+          <w:b w:val="0"/>
+          <w:color w:val="1F2937"/>
+          <w:sz w:val="21"/>
         </w:rPr>
-        <w:t>哪个区挂牌量最高，空置率如何</w:t>
+        <w:t>当前推荐测试命令：</w:t>
       </w:r>
     </w:p>
     <w:p>
       <w:pPr>
-        <w:pStyle w:val="ListBullet"/>
-        <w:spacing w:after="60"/>
+        <w:spacing w:before="40" w:after="120" w:line="240" w:lineRule="auto"/>
       </w:pPr>
       <w:r>
         <w:rPr>
-          <w:rFonts w:ascii="Microsoft YaHei" w:hAnsi="Microsoft YaHei" w:eastAsia="Microsoft YaHei"/>
-          <w:sz w:val="20"/>
+          <w:rFonts w:ascii="Consolas" w:hAnsi="Consolas" w:eastAsia="Microsoft YaHei"/>
+          <w:color w:val="334155"/>
+          <w:sz w:val="17"/>
         </w:rPr>
-        <w:t>房价是否和地铁覆盖率、就业密度相关</w:t>
+        <w:t>python -m pytest backend/tests -q</w:t>
+      </w:r>
+      <w:r>
+        <w:br/>
+      </w:r>
+      <w:r>
+        <w:rPr>
+          <w:rFonts w:ascii="Consolas" w:hAnsi="Consolas" w:eastAsia="Microsoft YaHei"/>
+          <w:color w:val="334155"/>
+          <w:sz w:val="17"/>
+        </w:rPr>
+        <w:t>npm --prefix frontend run test:run</w:t>
+      </w:r>
+      <w:r>
+        <w:br/>
+      </w:r>
+      <w:r>
+        <w:rPr>
+          <w:rFonts w:ascii="Consolas" w:hAnsi="Consolas" w:eastAsia="Microsoft YaHei"/>
+          <w:color w:val="334155"/>
+          <w:sz w:val="17"/>
+        </w:rPr>
+        <w:t>npm --prefix frontend run build</w:t>
       </w:r>
     </w:p>
     <w:p>
       <w:pPr>
-        <w:pStyle w:val="ListBullet"/>
-        <w:spacing w:after="60"/>
+        <w:spacing w:before="0" w:after="120" w:line="264" w:lineRule="auto"/>
       </w:pPr>
       <w:r>
         <w:rPr>
-          <w:rFonts w:ascii="Microsoft YaHei" w:hAnsi="Microsoft YaHei" w:eastAsia="Microsoft YaHei"/>
-          <w:sz w:val="20"/>
+          <w:rFonts w:ascii="Calibri" w:hAnsi="Calibri" w:eastAsia="Microsoft YaHei"/>
+          <w:b w:val="0"/>
+          <w:color w:val="1F2937"/>
+          <w:sz w:val="21"/>
         </w:rPr>
-        <w:t>对比2024年和2025年各区房价变化</w:t>
+        <w:t>人工验收建议：</w:t>
       </w:r>
     </w:p>
     <w:p>
       <w:pPr>
-        <w:pStyle w:val="Heading1"/>
+        <w:pStyle w:val="ListNumber"/>
+        <w:spacing w:before="0" w:after="80" w:line="269" w:lineRule="auto"/>
       </w:pPr>
       <w:r>
         <w:rPr>
-          <w:rFonts w:ascii="Microsoft YaHei" w:hAnsi="Microsoft YaHei" w:eastAsia="Microsoft YaHei"/>
-          <w:color w:val="1F4E79"/>
+          <w:rFonts w:ascii="Calibri" w:hAnsi="Calibri" w:eastAsia="Microsoft YaHei"/>
+          <w:b w:val="0"/>
+          <w:color w:val="1F2937"/>
+          <w:sz w:val="21"/>
         </w:rPr>
-        <w:t>10. 后续可扩展方向</w:t>
+        <w:t>打开智能问数页面，输入简单问题，确认系统推荐 3 个可问问题。</w:t>
       </w:r>
     </w:p>
     <w:p>
       <w:pPr>
-        <w:pStyle w:val="ListBullet"/>
-        <w:spacing w:after="60"/>
+        <w:pStyle w:val="ListNumber"/>
+        <w:spacing w:before="0" w:after="80" w:line="269" w:lineRule="auto"/>
       </w:pPr>
       <w:r>
         <w:rPr>
-          <w:rFonts w:ascii="Microsoft YaHei" w:hAnsi="Microsoft YaHei" w:eastAsia="Microsoft YaHei"/>
-          <w:sz w:val="20"/>
+          <w:rFonts w:ascii="Calibri" w:hAnsi="Calibri" w:eastAsia="Microsoft YaHei"/>
+          <w:b w:val="0"/>
+          <w:color w:val="1F2937"/>
+          <w:sz w:val="21"/>
         </w:rPr>
-        <w:t>接入真实数据源和生产级权限体系。</w:t>
+        <w:t>输入完整问题，例如“分析 2025 年各区平均房价”，确认出现逐步工具调用过程、SQL、图表和结论。</w:t>
       </w:r>
     </w:p>
     <w:p>
       <w:pPr>
-        <w:pStyle w:val="ListBullet"/>
-        <w:spacing w:after="60"/>
+        <w:pStyle w:val="ListNumber"/>
+        <w:spacing w:before="0" w:after="80" w:line="269" w:lineRule="auto"/>
       </w:pPr>
       <w:r>
         <w:rPr>
-          <w:rFonts w:ascii="Microsoft YaHei" w:hAnsi="Microsoft YaHei" w:eastAsia="Microsoft YaHei"/>
-          <w:sz w:val="20"/>
+          <w:rFonts w:ascii="Calibri" w:hAnsi="Calibri" w:eastAsia="Microsoft YaHei"/>
+          <w:b w:val="0"/>
+          <w:color w:val="1F2937"/>
+          <w:sz w:val="21"/>
         </w:rPr>
-        <w:t>将当前本地知识库替换为平台知识资产服务。</w:t>
+        <w:t>连续追问“只看海淀区”，确认继承前文年份和指标。</w:t>
       </w:r>
     </w:p>
     <w:p>
       <w:pPr>
-        <w:pStyle w:val="ListBullet"/>
-        <w:spacing w:after="60"/>
+        <w:pStyle w:val="ListNumber"/>
+        <w:spacing w:before="0" w:after="80" w:line="269" w:lineRule="auto"/>
       </w:pPr>
       <w:r>
         <w:rPr>
-          <w:rFonts w:ascii="Microsoft YaHei" w:hAnsi="Microsoft YaHei" w:eastAsia="Microsoft YaHei"/>
-          <w:sz w:val="20"/>
+          <w:rFonts w:ascii="Calibri" w:hAnsi="Calibri" w:eastAsia="Microsoft YaHei"/>
+          <w:b w:val="0"/>
+          <w:color w:val="1F2937"/>
+          <w:sz w:val="21"/>
         </w:rPr>
-        <w:t>扩展多表 Join 规划、指标口径管理和更精细的模型输出评估。</w:t>
+        <w:t>在结果中切换折线图、柱状图、饼图、散点图、堆叠柱状图和表格。</w:t>
       </w:r>
     </w:p>
     <w:p>
       <w:pPr>
-        <w:pStyle w:val="ListBullet"/>
-        <w:spacing w:after="60"/>
+        <w:pStyle w:val="ListNumber"/>
+        <w:spacing w:before="0" w:after="80" w:line="269" w:lineRule="auto"/>
       </w:pPr>
       <w:r>
         <w:rPr>
-          <w:rFonts w:ascii="Microsoft YaHei" w:hAnsi="Microsoft YaHei" w:eastAsia="Microsoft YaHei"/>
-          <w:sz w:val="20"/>
+          <w:rFonts w:ascii="Calibri" w:hAnsi="Calibri" w:eastAsia="Microsoft YaHei"/>
+          <w:b w:val="0"/>
+          <w:color w:val="1F2937"/>
+          <w:sz w:val="21"/>
         </w:rPr>
-        <w:t>增强仪表盘发布、权限控制和团队协作能力。</w:t>
+        <w:t>将图表加入仪表盘，确认刷新后仍存在。</w:t>
+      </w:r>
+    </w:p>
+    <w:p>
+      <w:pPr>
+        <w:pStyle w:val="ListNumber"/>
+        <w:spacing w:before="0" w:after="80" w:line="269" w:lineRule="auto"/>
+      </w:pPr>
+      <w:r>
+        <w:rPr>
+          <w:rFonts w:ascii="Calibri" w:hAnsi="Calibri" w:eastAsia="Microsoft YaHei"/>
+          <w:b w:val="0"/>
+          <w:color w:val="1F2937"/>
+          <w:sz w:val="21"/>
+        </w:rPr>
+        <w:t>新建仪表盘并重命名，确认空名和重复名会被拦截。</w:t>
+      </w:r>
+    </w:p>
+    <w:p>
+      <w:pPr>
+        <w:pStyle w:val="ListNumber"/>
+        <w:spacing w:before="0" w:after="80" w:line="269" w:lineRule="auto"/>
+      </w:pPr>
+      <w:r>
+        <w:rPr>
+          <w:rFonts w:ascii="Calibri" w:hAnsi="Calibri" w:eastAsia="Microsoft YaHei"/>
+          <w:b w:val="0"/>
+          <w:color w:val="1F2937"/>
+          <w:sz w:val="21"/>
+        </w:rPr>
+        <w:t>拖拽仪表盘卡片，确认蓝色虚线占位框出现并保存新顺序。</w:t>
+      </w:r>
+    </w:p>
+    <w:p>
+      <w:pPr>
+        <w:pStyle w:val="ListNumber"/>
+        <w:spacing w:before="0" w:after="80" w:line="269" w:lineRule="auto"/>
+      </w:pPr>
+      <w:r>
+        <w:rPr>
+          <w:rFonts w:ascii="Calibri" w:hAnsi="Calibri" w:eastAsia="Microsoft YaHei"/>
+          <w:b w:val="0"/>
+          <w:color w:val="1F2937"/>
+          <w:sz w:val="21"/>
+        </w:rPr>
+        <w:t>打开数据源页面，确认表结构和推荐问题可用。</w:t>
+      </w:r>
+    </w:p>
+    <w:p>
+      <w:pPr>
+        <w:pStyle w:val="ListNumber"/>
+        <w:spacing w:before="0" w:after="80" w:line="269" w:lineRule="auto"/>
+      </w:pPr>
+      <w:r>
+        <w:rPr>
+          <w:rFonts w:ascii="Calibri" w:hAnsi="Calibri" w:eastAsia="Microsoft YaHei"/>
+          <w:b w:val="0"/>
+          <w:color w:val="1F2937"/>
+          <w:sz w:val="21"/>
+        </w:rPr>
+        <w:t>打开知识库页面，确认筛选、同步和冲突提示可用。</w:t>
+      </w:r>
+    </w:p>
+    <w:p>
+      <w:pPr>
+        <w:pStyle w:val="ListNumber"/>
+        <w:spacing w:before="0" w:after="80" w:line="269" w:lineRule="auto"/>
+      </w:pPr>
+      <w:r>
+        <w:rPr>
+          <w:rFonts w:ascii="Calibri" w:hAnsi="Calibri" w:eastAsia="Microsoft YaHei"/>
+          <w:b w:val="0"/>
+          <w:color w:val="1F2937"/>
+          <w:sz w:val="21"/>
+        </w:rPr>
+        <w:t>打开运行配置页，测试 DeepSeek API 成功或失败分类提示。</w:t>
+      </w:r>
+    </w:p>
+    <w:p>
+      <w:pPr>
+        <w:pStyle w:val="ListNumber"/>
+        <w:spacing w:before="0" w:after="80" w:line="269" w:lineRule="auto"/>
+      </w:pPr>
+      <w:r>
+        <w:rPr>
+          <w:rFonts w:ascii="Calibri" w:hAnsi="Calibri" w:eastAsia="Microsoft YaHei"/>
+          <w:b w:val="0"/>
+          <w:color w:val="1F2937"/>
+          <w:sz w:val="21"/>
+        </w:rPr>
+        <w:t>删除单条历史会话或清空全部历史，确认出现二次确认。</w:t>
+      </w:r>
+    </w:p>
+    <w:p>
+      <w:pPr>
+        <w:pStyle w:val="Heading2"/>
+      </w:pPr>
+      <w:r>
+        <w:t>9. 后续扩展建议</w:t>
+      </w:r>
+    </w:p>
+    <w:p>
+      <w:pPr>
+        <w:pStyle w:val="Heading3"/>
+      </w:pPr>
+      <w:r>
+        <w:t>9.1 模型与智能体能力</w:t>
+      </w:r>
+    </w:p>
+    <w:p>
+      <w:pPr>
+        <w:pStyle w:val="ListBullet"/>
+        <w:spacing w:before="0" w:after="80" w:line="269" w:lineRule="auto"/>
+      </w:pPr>
+      <w:r>
+        <w:rPr>
+          <w:rFonts w:ascii="Calibri" w:hAnsi="Calibri" w:eastAsia="Microsoft YaHei"/>
+          <w:b w:val="0"/>
+          <w:color w:val="1F2937"/>
+          <w:sz w:val="21"/>
+        </w:rPr>
+        <w:t>增加模型提供商适配层，支持 OpenAI、DeepSeek、通义、私有大模型等。</w:t>
+      </w:r>
+    </w:p>
+    <w:p>
+      <w:pPr>
+        <w:pStyle w:val="ListBullet"/>
+        <w:spacing w:before="0" w:after="80" w:line="269" w:lineRule="auto"/>
+      </w:pPr>
+      <w:r>
+        <w:rPr>
+          <w:rFonts w:ascii="Calibri" w:hAnsi="Calibri" w:eastAsia="Microsoft YaHei"/>
+          <w:b w:val="0"/>
+          <w:color w:val="1F2937"/>
+          <w:sz w:val="21"/>
+        </w:rPr>
+        <w:t>引入更严格的结构化输出协议，降低 SQL 生成不稳定性。</w:t>
+      </w:r>
+    </w:p>
+    <w:p>
+      <w:pPr>
+        <w:pStyle w:val="ListBullet"/>
+        <w:spacing w:before="0" w:after="80" w:line="269" w:lineRule="auto"/>
+      </w:pPr>
+      <w:r>
+        <w:rPr>
+          <w:rFonts w:ascii="Calibri" w:hAnsi="Calibri" w:eastAsia="Microsoft YaHei"/>
+          <w:b w:val="0"/>
+          <w:color w:val="1F2937"/>
+          <w:sz w:val="21"/>
+        </w:rPr>
+        <w:t>增加 SQL 自动修复次数限制和失败归因。</w:t>
+      </w:r>
+    </w:p>
+    <w:p>
+      <w:pPr>
+        <w:pStyle w:val="ListBullet"/>
+        <w:spacing w:before="0" w:after="80" w:line="269" w:lineRule="auto"/>
+      </w:pPr>
+      <w:r>
+        <w:rPr>
+          <w:rFonts w:ascii="Calibri" w:hAnsi="Calibri" w:eastAsia="Microsoft YaHei"/>
+          <w:b w:val="0"/>
+          <w:color w:val="1F2937"/>
+          <w:sz w:val="21"/>
+        </w:rPr>
+        <w:t>将工具调用轨迹进一步标准化，支持导出审计报告。</w:t>
+      </w:r>
+    </w:p>
+    <w:p>
+      <w:pPr>
+        <w:pStyle w:val="Heading3"/>
+      </w:pPr>
+      <w:r>
+        <w:t>9.2 数据和知识治理</w:t>
+      </w:r>
+    </w:p>
+    <w:p>
+      <w:pPr>
+        <w:pStyle w:val="ListBullet"/>
+        <w:spacing w:before="0" w:after="80" w:line="269" w:lineRule="auto"/>
+      </w:pPr>
+      <w:r>
+        <w:rPr>
+          <w:rFonts w:ascii="Calibri" w:hAnsi="Calibri" w:eastAsia="Microsoft YaHei"/>
+          <w:b w:val="0"/>
+          <w:color w:val="1F2937"/>
+          <w:sz w:val="21"/>
+        </w:rPr>
+        <w:t>增加数据表权限、字段权限和租户隔离。</w:t>
+      </w:r>
+    </w:p>
+    <w:p>
+      <w:pPr>
+        <w:pStyle w:val="ListBullet"/>
+        <w:spacing w:before="0" w:after="80" w:line="269" w:lineRule="auto"/>
+      </w:pPr>
+      <w:r>
+        <w:rPr>
+          <w:rFonts w:ascii="Calibri" w:hAnsi="Calibri" w:eastAsia="Microsoft YaHei"/>
+          <w:b w:val="0"/>
+          <w:color w:val="1F2937"/>
+          <w:sz w:val="21"/>
+        </w:rPr>
+        <w:t>支持真实元数据中心接入。</w:t>
+      </w:r>
+    </w:p>
+    <w:p>
+      <w:pPr>
+        <w:pStyle w:val="ListBullet"/>
+        <w:spacing w:before="0" w:after="80" w:line="269" w:lineRule="auto"/>
+      </w:pPr>
+      <w:r>
+        <w:rPr>
+          <w:rFonts w:ascii="Calibri" w:hAnsi="Calibri" w:eastAsia="Microsoft YaHei"/>
+          <w:b w:val="0"/>
+          <w:color w:val="1F2937"/>
+          <w:sz w:val="21"/>
+        </w:rPr>
+        <w:t>支持知识版本管理、发布审核和回滚。</w:t>
+      </w:r>
+    </w:p>
+    <w:p>
+      <w:pPr>
+        <w:pStyle w:val="ListBullet"/>
+        <w:spacing w:before="0" w:after="80" w:line="269" w:lineRule="auto"/>
+      </w:pPr>
+      <w:r>
+        <w:rPr>
+          <w:rFonts w:ascii="Calibri" w:hAnsi="Calibri" w:eastAsia="Microsoft YaHei"/>
+          <w:b w:val="0"/>
+          <w:color w:val="1F2937"/>
+          <w:sz w:val="21"/>
+        </w:rPr>
+        <w:t>支持定时同步任务和同步差异对比。</w:t>
+      </w:r>
+    </w:p>
+    <w:p>
+      <w:pPr>
+        <w:pStyle w:val="Heading3"/>
+      </w:pPr>
+      <w:r>
+        <w:t>9.3 图表和仪表盘</w:t>
+      </w:r>
+    </w:p>
+    <w:p>
+      <w:pPr>
+        <w:pStyle w:val="ListBullet"/>
+        <w:spacing w:before="0" w:after="80" w:line="269" w:lineRule="auto"/>
+      </w:pPr>
+      <w:r>
+        <w:rPr>
+          <w:rFonts w:ascii="Calibri" w:hAnsi="Calibri" w:eastAsia="Microsoft YaHei"/>
+          <w:b w:val="0"/>
+          <w:color w:val="1F2937"/>
+          <w:sz w:val="21"/>
+        </w:rPr>
+        <w:t>增加多图联动。</w:t>
+      </w:r>
+    </w:p>
+    <w:p>
+      <w:pPr>
+        <w:pStyle w:val="ListBullet"/>
+        <w:spacing w:before="0" w:after="80" w:line="269" w:lineRule="auto"/>
+      </w:pPr>
+      <w:r>
+        <w:rPr>
+          <w:rFonts w:ascii="Calibri" w:hAnsi="Calibri" w:eastAsia="Microsoft YaHei"/>
+          <w:b w:val="0"/>
+          <w:color w:val="1F2937"/>
+          <w:sz w:val="21"/>
+        </w:rPr>
+        <w:t>支持仪表盘导出 PNG / PDF。</w:t>
+      </w:r>
+    </w:p>
+    <w:p>
+      <w:pPr>
+        <w:pStyle w:val="ListBullet"/>
+        <w:spacing w:before="0" w:after="80" w:line="269" w:lineRule="auto"/>
+      </w:pPr>
+      <w:r>
+        <w:rPr>
+          <w:rFonts w:ascii="Calibri" w:hAnsi="Calibri" w:eastAsia="Microsoft YaHei"/>
+          <w:b w:val="0"/>
+          <w:color w:val="1F2937"/>
+          <w:sz w:val="21"/>
+        </w:rPr>
+        <w:t>支持分享页刷新数据和访问权限控制。</w:t>
+      </w:r>
+    </w:p>
+    <w:p>
+      <w:pPr>
+        <w:pStyle w:val="ListBullet"/>
+        <w:spacing w:before="0" w:after="80" w:line="269" w:lineRule="auto"/>
+      </w:pPr>
+      <w:r>
+        <w:rPr>
+          <w:rFonts w:ascii="Calibri" w:hAnsi="Calibri" w:eastAsia="Microsoft YaHei"/>
+          <w:b w:val="0"/>
+          <w:color w:val="1F2937"/>
+          <w:sz w:val="21"/>
+        </w:rPr>
+        <w:t>支持更多业务模板看板。</w:t>
+      </w:r>
+    </w:p>
+    <w:p>
+      <w:pPr>
+        <w:pStyle w:val="Heading3"/>
+      </w:pPr>
+      <w:r>
+        <w:t>9.4 工程质量</w:t>
+      </w:r>
+    </w:p>
+    <w:p>
+      <w:pPr>
+        <w:pStyle w:val="ListBullet"/>
+        <w:spacing w:before="0" w:after="80" w:line="269" w:lineRule="auto"/>
+      </w:pPr>
+      <w:r>
+        <w:rPr>
+          <w:rFonts w:ascii="Calibri" w:hAnsi="Calibri" w:eastAsia="Microsoft YaHei"/>
+          <w:b w:val="0"/>
+          <w:color w:val="1F2937"/>
+          <w:sz w:val="21"/>
+        </w:rPr>
+        <w:t>继续拆分大型前端页面和全局样式。</w:t>
+      </w:r>
+    </w:p>
+    <w:p>
+      <w:pPr>
+        <w:pStyle w:val="ListBullet"/>
+        <w:spacing w:before="0" w:after="80" w:line="269" w:lineRule="auto"/>
+      </w:pPr>
+      <w:r>
+        <w:rPr>
+          <w:rFonts w:ascii="Calibri" w:hAnsi="Calibri" w:eastAsia="Microsoft YaHei"/>
+          <w:b w:val="0"/>
+          <w:color w:val="1F2937"/>
+          <w:sz w:val="21"/>
+        </w:rPr>
+        <w:t>后端进一步减少宽泛响应类型，统一 API schema。</w:t>
+      </w:r>
+    </w:p>
+    <w:p>
+      <w:pPr>
+        <w:pStyle w:val="ListBullet"/>
+        <w:spacing w:before="0" w:after="80" w:line="269" w:lineRule="auto"/>
+      </w:pPr>
+      <w:r>
+        <w:rPr>
+          <w:rFonts w:ascii="Calibri" w:hAnsi="Calibri" w:eastAsia="Microsoft YaHei"/>
+          <w:b w:val="0"/>
+          <w:color w:val="1F2937"/>
+          <w:sz w:val="21"/>
+        </w:rPr>
+        <w:t>增加端到端测试和浏览器截图回归。</w:t>
+      </w:r>
+    </w:p>
+    <w:p>
+      <w:pPr>
+        <w:pStyle w:val="ListBullet"/>
+        <w:spacing w:before="0" w:after="80" w:line="269" w:lineRule="auto"/>
+      </w:pPr>
+      <w:r>
+        <w:rPr>
+          <w:rFonts w:ascii="Calibri" w:hAnsi="Calibri" w:eastAsia="Microsoft YaHei"/>
+          <w:b w:val="0"/>
+          <w:color w:val="1F2937"/>
+          <w:sz w:val="21"/>
+        </w:rPr>
+        <w:t>增加 CI 流程，自动运行后端测试、前端测试和构建。</w:t>
+      </w:r>
+    </w:p>
+    <w:p>
+      <w:pPr>
+        <w:pStyle w:val="Heading2"/>
+      </w:pPr>
+      <w:r>
+        <w:t>10. 结论</w:t>
+      </w:r>
+    </w:p>
+    <w:p>
+      <w:pPr>
+        <w:spacing w:before="0" w:after="120" w:line="264" w:lineRule="auto"/>
+      </w:pPr>
+      <w:r>
+        <w:rPr>
+          <w:rFonts w:ascii="Calibri" w:hAnsi="Calibri" w:eastAsia="Microsoft YaHei"/>
+          <w:b w:val="0"/>
+          <w:color w:val="1F2937"/>
+          <w:sz w:val="21"/>
+        </w:rPr>
+        <w:t>当前 Demo 已经从早期静态演示升级为具备真实后端编排、DeepSeek Text-to-SQL、知识检索增强、SQL 安全校验、图表分析、仪表盘沉淀和运行配置能力的本地全栈原型。它能够较完整地展示智能问数产品的核心体验，同时保留了工程上的安全边界和可扩展结构。</w:t>
+      </w:r>
+    </w:p>
+    <w:p>
+      <w:pPr>
+        <w:spacing w:before="0" w:after="120" w:line="264" w:lineRule="auto"/>
+      </w:pPr>
+      <w:r>
+        <w:rPr>
+          <w:rFonts w:ascii="Calibri" w:hAnsi="Calibri" w:eastAsia="Microsoft YaHei"/>
+          <w:b w:val="0"/>
+          <w:color w:val="1F2937"/>
+          <w:sz w:val="21"/>
+        </w:rPr>
+        <w:t>后续如果进入真实平台集成阶段，建议以当前 Demo 的接口、测试和交互为参考，逐步替换本地 SQLite、离线规则和演示数据，接入真实数据权限、统一认证、元数据中心和生产级模型服务。</w:t>
       </w:r>
     </w:p>
     <w:sectPr>
+      <w:footerReference w:type="default" r:id="rId9"/>
       <w:pgSz w:w="12240" w:h="15840"/>
-      <w:pgMar w:top="1134" w:right="1247" w:bottom="1134" w:left="1247" w:header="720" w:footer="720" w:gutter="0"/>
+      <w:pgMar w:top="1224" w:right="1296" w:bottom="1224" w:left="1296" w:header="720" w:footer="720" w:gutter="0"/>
       <w:cols w:space="720"/>
       <w:docGrid w:linePitch="360"/>
     </w:sectPr>
   </w:body>
 </w:document>
+</file>
+
+<file path=word/footer1.xml><?xml version="1.0" encoding="utf-8"?>
+<w:ftr xmlns:m="http://schemas.openxmlformats.org/officeDocument/2006/math" xmlns:mc="http://schemas.openxmlformats.org/markup-compatibility/2006" xmlns:mo="http://schemas.microsoft.com/office/mac/office/2008/main" xmlns:mv="urn:schemas-microsoft-com:mac:vml" xmlns:o="urn:schemas-microsoft-com:office:office" xmlns:r="http://schemas.openxmlformats.org/officeDocument/2006/relationships" xmlns:v="urn:schemas-microsoft-com:vml" xmlns:w10="urn:schemas-microsoft-com:office:word" xmlns:w14="http://schemas.microsoft.com/office/word/2010/wordml" xmlns:w="http://schemas.openxmlformats.org/wordprocessingml/2006/main" xmlns:wne="http://schemas.microsoft.com/office/word/2006/wordml" xmlns:wp14="http://schemas.microsoft.com/office/word/2010/wordprocessingDrawing" xmlns:wp="http://schemas.openxmlformats.org/drawingml/2006/wordprocessingDrawing" xmlns:wpc="http://schemas.microsoft.com/office/word/2010/wordprocessingCanvas" xmlns:wpg="http://schemas.microsoft.com/office/word/2010/wordprocessingGroup" xmlns:wpi="http://schemas.microsoft.com/office/word/2010/wordprocessingInk" xmlns:wps="http://schemas.microsoft.com/office/word/2010/wordprocessingShape" mc:Ignorable="w14 wp14">
+  <w:p>
+    <w:pPr>
+      <w:pStyle w:val="Footer"/>
+      <w:jc w:val="center"/>
+    </w:pPr>
+    <w:r>
+      <w:rPr>
+        <w:rFonts w:ascii="Calibri" w:hAnsi="Calibri" w:eastAsia="Microsoft YaHei"/>
+        <w:b w:val="0"/>
+        <w:color w:val="64748B"/>
+        <w:sz w:val="17"/>
+      </w:rPr>
+      <w:t>GeniusQ DaaS Intelligent Query Demo · Implementation Plan</w:t>
+    </w:r>
+  </w:p>
+</w:ftr>
 </file>
 
 <file path=word/numbering.xml><?xml version="1.0" encoding="utf-8"?>
@@ -2073,8 +3627,12 @@
     <w:name w:val="Normal"/>
     <w:qFormat/>
     <w:rsid w:val="00FC693F"/>
+    <w:pPr>
+      <w:spacing w:after="120" w:line="269" w:lineRule="auto"/>
+    </w:pPr>
     <w:rPr>
-      <w:rFonts w:ascii="Microsoft YaHei" w:hAnsi="Microsoft YaHei" w:eastAsia="Microsoft YaHei"/>
+      <w:rFonts w:ascii="Calibri" w:hAnsi="Calibri" w:eastAsia="Microsoft YaHei"/>
+      <w:color w:val="1F2937"/>
       <w:sz w:val="21"/>
     </w:rPr>
   </w:style>
@@ -2133,15 +3691,15 @@
     <w:pPr>
       <w:keepNext/>
       <w:keepLines/>
-      <w:spacing w:before="480" w:after="0"/>
+      <w:spacing w:before="320" w:after="160"/>
       <w:outlineLvl w:val="0"/>
     </w:pPr>
     <w:rPr>
-      <w:rFonts w:asciiTheme="majorHAnsi" w:eastAsiaTheme="majorEastAsia" w:hAnsiTheme="majorHAnsi" w:cstheme="majorBidi"/>
+      <w:rFonts w:asciiTheme="majorHAnsi" w:eastAsiaTheme="majorEastAsia" w:hAnsiTheme="majorHAnsi" w:cstheme="majorBidi" w:ascii="Calibri" w:hAnsi="Calibri" w:eastAsia="Microsoft YaHei"/>
       <w:b/>
       <w:bCs/>
-      <w:color w:val="365F91" w:themeColor="accent1" w:themeShade="BF"/>
-      <w:sz w:val="28"/>
+      <w:color w:val="1F4E79"/>
+      <w:sz w:val="32"/>
       <w:szCs w:val="28"/>
     </w:rPr>
   </w:style>
@@ -2157,14 +3715,14 @@
     <w:pPr>
       <w:keepNext/>
       <w:keepLines/>
-      <w:spacing w:before="200" w:after="0"/>
+      <w:spacing w:before="240" w:after="120"/>
       <w:outlineLvl w:val="1"/>
     </w:pPr>
     <w:rPr>
-      <w:rFonts w:asciiTheme="majorHAnsi" w:eastAsiaTheme="majorEastAsia" w:hAnsiTheme="majorHAnsi" w:cstheme="majorBidi"/>
+      <w:rFonts w:asciiTheme="majorHAnsi" w:eastAsiaTheme="majorEastAsia" w:hAnsiTheme="majorHAnsi" w:cstheme="majorBidi" w:ascii="Calibri" w:hAnsi="Calibri" w:eastAsia="Microsoft YaHei"/>
       <w:b/>
       <w:bCs/>
-      <w:color w:val="4F81BD" w:themeColor="accent1"/>
+      <w:color w:val="2563A6"/>
       <w:sz w:val="26"/>
       <w:szCs w:val="26"/>
     </w:rPr>
@@ -2181,14 +3739,15 @@
     <w:pPr>
       <w:keepNext/>
       <w:keepLines/>
-      <w:spacing w:before="200" w:after="0"/>
+      <w:spacing w:before="160" w:after="80"/>
       <w:outlineLvl w:val="2"/>
     </w:pPr>
     <w:rPr>
-      <w:rFonts w:asciiTheme="majorHAnsi" w:eastAsiaTheme="majorEastAsia" w:hAnsiTheme="majorHAnsi" w:cstheme="majorBidi"/>
+      <w:rFonts w:asciiTheme="majorHAnsi" w:eastAsiaTheme="majorEastAsia" w:hAnsiTheme="majorHAnsi" w:cstheme="majorBidi" w:ascii="Calibri" w:hAnsi="Calibri" w:eastAsia="Microsoft YaHei"/>
       <w:b/>
       <w:bCs/>
-      <w:color w:val="4F81BD" w:themeColor="accent1"/>
+      <w:color w:val="1F4E79"/>
+      <w:sz w:val="23"/>
     </w:rPr>
   </w:style>
   <w:style w:type="paragraph" w:styleId="Heading4">

</xml_diff>